<commit_message>
Eliminate slides and update README
</commit_message>
<xml_diff>
--- a/generated/report.docx
+++ b/generated/report.docx
@@ -2,9 +2,56 @@
 <file path=word/document.xml><?xml version="1.0" encoding="utf-8"?>
 <w:document xmlns:wpc="http://schemas.microsoft.com/office/word/2010/wordprocessingCanvas" xmlns:mo="http://schemas.microsoft.com/office/mac/office/2008/main" xmlns:mc="http://schemas.openxmlformats.org/markup-compatibility/2006" xmlns:mv="urn:schemas-microsoft-com:mac:vml" xmlns:o="urn:schemas-microsoft-com:office:office" xmlns:r="http://schemas.openxmlformats.org/officeDocument/2006/relationships" xmlns:m="http://schemas.openxmlformats.org/officeDocument/2006/math" xmlns:v="urn:schemas-microsoft-com:vml" xmlns:wp14="http://schemas.microsoft.com/office/word/2010/wordprocessingDrawing" xmlns:wp="http://schemas.openxmlformats.org/drawingml/2006/wordprocessingDrawing" xmlns:w10="urn:schemas-microsoft-com:office:word" xmlns:w="http://schemas.openxmlformats.org/wordprocessingml/2006/main" xmlns:w14="http://schemas.microsoft.com/office/word/2010/wordml" xmlns:wpg="http://schemas.microsoft.com/office/word/2010/wordprocessingGroup" xmlns:wpi="http://schemas.microsoft.com/office/word/2010/wordprocessingInk" xmlns:wne="http://schemas.microsoft.com/office/word/2006/wordml" xmlns:wps="http://schemas.microsoft.com/office/word/2010/wordprocessingShape" mc:Ignorable="w14 wp14">
   <w:body>
+    <w:tbl>
+      <w:tblPr>
+        <w:tblW w:type="auto" w:w="0"/>
+        <w:jc w:val="center"/>
+        <w:tblLook w:firstColumn="1" w:firstRow="1" w:lastColumn="0" w:lastRow="0" w:noHBand="0" w:noVBand="1" w:val="04A0"/>
+      </w:tblPr>
+      <w:tblGrid>
+        <w:gridCol w:w="10080"/>
+      </w:tblGrid>
+      <w:tr>
+        <w:trPr>
+          <w:trHeight w:val="160"/>
+        </w:trPr>
+        <w:tc>
+          <w:tcPr>
+            <w:tcW w:type="dxa" w:w="10080"/>
+            <w:shd w:fill="F07D00"/>
+            <w:tcBorders>
+              <w:top w:val="single" w:sz="6" w:space="0" w:color="F07D00"/>
+              <w:left w:val="single" w:sz="6" w:space="0" w:color="F07D00"/>
+              <w:bottom w:val="single" w:sz="6" w:space="0" w:color="F07D00"/>
+              <w:right w:val="single" w:sz="6" w:space="0" w:color="F07D00"/>
+              <w:insideH w:val="single" w:sz="6" w:space="0" w:color="F07D00"/>
+              <w:insideV w:val="single" w:sz="6" w:space="0" w:color="F07D00"/>
+            </w:tcBorders>
+          </w:tcPr>
+          <w:p>
+            <w:r/>
+          </w:p>
+        </w:tc>
+      </w:tr>
+    </w:tbl>
+    <w:p>
+      <w:pPr>
+        <w:jc w:val="center"/>
+      </w:pPr>
+      <w:r>
+        <w:rPr>
+          <w:rFonts w:ascii="Arial" w:hAnsi="Arial"/>
+          <w:b/>
+          <w:color w:val="F07D00"/>
+          <w:sz w:val="20"/>
+        </w:rPr>
+        <w:t>DYNAMIC REGULATORY REPORT GENERATOR</w:t>
+      </w:r>
+    </w:p>
     <w:p>
       <w:pPr>
         <w:pStyle w:val="Title"/>
+        <w:spacing w:before="360" w:after="160"/>
         <w:jc w:val="center"/>
       </w:pPr>
       <w:r>
@@ -13,11 +60,15 @@
     </w:p>
     <w:p>
       <w:pPr>
+        <w:spacing w:after="480"/>
         <w:jc w:val="center"/>
       </w:pPr>
       <w:r>
         <w:rPr>
+          <w:rFonts w:ascii="Arial" w:hAnsi="Arial"/>
           <w:b/>
+          <w:color w:val="1D3A5E"/>
+          <w:sz w:val="24"/>
         </w:rPr>
         <w:t xml:space="preserve">Fictional Crop Science Authority (FCSA)</w:t>
       </w:r>
@@ -26,6 +77,8 @@
       <w:tblPr>
         <w:tblStyle w:val="TableGrid"/>
         <w:tblW w:type="auto" w:w="0"/>
+        <w:jc w:val="center"/>
+        <w:tblLayout w:type="autofit"/>
         <w:tblLook w:firstColumn="1" w:firstRow="1" w:lastColumn="0" w:lastRow="0" w:noHBand="0" w:noVBand="1" w:val="04A0"/>
       </w:tblPr>
       <w:tblGrid>
@@ -35,10 +88,29 @@
       <w:tr>
         <w:tc>
           <w:tcPr>
-            <w:tcW w:type="dxa" w:w="5040"/>
+            <w:tcW w:type="dxa" w:w="2736"/>
+            <w:vAlign w:val="center"/>
+            <w:tcBorders>
+              <w:top w:val="single" w:sz="6" w:space="0" w:color="D9DEE7"/>
+              <w:left w:val="single" w:sz="6" w:space="0" w:color="D9DEE7"/>
+              <w:bottom w:val="single" w:sz="6" w:space="0" w:color="D9DEE7"/>
+              <w:right w:val="single" w:sz="6" w:space="0" w:color="D9DEE7"/>
+              <w:insideH w:val="single" w:sz="6" w:space="0" w:color="D9DEE7"/>
+              <w:insideV w:val="single" w:sz="6" w:space="0" w:color="D9DEE7"/>
+            </w:tcBorders>
+            <w:shd w:fill="FFF2E6"/>
           </w:tcPr>
           <w:p>
+            <w:pPr>
+              <w:spacing w:after="40"/>
+            </w:pPr>
             <w:r>
+              <w:rPr>
+                <w:rFonts w:ascii="Arial" w:hAnsi="Arial"/>
+                <w:b/>
+                <w:color w:val="1D3A5E"/>
+                <w:sz w:val="18"/>
+              </w:rPr>
               <w:t>Report ID</w:t>
             </w:r>
           </w:p>
@@ -46,9 +118,28 @@
         <w:tc>
           <w:tcPr>
             <w:tcW w:type="dxa" w:w="5040"/>
+            <w:vAlign w:val="center"/>
+            <w:tcBorders>
+              <w:top w:val="single" w:sz="6" w:space="0" w:color="D9DEE7"/>
+              <w:left w:val="single" w:sz="6" w:space="0" w:color="D9DEE7"/>
+              <w:bottom w:val="single" w:sz="6" w:space="0" w:color="D9DEE7"/>
+              <w:right w:val="single" w:sz="6" w:space="0" w:color="D9DEE7"/>
+              <w:insideH w:val="single" w:sz="6" w:space="0" w:color="D9DEE7"/>
+              <w:insideV w:val="single" w:sz="6" w:space="0" w:color="D9DEE7"/>
+            </w:tcBorders>
+            <w:shd w:fill="F5F5F5"/>
           </w:tcPr>
           <w:p>
+            <w:pPr>
+              <w:spacing w:after="40"/>
+            </w:pPr>
             <w:r>
+              <w:rPr>
+                <w:rFonts w:ascii="Arial" w:hAnsi="Arial"/>
+                <w:b w:val="0"/>
+                <w:color w:val="1D3A5E"/>
+                <w:sz w:val="18"/>
+              </w:rPr>
               <w:t xml:space="preserve">FCSA-PPR-2026-0042</w:t>
             </w:r>
           </w:p>
@@ -57,10 +148,29 @@
       <w:tr>
         <w:tc>
           <w:tcPr>
-            <w:tcW w:type="dxa" w:w="5040"/>
+            <w:tcW w:type="dxa" w:w="2736"/>
+            <w:vAlign w:val="center"/>
+            <w:tcBorders>
+              <w:top w:val="single" w:sz="6" w:space="0" w:color="D9DEE7"/>
+              <w:left w:val="single" w:sz="6" w:space="0" w:color="D9DEE7"/>
+              <w:bottom w:val="single" w:sz="6" w:space="0" w:color="D9DEE7"/>
+              <w:right w:val="single" w:sz="6" w:space="0" w:color="D9DEE7"/>
+              <w:insideH w:val="single" w:sz="6" w:space="0" w:color="D9DEE7"/>
+              <w:insideV w:val="single" w:sz="6" w:space="0" w:color="D9DEE7"/>
+            </w:tcBorders>
+            <w:shd w:fill="FFF2E6"/>
           </w:tcPr>
           <w:p>
+            <w:pPr>
+              <w:spacing w:after="40"/>
+            </w:pPr>
             <w:r>
+              <w:rPr>
+                <w:rFonts w:ascii="Arial" w:hAnsi="Arial"/>
+                <w:b/>
+                <w:color w:val="1D3A5E"/>
+                <w:sz w:val="18"/>
+              </w:rPr>
               <w:t>Issued on</w:t>
             </w:r>
           </w:p>
@@ -68,9 +178,28 @@
         <w:tc>
           <w:tcPr>
             <w:tcW w:type="dxa" w:w="5040"/>
+            <w:vAlign w:val="center"/>
+            <w:tcBorders>
+              <w:top w:val="single" w:sz="6" w:space="0" w:color="D9DEE7"/>
+              <w:left w:val="single" w:sz="6" w:space="0" w:color="D9DEE7"/>
+              <w:bottom w:val="single" w:sz="6" w:space="0" w:color="D9DEE7"/>
+              <w:right w:val="single" w:sz="6" w:space="0" w:color="D9DEE7"/>
+              <w:insideH w:val="single" w:sz="6" w:space="0" w:color="D9DEE7"/>
+              <w:insideV w:val="single" w:sz="6" w:space="0" w:color="D9DEE7"/>
+            </w:tcBorders>
+            <w:shd w:fill="F5F5F5"/>
           </w:tcPr>
           <w:p>
+            <w:pPr>
+              <w:spacing w:after="40"/>
+            </w:pPr>
             <w:r>
+              <w:rPr>
+                <w:rFonts w:ascii="Arial" w:hAnsi="Arial"/>
+                <w:b w:val="0"/>
+                <w:color w:val="1D3A5E"/>
+                <w:sz w:val="18"/>
+              </w:rPr>
               <w:t xml:space="preserve">2026-04-18</w:t>
             </w:r>
           </w:p>
@@ -79,10 +208,29 @@
       <w:tr>
         <w:tc>
           <w:tcPr>
-            <w:tcW w:type="dxa" w:w="5040"/>
+            <w:tcW w:type="dxa" w:w="2736"/>
+            <w:vAlign w:val="center"/>
+            <w:tcBorders>
+              <w:top w:val="single" w:sz="6" w:space="0" w:color="D9DEE7"/>
+              <w:left w:val="single" w:sz="6" w:space="0" w:color="D9DEE7"/>
+              <w:bottom w:val="single" w:sz="6" w:space="0" w:color="D9DEE7"/>
+              <w:right w:val="single" w:sz="6" w:space="0" w:color="D9DEE7"/>
+              <w:insideH w:val="single" w:sz="6" w:space="0" w:color="D9DEE7"/>
+              <w:insideV w:val="single" w:sz="6" w:space="0" w:color="D9DEE7"/>
+            </w:tcBorders>
+            <w:shd w:fill="FFF2E6"/>
           </w:tcPr>
           <w:p>
+            <w:pPr>
+              <w:spacing w:after="40"/>
+            </w:pPr>
             <w:r>
+              <w:rPr>
+                <w:rFonts w:ascii="Arial" w:hAnsi="Arial"/>
+                <w:b/>
+                <w:color w:val="1D3A5E"/>
+                <w:sz w:val="18"/>
+              </w:rPr>
               <w:t>Version</w:t>
             </w:r>
           </w:p>
@@ -90,9 +238,28 @@
         <w:tc>
           <w:tcPr>
             <w:tcW w:type="dxa" w:w="5040"/>
+            <w:vAlign w:val="center"/>
+            <w:tcBorders>
+              <w:top w:val="single" w:sz="6" w:space="0" w:color="D9DEE7"/>
+              <w:left w:val="single" w:sz="6" w:space="0" w:color="D9DEE7"/>
+              <w:bottom w:val="single" w:sz="6" w:space="0" w:color="D9DEE7"/>
+              <w:right w:val="single" w:sz="6" w:space="0" w:color="D9DEE7"/>
+              <w:insideH w:val="single" w:sz="6" w:space="0" w:color="D9DEE7"/>
+              <w:insideV w:val="single" w:sz="6" w:space="0" w:color="D9DEE7"/>
+            </w:tcBorders>
+            <w:shd w:fill="F5F5F5"/>
           </w:tcPr>
           <w:p>
+            <w:pPr>
+              <w:spacing w:after="40"/>
+            </w:pPr>
             <w:r>
+              <w:rPr>
+                <w:rFonts w:ascii="Arial" w:hAnsi="Arial"/>
+                <w:b w:val="0"/>
+                <w:color w:val="1D3A5E"/>
+                <w:sz w:val="18"/>
+              </w:rPr>
               <w:t xml:space="preserve">1.0</w:t>
             </w:r>
           </w:p>
@@ -101,10 +268,29 @@
       <w:tr>
         <w:tc>
           <w:tcPr>
-            <w:tcW w:type="dxa" w:w="5040"/>
+            <w:tcW w:type="dxa" w:w="2736"/>
+            <w:vAlign w:val="center"/>
+            <w:tcBorders>
+              <w:top w:val="single" w:sz="6" w:space="0" w:color="D9DEE7"/>
+              <w:left w:val="single" w:sz="6" w:space="0" w:color="D9DEE7"/>
+              <w:bottom w:val="single" w:sz="6" w:space="0" w:color="D9DEE7"/>
+              <w:right w:val="single" w:sz="6" w:space="0" w:color="D9DEE7"/>
+              <w:insideH w:val="single" w:sz="6" w:space="0" w:color="D9DEE7"/>
+              <w:insideV w:val="single" w:sz="6" w:space="0" w:color="D9DEE7"/>
+            </w:tcBorders>
+            <w:shd w:fill="FFF2E6"/>
           </w:tcPr>
           <w:p>
+            <w:pPr>
+              <w:spacing w:after="40"/>
+            </w:pPr>
             <w:r>
+              <w:rPr>
+                <w:rFonts w:ascii="Arial" w:hAnsi="Arial"/>
+                <w:b/>
+                <w:color w:val="1D3A5E"/>
+                <w:sz w:val="18"/>
+              </w:rPr>
               <w:t>Locale</w:t>
             </w:r>
           </w:p>
@@ -112,9 +298,28 @@
         <w:tc>
           <w:tcPr>
             <w:tcW w:type="dxa" w:w="5040"/>
+            <w:vAlign w:val="center"/>
+            <w:tcBorders>
+              <w:top w:val="single" w:sz="6" w:space="0" w:color="D9DEE7"/>
+              <w:left w:val="single" w:sz="6" w:space="0" w:color="D9DEE7"/>
+              <w:bottom w:val="single" w:sz="6" w:space="0" w:color="D9DEE7"/>
+              <w:right w:val="single" w:sz="6" w:space="0" w:color="D9DEE7"/>
+              <w:insideH w:val="single" w:sz="6" w:space="0" w:color="D9DEE7"/>
+              <w:insideV w:val="single" w:sz="6" w:space="0" w:color="D9DEE7"/>
+            </w:tcBorders>
+            <w:shd w:fill="F5F5F5"/>
           </w:tcPr>
           <w:p>
+            <w:pPr>
+              <w:spacing w:after="40"/>
+            </w:pPr>
             <w:r>
+              <w:rPr>
+                <w:rFonts w:ascii="Arial" w:hAnsi="Arial"/>
+                <w:b w:val="0"/>
+                <w:color w:val="1D3A5E"/>
+                <w:sz w:val="18"/>
+              </w:rPr>
               <w:t xml:space="preserve">en-EU</w:t>
             </w:r>
           </w:p>
@@ -123,10 +328,29 @@
       <w:tr>
         <w:tc>
           <w:tcPr>
-            <w:tcW w:type="dxa" w:w="5040"/>
+            <w:tcW w:type="dxa" w:w="2736"/>
+            <w:vAlign w:val="center"/>
+            <w:tcBorders>
+              <w:top w:val="single" w:sz="6" w:space="0" w:color="D9DEE7"/>
+              <w:left w:val="single" w:sz="6" w:space="0" w:color="D9DEE7"/>
+              <w:bottom w:val="single" w:sz="6" w:space="0" w:color="D9DEE7"/>
+              <w:right w:val="single" w:sz="6" w:space="0" w:color="D9DEE7"/>
+              <w:insideH w:val="single" w:sz="6" w:space="0" w:color="D9DEE7"/>
+              <w:insideV w:val="single" w:sz="6" w:space="0" w:color="D9DEE7"/>
+            </w:tcBorders>
+            <w:shd w:fill="FFF2E6"/>
           </w:tcPr>
           <w:p>
+            <w:pPr>
+              <w:spacing w:after="40"/>
+            </w:pPr>
             <w:r>
+              <w:rPr>
+                <w:rFonts w:ascii="Arial" w:hAnsi="Arial"/>
+                <w:b/>
+                <w:color w:val="1D3A5E"/>
+                <w:sz w:val="18"/>
+              </w:rPr>
               <w:t>Classification</w:t>
             </w:r>
           </w:p>
@@ -134,9 +358,28 @@
         <w:tc>
           <w:tcPr>
             <w:tcW w:type="dxa" w:w="5040"/>
+            <w:vAlign w:val="center"/>
+            <w:tcBorders>
+              <w:top w:val="single" w:sz="6" w:space="0" w:color="D9DEE7"/>
+              <w:left w:val="single" w:sz="6" w:space="0" w:color="D9DEE7"/>
+              <w:bottom w:val="single" w:sz="6" w:space="0" w:color="D9DEE7"/>
+              <w:right w:val="single" w:sz="6" w:space="0" w:color="D9DEE7"/>
+              <w:insideH w:val="single" w:sz="6" w:space="0" w:color="D9DEE7"/>
+              <w:insideV w:val="single" w:sz="6" w:space="0" w:color="D9DEE7"/>
+            </w:tcBorders>
+            <w:shd w:fill="F5F5F5"/>
           </w:tcPr>
           <w:p>
+            <w:pPr>
+              <w:spacing w:after="40"/>
+            </w:pPr>
             <w:r>
+              <w:rPr>
+                <w:rFonts w:ascii="Arial" w:hAnsi="Arial"/>
+                <w:b w:val="0"/>
+                <w:color w:val="1D3A5E"/>
+                <w:sz w:val="18"/>
+              </w:rPr>
               <w:t xml:space="preserve">INTERNAL</w:t>
             </w:r>
           </w:p>
@@ -160,6 +403,8 @@
       <w:tblPr>
         <w:tblStyle w:val="TableGrid"/>
         <w:tblW w:type="auto" w:w="0"/>
+        <w:jc w:val="center"/>
+        <w:tblLayout w:type="autofit"/>
         <w:tblLook w:firstColumn="1" w:firstRow="1" w:lastColumn="0" w:lastRow="0" w:noHBand="0" w:noVBand="1" w:val="04A0"/>
       </w:tblPr>
       <w:tblGrid>
@@ -169,10 +414,29 @@
       <w:tr>
         <w:tc>
           <w:tcPr>
-            <w:tcW w:type="dxa" w:w="5040"/>
+            <w:tcW w:type="dxa" w:w="2736"/>
+            <w:vAlign w:val="center"/>
+            <w:tcBorders>
+              <w:top w:val="single" w:sz="6" w:space="0" w:color="D9DEE7"/>
+              <w:left w:val="single" w:sz="6" w:space="0" w:color="D9DEE7"/>
+              <w:bottom w:val="single" w:sz="6" w:space="0" w:color="D9DEE7"/>
+              <w:right w:val="single" w:sz="6" w:space="0" w:color="D9DEE7"/>
+              <w:insideH w:val="single" w:sz="6" w:space="0" w:color="D9DEE7"/>
+              <w:insideV w:val="single" w:sz="6" w:space="0" w:color="D9DEE7"/>
+            </w:tcBorders>
+            <w:shd w:fill="FFF2E6"/>
           </w:tcPr>
           <w:p>
+            <w:pPr>
+              <w:spacing w:after="40"/>
+            </w:pPr>
             <w:r>
+              <w:rPr>
+                <w:rFonts w:ascii="Arial" w:hAnsi="Arial"/>
+                <w:b/>
+                <w:color w:val="1D3A5E"/>
+                <w:sz w:val="18"/>
+              </w:rPr>
               <w:t>Products assessed</w:t>
             </w:r>
           </w:p>
@@ -180,9 +444,28 @@
         <w:tc>
           <w:tcPr>
             <w:tcW w:type="dxa" w:w="5040"/>
+            <w:vAlign w:val="center"/>
+            <w:tcBorders>
+              <w:top w:val="single" w:sz="6" w:space="0" w:color="D9DEE7"/>
+              <w:left w:val="single" w:sz="6" w:space="0" w:color="D9DEE7"/>
+              <w:bottom w:val="single" w:sz="6" w:space="0" w:color="D9DEE7"/>
+              <w:right w:val="single" w:sz="6" w:space="0" w:color="D9DEE7"/>
+              <w:insideH w:val="single" w:sz="6" w:space="0" w:color="D9DEE7"/>
+              <w:insideV w:val="single" w:sz="6" w:space="0" w:color="D9DEE7"/>
+            </w:tcBorders>
+            <w:shd w:fill="F5F5F5"/>
           </w:tcPr>
           <w:p>
+            <w:pPr>
+              <w:spacing w:after="40"/>
+            </w:pPr>
             <w:r>
+              <w:rPr>
+                <w:rFonts w:ascii="Arial" w:hAnsi="Arial"/>
+                <w:b w:val="0"/>
+                <w:color w:val="1D3A5E"/>
+                <w:sz w:val="18"/>
+              </w:rPr>
               <w:t xml:space="preserve">2</w:t>
             </w:r>
           </w:p>
@@ -191,10 +474,29 @@
       <w:tr>
         <w:tc>
           <w:tcPr>
-            <w:tcW w:type="dxa" w:w="5040"/>
+            <w:tcW w:type="dxa" w:w="2736"/>
+            <w:vAlign w:val="center"/>
+            <w:tcBorders>
+              <w:top w:val="single" w:sz="6" w:space="0" w:color="D9DEE7"/>
+              <w:left w:val="single" w:sz="6" w:space="0" w:color="D9DEE7"/>
+              <w:bottom w:val="single" w:sz="6" w:space="0" w:color="D9DEE7"/>
+              <w:right w:val="single" w:sz="6" w:space="0" w:color="D9DEE7"/>
+              <w:insideH w:val="single" w:sz="6" w:space="0" w:color="D9DEE7"/>
+              <w:insideV w:val="single" w:sz="6" w:space="0" w:color="D9DEE7"/>
+            </w:tcBorders>
+            <w:shd w:fill="FFF2E6"/>
           </w:tcPr>
           <w:p>
+            <w:pPr>
+              <w:spacing w:after="40"/>
+            </w:pPr>
             <w:r>
+              <w:rPr>
+                <w:rFonts w:ascii="Arial" w:hAnsi="Arial"/>
+                <w:b/>
+                <w:color w:val="1D3A5E"/>
+                <w:sz w:val="18"/>
+              </w:rPr>
               <w:t>Conditional approvals</w:t>
             </w:r>
           </w:p>
@@ -202,9 +504,28 @@
         <w:tc>
           <w:tcPr>
             <w:tcW w:type="dxa" w:w="5040"/>
+            <w:vAlign w:val="center"/>
+            <w:tcBorders>
+              <w:top w:val="single" w:sz="6" w:space="0" w:color="D9DEE7"/>
+              <w:left w:val="single" w:sz="6" w:space="0" w:color="D9DEE7"/>
+              <w:bottom w:val="single" w:sz="6" w:space="0" w:color="D9DEE7"/>
+              <w:right w:val="single" w:sz="6" w:space="0" w:color="D9DEE7"/>
+              <w:insideH w:val="single" w:sz="6" w:space="0" w:color="D9DEE7"/>
+              <w:insideV w:val="single" w:sz="6" w:space="0" w:color="D9DEE7"/>
+            </w:tcBorders>
+            <w:shd w:fill="F5F5F5"/>
           </w:tcPr>
           <w:p>
+            <w:pPr>
+              <w:spacing w:after="40"/>
+            </w:pPr>
             <w:r>
+              <w:rPr>
+                <w:rFonts w:ascii="Arial" w:hAnsi="Arial"/>
+                <w:b w:val="0"/>
+                <w:color w:val="1D3A5E"/>
+                <w:sz w:val="18"/>
+              </w:rPr>
               <w:t xml:space="preserve">1</w:t>
             </w:r>
           </w:p>
@@ -213,10 +534,29 @@
       <w:tr>
         <w:tc>
           <w:tcPr>
-            <w:tcW w:type="dxa" w:w="5040"/>
+            <w:tcW w:type="dxa" w:w="2736"/>
+            <w:vAlign w:val="center"/>
+            <w:tcBorders>
+              <w:top w:val="single" w:sz="6" w:space="0" w:color="D9DEE7"/>
+              <w:left w:val="single" w:sz="6" w:space="0" w:color="D9DEE7"/>
+              <w:bottom w:val="single" w:sz="6" w:space="0" w:color="D9DEE7"/>
+              <w:right w:val="single" w:sz="6" w:space="0" w:color="D9DEE7"/>
+              <w:insideH w:val="single" w:sz="6" w:space="0" w:color="D9DEE7"/>
+              <w:insideV w:val="single" w:sz="6" w:space="0" w:color="D9DEE7"/>
+            </w:tcBorders>
+            <w:shd w:fill="FFF2E6"/>
           </w:tcPr>
           <w:p>
+            <w:pPr>
+              <w:spacing w:after="40"/>
+            </w:pPr>
             <w:r>
+              <w:rPr>
+                <w:rFonts w:ascii="Arial" w:hAnsi="Arial"/>
+                <w:b/>
+                <w:color w:val="1D3A5E"/>
+                <w:sz w:val="18"/>
+              </w:rPr>
               <w:t>High-risk products</w:t>
             </w:r>
           </w:p>
@@ -224,9 +564,28 @@
         <w:tc>
           <w:tcPr>
             <w:tcW w:type="dxa" w:w="5040"/>
+            <w:vAlign w:val="center"/>
+            <w:tcBorders>
+              <w:top w:val="single" w:sz="6" w:space="0" w:color="D9DEE7"/>
+              <w:left w:val="single" w:sz="6" w:space="0" w:color="D9DEE7"/>
+              <w:bottom w:val="single" w:sz="6" w:space="0" w:color="D9DEE7"/>
+              <w:right w:val="single" w:sz="6" w:space="0" w:color="D9DEE7"/>
+              <w:insideH w:val="single" w:sz="6" w:space="0" w:color="D9DEE7"/>
+              <w:insideV w:val="single" w:sz="6" w:space="0" w:color="D9DEE7"/>
+            </w:tcBorders>
+            <w:shd w:fill="F5F5F5"/>
           </w:tcPr>
           <w:p>
+            <w:pPr>
+              <w:spacing w:after="40"/>
+            </w:pPr>
             <w:r>
+              <w:rPr>
+                <w:rFonts w:ascii="Arial" w:hAnsi="Arial"/>
+                <w:b w:val="0"/>
+                <w:color w:val="1D3A5E"/>
+                <w:sz w:val="18"/>
+              </w:rPr>
               <w:t xml:space="preserve">1</w:t>
             </w:r>
           </w:p>
@@ -235,10 +594,29 @@
       <w:tr>
         <w:tc>
           <w:tcPr>
-            <w:tcW w:type="dxa" w:w="5040"/>
+            <w:tcW w:type="dxa" w:w="2736"/>
+            <w:vAlign w:val="center"/>
+            <w:tcBorders>
+              <w:top w:val="single" w:sz="6" w:space="0" w:color="D9DEE7"/>
+              <w:left w:val="single" w:sz="6" w:space="0" w:color="D9DEE7"/>
+              <w:bottom w:val="single" w:sz="6" w:space="0" w:color="D9DEE7"/>
+              <w:right w:val="single" w:sz="6" w:space="0" w:color="D9DEE7"/>
+              <w:insideH w:val="single" w:sz="6" w:space="0" w:color="D9DEE7"/>
+              <w:insideV w:val="single" w:sz="6" w:space="0" w:color="D9DEE7"/>
+            </w:tcBorders>
+            <w:shd w:fill="FFF2E6"/>
           </w:tcPr>
           <w:p>
+            <w:pPr>
+              <w:spacing w:after="40"/>
+            </w:pPr>
             <w:r>
+              <w:rPr>
+                <w:rFonts w:ascii="Arial" w:hAnsi="Arial"/>
+                <w:b/>
+                <w:color w:val="1D3A5E"/>
+                <w:sz w:val="18"/>
+              </w:rPr>
               <w:t>Overall average efficacy</w:t>
             </w:r>
           </w:p>
@@ -246,9 +624,28 @@
         <w:tc>
           <w:tcPr>
             <w:tcW w:type="dxa" w:w="5040"/>
+            <w:vAlign w:val="center"/>
+            <w:tcBorders>
+              <w:top w:val="single" w:sz="6" w:space="0" w:color="D9DEE7"/>
+              <w:left w:val="single" w:sz="6" w:space="0" w:color="D9DEE7"/>
+              <w:bottom w:val="single" w:sz="6" w:space="0" w:color="D9DEE7"/>
+              <w:right w:val="single" w:sz="6" w:space="0" w:color="D9DEE7"/>
+              <w:insideH w:val="single" w:sz="6" w:space="0" w:color="D9DEE7"/>
+              <w:insideV w:val="single" w:sz="6" w:space="0" w:color="D9DEE7"/>
+            </w:tcBorders>
+            <w:shd w:fill="F5F5F5"/>
           </w:tcPr>
           <w:p>
+            <w:pPr>
+              <w:spacing w:after="40"/>
+            </w:pPr>
             <w:r>
+              <w:rPr>
+                <w:rFonts w:ascii="Arial" w:hAnsi="Arial"/>
+                <w:b w:val="0"/>
+                <w:color w:val="1D3A5E"/>
+                <w:sz w:val="18"/>
+              </w:rPr>
               <w:t xml:space="preserve">86.3%</w:t>
             </w:r>
           </w:p>
@@ -256,6 +653,9 @@
       </w:tr>
     </w:tbl>
     <w:p>
+      <w:pPr>
+        <w:spacing w:before="240" w:after="240"/>
+      </w:pPr>
       <w:r>
         <w:t>This report was generated from structured JSON input after schema validation, business-rule mapping, chart generation, and DOCX template rendering.</w:t>
       </w:r>
@@ -277,6 +677,38 @@
         </w:sectPr>
       </w:pPr>
     </w:p>
+    <w:tbl>
+      <w:tblPr>
+        <w:tblW w:type="auto" w:w="0"/>
+        <w:jc w:val="center"/>
+        <w:tblLook w:firstColumn="1" w:firstRow="1" w:lastColumn="0" w:lastRow="0" w:noHBand="0" w:noVBand="1" w:val="04A0"/>
+      </w:tblPr>
+      <w:tblGrid>
+        <w:gridCol w:w="10080"/>
+      </w:tblGrid>
+      <w:tr>
+        <w:trPr>
+          <w:trHeight w:val="160"/>
+        </w:trPr>
+        <w:tc>
+          <w:tcPr>
+            <w:tcW w:type="dxa" w:w="10080"/>
+            <w:shd w:fill="F07D00"/>
+            <w:tcBorders>
+              <w:top w:val="single" w:sz="6" w:space="0" w:color="F07D00"/>
+              <w:left w:val="single" w:sz="6" w:space="0" w:color="F07D00"/>
+              <w:bottom w:val="single" w:sz="6" w:space="0" w:color="F07D00"/>
+              <w:right w:val="single" w:sz="6" w:space="0" w:color="F07D00"/>
+              <w:insideH w:val="single" w:sz="6" w:space="0" w:color="F07D00"/>
+              <w:insideV w:val="single" w:sz="6" w:space="0" w:color="F07D00"/>
+            </w:tcBorders>
+          </w:tcPr>
+          <w:p>
+            <w:r/>
+          </w:p>
+        </w:tc>
+      </w:tr>
+    </w:tbl>
     <w:p>
       <w:pPr>
         <w:pStyle w:val="Heading1"/>
@@ -285,60 +717,544 @@
         <w:t xml:space="preserve">AgriShield 250 EC</w:t>
       </w:r>
     </w:p>
-    <w:p>
-      <w:r>
-        <w:t xml:space="preserve">Product ID: FCSA-PROD-AS250</w:t>
-      </w:r>
-    </w:p>
-    <w:p>
-      <w:r>
-        <w:t xml:space="preserve">Active substance: Fictoxazole (250 g/L)</w:t>
-      </w:r>
-    </w:p>
-    <w:p>
-      <w:r>
-        <w:t xml:space="preserve">Formulation: EC - Emulsifiable concentrate</w:t>
-      </w:r>
-    </w:p>
-    <w:p>
-      <w:r>
-        <w:t xml:space="preserve">Manufacturer: Demo CropChem GmbH</w:t>
-      </w:r>
-    </w:p>
-    <w:p>
-      <w:r>
-        <w:t xml:space="preserve">Germany: Zugelassen gem. PflSchG - Status: conditional. Valid from 2025-01-01 to 2027-12-31.</w:t>
-      </w:r>
-    </w:p>
-    <w:p>
-      <w:r>
-        <w:t xml:space="preserve">Risk score: 78</w:t>
-      </w:r>
-    </w:p>
-    <w:p>
-      <w:r>
-        <w:t xml:space="preserve">Applications assessed: 3</w:t>
-      </w:r>
-    </w:p>
-    <w:p>
-      <w:r>
-        <w:t xml:space="preserve">Average efficacy: 83.7%</w:t>
-      </w:r>
-    </w:p>
+    <w:tbl>
+      <w:tblPr>
+        <w:tblStyle w:val="TableGrid"/>
+        <w:tblW w:type="auto" w:w="0"/>
+        <w:jc w:val="center"/>
+        <w:tblLayout w:type="autofit"/>
+        <w:tblLook w:firstColumn="1" w:firstRow="1" w:lastColumn="0" w:lastRow="0" w:noHBand="0" w:noVBand="1" w:val="04A0"/>
+      </w:tblPr>
+      <w:tblGrid>
+        <w:gridCol w:w="5040"/>
+        <w:gridCol w:w="5040"/>
+      </w:tblGrid>
+      <w:tr>
+        <w:tc>
+          <w:tcPr>
+            <w:tcW w:type="dxa" w:w="2736"/>
+            <w:vAlign w:val="center"/>
+            <w:tcBorders>
+              <w:top w:val="single" w:sz="6" w:space="0" w:color="D9DEE7"/>
+              <w:left w:val="single" w:sz="6" w:space="0" w:color="D9DEE7"/>
+              <w:bottom w:val="single" w:sz="6" w:space="0" w:color="D9DEE7"/>
+              <w:right w:val="single" w:sz="6" w:space="0" w:color="D9DEE7"/>
+              <w:insideH w:val="single" w:sz="6" w:space="0" w:color="D9DEE7"/>
+              <w:insideV w:val="single" w:sz="6" w:space="0" w:color="D9DEE7"/>
+            </w:tcBorders>
+            <w:shd w:fill="FFF2E6"/>
+          </w:tcPr>
+          <w:p>
+            <w:pPr>
+              <w:spacing w:after="40"/>
+            </w:pPr>
+            <w:r>
+              <w:rPr>
+                <w:rFonts w:ascii="Arial" w:hAnsi="Arial"/>
+                <w:b/>
+                <w:color w:val="1D3A5E"/>
+                <w:sz w:val="18"/>
+              </w:rPr>
+              <w:t>Product ID</w:t>
+            </w:r>
+          </w:p>
+        </w:tc>
+        <w:tc>
+          <w:tcPr>
+            <w:tcW w:type="dxa" w:w="5040"/>
+            <w:vAlign w:val="center"/>
+            <w:tcBorders>
+              <w:top w:val="single" w:sz="6" w:space="0" w:color="D9DEE7"/>
+              <w:left w:val="single" w:sz="6" w:space="0" w:color="D9DEE7"/>
+              <w:bottom w:val="single" w:sz="6" w:space="0" w:color="D9DEE7"/>
+              <w:right w:val="single" w:sz="6" w:space="0" w:color="D9DEE7"/>
+              <w:insideH w:val="single" w:sz="6" w:space="0" w:color="D9DEE7"/>
+              <w:insideV w:val="single" w:sz="6" w:space="0" w:color="D9DEE7"/>
+            </w:tcBorders>
+            <w:shd w:fill="F5F5F5"/>
+          </w:tcPr>
+          <w:p>
+            <w:pPr>
+              <w:spacing w:after="40"/>
+            </w:pPr>
+            <w:r>
+              <w:rPr>
+                <w:rFonts w:ascii="Arial" w:hAnsi="Arial"/>
+                <w:b w:val="0"/>
+                <w:color w:val="1D3A5E"/>
+                <w:sz w:val="18"/>
+              </w:rPr>
+              <w:t xml:space="preserve">FCSA-PROD-AS250</w:t>
+            </w:r>
+          </w:p>
+        </w:tc>
+      </w:tr>
+      <w:tr>
+        <w:tc>
+          <w:tcPr>
+            <w:tcW w:type="dxa" w:w="2736"/>
+            <w:vAlign w:val="center"/>
+            <w:tcBorders>
+              <w:top w:val="single" w:sz="6" w:space="0" w:color="D9DEE7"/>
+              <w:left w:val="single" w:sz="6" w:space="0" w:color="D9DEE7"/>
+              <w:bottom w:val="single" w:sz="6" w:space="0" w:color="D9DEE7"/>
+              <w:right w:val="single" w:sz="6" w:space="0" w:color="D9DEE7"/>
+              <w:insideH w:val="single" w:sz="6" w:space="0" w:color="D9DEE7"/>
+              <w:insideV w:val="single" w:sz="6" w:space="0" w:color="D9DEE7"/>
+            </w:tcBorders>
+            <w:shd w:fill="FFF2E6"/>
+          </w:tcPr>
+          <w:p>
+            <w:pPr>
+              <w:spacing w:after="40"/>
+            </w:pPr>
+            <w:r>
+              <w:rPr>
+                <w:rFonts w:ascii="Arial" w:hAnsi="Arial"/>
+                <w:b/>
+                <w:color w:val="1D3A5E"/>
+                <w:sz w:val="18"/>
+              </w:rPr>
+              <w:t>Active substance</w:t>
+            </w:r>
+          </w:p>
+        </w:tc>
+        <w:tc>
+          <w:tcPr>
+            <w:tcW w:type="dxa" w:w="5040"/>
+            <w:vAlign w:val="center"/>
+            <w:tcBorders>
+              <w:top w:val="single" w:sz="6" w:space="0" w:color="D9DEE7"/>
+              <w:left w:val="single" w:sz="6" w:space="0" w:color="D9DEE7"/>
+              <w:bottom w:val="single" w:sz="6" w:space="0" w:color="D9DEE7"/>
+              <w:right w:val="single" w:sz="6" w:space="0" w:color="D9DEE7"/>
+              <w:insideH w:val="single" w:sz="6" w:space="0" w:color="D9DEE7"/>
+              <w:insideV w:val="single" w:sz="6" w:space="0" w:color="D9DEE7"/>
+            </w:tcBorders>
+            <w:shd w:fill="F5F5F5"/>
+          </w:tcPr>
+          <w:p>
+            <w:pPr>
+              <w:spacing w:after="40"/>
+            </w:pPr>
+            <w:r>
+              <w:rPr>
+                <w:rFonts w:ascii="Arial" w:hAnsi="Arial"/>
+                <w:b w:val="0"/>
+                <w:color w:val="1D3A5E"/>
+                <w:sz w:val="18"/>
+              </w:rPr>
+              <w:t xml:space="preserve">Fictoxazole (250 g/L)</w:t>
+            </w:r>
+          </w:p>
+        </w:tc>
+      </w:tr>
+      <w:tr>
+        <w:tc>
+          <w:tcPr>
+            <w:tcW w:type="dxa" w:w="2736"/>
+            <w:vAlign w:val="center"/>
+            <w:tcBorders>
+              <w:top w:val="single" w:sz="6" w:space="0" w:color="D9DEE7"/>
+              <w:left w:val="single" w:sz="6" w:space="0" w:color="D9DEE7"/>
+              <w:bottom w:val="single" w:sz="6" w:space="0" w:color="D9DEE7"/>
+              <w:right w:val="single" w:sz="6" w:space="0" w:color="D9DEE7"/>
+              <w:insideH w:val="single" w:sz="6" w:space="0" w:color="D9DEE7"/>
+              <w:insideV w:val="single" w:sz="6" w:space="0" w:color="D9DEE7"/>
+            </w:tcBorders>
+            <w:shd w:fill="FFF2E6"/>
+          </w:tcPr>
+          <w:p>
+            <w:pPr>
+              <w:spacing w:after="40"/>
+            </w:pPr>
+            <w:r>
+              <w:rPr>
+                <w:rFonts w:ascii="Arial" w:hAnsi="Arial"/>
+                <w:b/>
+                <w:color w:val="1D3A5E"/>
+                <w:sz w:val="18"/>
+              </w:rPr>
+              <w:t>Formulation</w:t>
+            </w:r>
+          </w:p>
+        </w:tc>
+        <w:tc>
+          <w:tcPr>
+            <w:tcW w:type="dxa" w:w="5040"/>
+            <w:vAlign w:val="center"/>
+            <w:tcBorders>
+              <w:top w:val="single" w:sz="6" w:space="0" w:color="D9DEE7"/>
+              <w:left w:val="single" w:sz="6" w:space="0" w:color="D9DEE7"/>
+              <w:bottom w:val="single" w:sz="6" w:space="0" w:color="D9DEE7"/>
+              <w:right w:val="single" w:sz="6" w:space="0" w:color="D9DEE7"/>
+              <w:insideH w:val="single" w:sz="6" w:space="0" w:color="D9DEE7"/>
+              <w:insideV w:val="single" w:sz="6" w:space="0" w:color="D9DEE7"/>
+            </w:tcBorders>
+            <w:shd w:fill="F5F5F5"/>
+          </w:tcPr>
+          <w:p>
+            <w:pPr>
+              <w:spacing w:after="40"/>
+            </w:pPr>
+            <w:r>
+              <w:rPr>
+                <w:rFonts w:ascii="Arial" w:hAnsi="Arial"/>
+                <w:b w:val="0"/>
+                <w:color w:val="1D3A5E"/>
+                <w:sz w:val="18"/>
+              </w:rPr>
+              <w:t xml:space="preserve">EC - Emulsifiable concentrate</w:t>
+            </w:r>
+          </w:p>
+        </w:tc>
+      </w:tr>
+      <w:tr>
+        <w:tc>
+          <w:tcPr>
+            <w:tcW w:type="dxa" w:w="2736"/>
+            <w:vAlign w:val="center"/>
+            <w:tcBorders>
+              <w:top w:val="single" w:sz="6" w:space="0" w:color="D9DEE7"/>
+              <w:left w:val="single" w:sz="6" w:space="0" w:color="D9DEE7"/>
+              <w:bottom w:val="single" w:sz="6" w:space="0" w:color="D9DEE7"/>
+              <w:right w:val="single" w:sz="6" w:space="0" w:color="D9DEE7"/>
+              <w:insideH w:val="single" w:sz="6" w:space="0" w:color="D9DEE7"/>
+              <w:insideV w:val="single" w:sz="6" w:space="0" w:color="D9DEE7"/>
+            </w:tcBorders>
+            <w:shd w:fill="FFF2E6"/>
+          </w:tcPr>
+          <w:p>
+            <w:pPr>
+              <w:spacing w:after="40"/>
+            </w:pPr>
+            <w:r>
+              <w:rPr>
+                <w:rFonts w:ascii="Arial" w:hAnsi="Arial"/>
+                <w:b/>
+                <w:color w:val="1D3A5E"/>
+                <w:sz w:val="18"/>
+              </w:rPr>
+              <w:t>Manufacturer</w:t>
+            </w:r>
+          </w:p>
+        </w:tc>
+        <w:tc>
+          <w:tcPr>
+            <w:tcW w:type="dxa" w:w="5040"/>
+            <w:vAlign w:val="center"/>
+            <w:tcBorders>
+              <w:top w:val="single" w:sz="6" w:space="0" w:color="D9DEE7"/>
+              <w:left w:val="single" w:sz="6" w:space="0" w:color="D9DEE7"/>
+              <w:bottom w:val="single" w:sz="6" w:space="0" w:color="D9DEE7"/>
+              <w:right w:val="single" w:sz="6" w:space="0" w:color="D9DEE7"/>
+              <w:insideH w:val="single" w:sz="6" w:space="0" w:color="D9DEE7"/>
+              <w:insideV w:val="single" w:sz="6" w:space="0" w:color="D9DEE7"/>
+            </w:tcBorders>
+            <w:shd w:fill="F5F5F5"/>
+          </w:tcPr>
+          <w:p>
+            <w:pPr>
+              <w:spacing w:after="40"/>
+            </w:pPr>
+            <w:r>
+              <w:rPr>
+                <w:rFonts w:ascii="Arial" w:hAnsi="Arial"/>
+                <w:b w:val="0"/>
+                <w:color w:val="1D3A5E"/>
+                <w:sz w:val="18"/>
+              </w:rPr>
+              <w:t xml:space="preserve">Demo CropChem GmbH</w:t>
+            </w:r>
+          </w:p>
+        </w:tc>
+      </w:tr>
+      <w:tr>
+        <w:tc>
+          <w:tcPr>
+            <w:tcW w:type="dxa" w:w="2736"/>
+            <w:vAlign w:val="center"/>
+            <w:tcBorders>
+              <w:top w:val="single" w:sz="6" w:space="0" w:color="D9DEE7"/>
+              <w:left w:val="single" w:sz="6" w:space="0" w:color="D9DEE7"/>
+              <w:bottom w:val="single" w:sz="6" w:space="0" w:color="D9DEE7"/>
+              <w:right w:val="single" w:sz="6" w:space="0" w:color="D9DEE7"/>
+              <w:insideH w:val="single" w:sz="6" w:space="0" w:color="D9DEE7"/>
+              <w:insideV w:val="single" w:sz="6" w:space="0" w:color="D9DEE7"/>
+            </w:tcBorders>
+            <w:shd w:fill="FFF2E6"/>
+          </w:tcPr>
+          <w:p>
+            <w:pPr>
+              <w:spacing w:after="40"/>
+            </w:pPr>
+            <w:r>
+              <w:rPr>
+                <w:rFonts w:ascii="Arial" w:hAnsi="Arial"/>
+                <w:b/>
+                <w:color w:val="1D3A5E"/>
+                <w:sz w:val="18"/>
+              </w:rPr>
+              <w:t>Approval</w:t>
+            </w:r>
+          </w:p>
+        </w:tc>
+        <w:tc>
+          <w:tcPr>
+            <w:tcW w:type="dxa" w:w="5040"/>
+            <w:vAlign w:val="center"/>
+            <w:tcBorders>
+              <w:top w:val="single" w:sz="6" w:space="0" w:color="D9DEE7"/>
+              <w:left w:val="single" w:sz="6" w:space="0" w:color="D9DEE7"/>
+              <w:bottom w:val="single" w:sz="6" w:space="0" w:color="D9DEE7"/>
+              <w:right w:val="single" w:sz="6" w:space="0" w:color="D9DEE7"/>
+              <w:insideH w:val="single" w:sz="6" w:space="0" w:color="D9DEE7"/>
+              <w:insideV w:val="single" w:sz="6" w:space="0" w:color="D9DEE7"/>
+            </w:tcBorders>
+            <w:shd w:fill="F5F5F5"/>
+          </w:tcPr>
+          <w:p>
+            <w:pPr>
+              <w:spacing w:after="40"/>
+            </w:pPr>
+            <w:r>
+              <w:rPr>
+                <w:rFonts w:ascii="Arial" w:hAnsi="Arial"/>
+                <w:b w:val="0"/>
+                <w:color w:val="1D3A5E"/>
+                <w:sz w:val="18"/>
+              </w:rPr>
+              <w:t xml:space="preserve">Germany: Zugelassen gem. PflSchG - Status: conditional. Valid from 2025-01-01 to 2027-12-31.</w:t>
+            </w:r>
+          </w:p>
+        </w:tc>
+      </w:tr>
+      <w:tr>
+        <w:tc>
+          <w:tcPr>
+            <w:tcW w:type="dxa" w:w="2736"/>
+            <w:vAlign w:val="center"/>
+            <w:tcBorders>
+              <w:top w:val="single" w:sz="6" w:space="0" w:color="D9DEE7"/>
+              <w:left w:val="single" w:sz="6" w:space="0" w:color="D9DEE7"/>
+              <w:bottom w:val="single" w:sz="6" w:space="0" w:color="D9DEE7"/>
+              <w:right w:val="single" w:sz="6" w:space="0" w:color="D9DEE7"/>
+              <w:insideH w:val="single" w:sz="6" w:space="0" w:color="D9DEE7"/>
+              <w:insideV w:val="single" w:sz="6" w:space="0" w:color="D9DEE7"/>
+            </w:tcBorders>
+            <w:shd w:fill="FFF2E6"/>
+          </w:tcPr>
+          <w:p>
+            <w:pPr>
+              <w:spacing w:after="40"/>
+            </w:pPr>
+            <w:r>
+              <w:rPr>
+                <w:rFonts w:ascii="Arial" w:hAnsi="Arial"/>
+                <w:b/>
+                <w:color w:val="1D3A5E"/>
+                <w:sz w:val="18"/>
+              </w:rPr>
+              <w:t>Risk score</w:t>
+            </w:r>
+          </w:p>
+        </w:tc>
+        <w:tc>
+          <w:tcPr>
+            <w:tcW w:type="dxa" w:w="5040"/>
+            <w:vAlign w:val="center"/>
+            <w:tcBorders>
+              <w:top w:val="single" w:sz="6" w:space="0" w:color="D9DEE7"/>
+              <w:left w:val="single" w:sz="6" w:space="0" w:color="D9DEE7"/>
+              <w:bottom w:val="single" w:sz="6" w:space="0" w:color="D9DEE7"/>
+              <w:right w:val="single" w:sz="6" w:space="0" w:color="D9DEE7"/>
+              <w:insideH w:val="single" w:sz="6" w:space="0" w:color="D9DEE7"/>
+              <w:insideV w:val="single" w:sz="6" w:space="0" w:color="D9DEE7"/>
+            </w:tcBorders>
+            <w:shd w:fill="F5F5F5"/>
+          </w:tcPr>
+          <w:p>
+            <w:pPr>
+              <w:spacing w:after="40"/>
+            </w:pPr>
+            <w:r>
+              <w:rPr>
+                <w:rFonts w:ascii="Arial" w:hAnsi="Arial"/>
+                <w:b w:val="0"/>
+                <w:color w:val="1D3A5E"/>
+                <w:sz w:val="18"/>
+              </w:rPr>
+              <w:t xml:space="preserve">78</w:t>
+            </w:r>
+          </w:p>
+        </w:tc>
+      </w:tr>
+      <w:tr>
+        <w:tc>
+          <w:tcPr>
+            <w:tcW w:type="dxa" w:w="2736"/>
+            <w:vAlign w:val="center"/>
+            <w:tcBorders>
+              <w:top w:val="single" w:sz="6" w:space="0" w:color="D9DEE7"/>
+              <w:left w:val="single" w:sz="6" w:space="0" w:color="D9DEE7"/>
+              <w:bottom w:val="single" w:sz="6" w:space="0" w:color="D9DEE7"/>
+              <w:right w:val="single" w:sz="6" w:space="0" w:color="D9DEE7"/>
+              <w:insideH w:val="single" w:sz="6" w:space="0" w:color="D9DEE7"/>
+              <w:insideV w:val="single" w:sz="6" w:space="0" w:color="D9DEE7"/>
+            </w:tcBorders>
+            <w:shd w:fill="FFF2E6"/>
+          </w:tcPr>
+          <w:p>
+            <w:pPr>
+              <w:spacing w:after="40"/>
+            </w:pPr>
+            <w:r>
+              <w:rPr>
+                <w:rFonts w:ascii="Arial" w:hAnsi="Arial"/>
+                <w:b/>
+                <w:color w:val="1D3A5E"/>
+                <w:sz w:val="18"/>
+              </w:rPr>
+              <w:t>Applications assessed</w:t>
+            </w:r>
+          </w:p>
+        </w:tc>
+        <w:tc>
+          <w:tcPr>
+            <w:tcW w:type="dxa" w:w="5040"/>
+            <w:vAlign w:val="center"/>
+            <w:tcBorders>
+              <w:top w:val="single" w:sz="6" w:space="0" w:color="D9DEE7"/>
+              <w:left w:val="single" w:sz="6" w:space="0" w:color="D9DEE7"/>
+              <w:bottom w:val="single" w:sz="6" w:space="0" w:color="D9DEE7"/>
+              <w:right w:val="single" w:sz="6" w:space="0" w:color="D9DEE7"/>
+              <w:insideH w:val="single" w:sz="6" w:space="0" w:color="D9DEE7"/>
+              <w:insideV w:val="single" w:sz="6" w:space="0" w:color="D9DEE7"/>
+            </w:tcBorders>
+            <w:shd w:fill="F5F5F5"/>
+          </w:tcPr>
+          <w:p>
+            <w:pPr>
+              <w:spacing w:after="40"/>
+            </w:pPr>
+            <w:r>
+              <w:rPr>
+                <w:rFonts w:ascii="Arial" w:hAnsi="Arial"/>
+                <w:b w:val="0"/>
+                <w:color w:val="1D3A5E"/>
+                <w:sz w:val="18"/>
+              </w:rPr>
+              <w:t xml:space="preserve">3</w:t>
+            </w:r>
+          </w:p>
+        </w:tc>
+      </w:tr>
+      <w:tr>
+        <w:tc>
+          <w:tcPr>
+            <w:tcW w:type="dxa" w:w="2736"/>
+            <w:vAlign w:val="center"/>
+            <w:tcBorders>
+              <w:top w:val="single" w:sz="6" w:space="0" w:color="D9DEE7"/>
+              <w:left w:val="single" w:sz="6" w:space="0" w:color="D9DEE7"/>
+              <w:bottom w:val="single" w:sz="6" w:space="0" w:color="D9DEE7"/>
+              <w:right w:val="single" w:sz="6" w:space="0" w:color="D9DEE7"/>
+              <w:insideH w:val="single" w:sz="6" w:space="0" w:color="D9DEE7"/>
+              <w:insideV w:val="single" w:sz="6" w:space="0" w:color="D9DEE7"/>
+            </w:tcBorders>
+            <w:shd w:fill="FFF2E6"/>
+          </w:tcPr>
+          <w:p>
+            <w:pPr>
+              <w:spacing w:after="40"/>
+            </w:pPr>
+            <w:r>
+              <w:rPr>
+                <w:rFonts w:ascii="Arial" w:hAnsi="Arial"/>
+                <w:b/>
+                <w:color w:val="1D3A5E"/>
+                <w:sz w:val="18"/>
+              </w:rPr>
+              <w:t>Average efficacy</w:t>
+            </w:r>
+          </w:p>
+        </w:tc>
+        <w:tc>
+          <w:tcPr>
+            <w:tcW w:type="dxa" w:w="5040"/>
+            <w:vAlign w:val="center"/>
+            <w:tcBorders>
+              <w:top w:val="single" w:sz="6" w:space="0" w:color="D9DEE7"/>
+              <w:left w:val="single" w:sz="6" w:space="0" w:color="D9DEE7"/>
+              <w:bottom w:val="single" w:sz="6" w:space="0" w:color="D9DEE7"/>
+              <w:right w:val="single" w:sz="6" w:space="0" w:color="D9DEE7"/>
+              <w:insideH w:val="single" w:sz="6" w:space="0" w:color="D9DEE7"/>
+              <w:insideV w:val="single" w:sz="6" w:space="0" w:color="D9DEE7"/>
+            </w:tcBorders>
+            <w:shd w:fill="F5F5F5"/>
+          </w:tcPr>
+          <w:p>
+            <w:pPr>
+              <w:spacing w:after="40"/>
+            </w:pPr>
+            <w:r>
+              <w:rPr>
+                <w:rFonts w:ascii="Arial" w:hAnsi="Arial"/>
+                <w:b w:val="0"/>
+                <w:color w:val="1D3A5E"/>
+                <w:sz w:val="18"/>
+              </w:rPr>
+              <w:t xml:space="preserve">83.7%</w:t>
+            </w:r>
+          </w:p>
+        </w:tc>
+      </w:tr>
+    </w:tbl>
     <w:p>
       <w:r>
         <w:t xml:space="preserve"/>
       </w:r>
     </w:p>
-    <w:p>
-      <w:r>
-        <w:rPr>
-          <w:b/>
-          <w:color w:val="9C2B2B"/>
-        </w:rPr>
-        <w:t xml:space="preserve">HIGH RISK NOTICE / HOCHRISIKO-HINWEIS: This product exceeds the high-risk threshold with a risk score of 78. Additional regulatory review is required.</w:t>
-      </w:r>
-    </w:p>
+    <w:tbl>
+      <w:tblPr>
+        <w:tblStyle w:val="TableGrid"/>
+        <w:tblW w:type="auto" w:w="0"/>
+        <w:tblLook w:firstColumn="1" w:firstRow="1" w:lastColumn="0" w:lastRow="0" w:noHBand="0" w:noVBand="1" w:val="04A0"/>
+      </w:tblPr>
+      <w:tblGrid>
+        <w:gridCol w:w="10080"/>
+      </w:tblGrid>
+      <w:tr>
+        <w:tc>
+          <w:tcPr>
+            <w:tcW w:type="dxa" w:w="10080"/>
+            <w:shd w:fill="FCE4E4"/>
+            <w:tcBorders>
+              <w:top w:val="single" w:sz="6" w:space="0" w:color="9C2B2B"/>
+              <w:left w:val="single" w:sz="6" w:space="0" w:color="9C2B2B"/>
+              <w:bottom w:val="single" w:sz="6" w:space="0" w:color="9C2B2B"/>
+              <w:right w:val="single" w:sz="6" w:space="0" w:color="9C2B2B"/>
+              <w:insideH w:val="single" w:sz="6" w:space="0" w:color="9C2B2B"/>
+              <w:insideV w:val="single" w:sz="6" w:space="0" w:color="9C2B2B"/>
+            </w:tcBorders>
+          </w:tcPr>
+          <w:p>
+            <w:pPr>
+              <w:spacing w:after="40"/>
+            </w:pPr>
+            <w:r>
+              <w:rPr>
+                <w:rFonts w:ascii="Arial" w:hAnsi="Arial"/>
+                <w:b/>
+                <w:color w:val="9C2B2B"/>
+                <w:sz w:val="18"/>
+              </w:rPr>
+              <w:t xml:space="preserve">HIGH RISK NOTICE / HOCHRISIKO-HINWEIS: This product exceeds the high-risk threshold with a risk score of 78. Additional regulatory review is required.</w:t>
+            </w:r>
+          </w:p>
+        </w:tc>
+      </w:tr>
+    </w:tbl>
     <w:p>
       <w:r>
         <w:t xml:space="preserve"/>
@@ -371,9 +1287,28 @@
         <w:tc>
           <w:tcPr>
             <w:tcW w:type="dxa" w:w="1440"/>
+            <w:vAlign w:val="center"/>
+            <w:shd w:fill="1D3A5E"/>
+            <w:tcBorders>
+              <w:top w:val="single" w:sz="6" w:space="0" w:color="1D3A5E"/>
+              <w:left w:val="single" w:sz="6" w:space="0" w:color="1D3A5E"/>
+              <w:bottom w:val="single" w:sz="6" w:space="0" w:color="1D3A5E"/>
+              <w:right w:val="single" w:sz="6" w:space="0" w:color="1D3A5E"/>
+              <w:insideH w:val="single" w:sz="6" w:space="0" w:color="1D3A5E"/>
+              <w:insideV w:val="single" w:sz="6" w:space="0" w:color="1D3A5E"/>
+            </w:tcBorders>
           </w:tcPr>
           <w:p>
+            <w:pPr>
+              <w:spacing w:after="40"/>
+            </w:pPr>
             <w:r>
+              <w:rPr>
+                <w:rFonts w:ascii="Arial" w:hAnsi="Arial"/>
+                <w:b/>
+                <w:color w:val="FFFFFF"/>
+                <w:sz w:val="18"/>
+              </w:rPr>
               <w:t>Crop</w:t>
             </w:r>
           </w:p>
@@ -381,9 +1316,28 @@
         <w:tc>
           <w:tcPr>
             <w:tcW w:type="dxa" w:w="1440"/>
+            <w:vAlign w:val="center"/>
+            <w:shd w:fill="1D3A5E"/>
+            <w:tcBorders>
+              <w:top w:val="single" w:sz="6" w:space="0" w:color="1D3A5E"/>
+              <w:left w:val="single" w:sz="6" w:space="0" w:color="1D3A5E"/>
+              <w:bottom w:val="single" w:sz="6" w:space="0" w:color="1D3A5E"/>
+              <w:right w:val="single" w:sz="6" w:space="0" w:color="1D3A5E"/>
+              <w:insideH w:val="single" w:sz="6" w:space="0" w:color="1D3A5E"/>
+              <w:insideV w:val="single" w:sz="6" w:space="0" w:color="1D3A5E"/>
+            </w:tcBorders>
           </w:tcPr>
           <w:p>
+            <w:pPr>
+              <w:spacing w:after="40"/>
+            </w:pPr>
             <w:r>
+              <w:rPr>
+                <w:rFonts w:ascii="Arial" w:hAnsi="Arial"/>
+                <w:b/>
+                <w:color w:val="FFFFFF"/>
+                <w:sz w:val="18"/>
+              </w:rPr>
               <w:t>Target pest</w:t>
             </w:r>
           </w:p>
@@ -391,9 +1345,28 @@
         <w:tc>
           <w:tcPr>
             <w:tcW w:type="dxa" w:w="1440"/>
+            <w:vAlign w:val="center"/>
+            <w:shd w:fill="1D3A5E"/>
+            <w:tcBorders>
+              <w:top w:val="single" w:sz="6" w:space="0" w:color="1D3A5E"/>
+              <w:left w:val="single" w:sz="6" w:space="0" w:color="1D3A5E"/>
+              <w:bottom w:val="single" w:sz="6" w:space="0" w:color="1D3A5E"/>
+              <w:right w:val="single" w:sz="6" w:space="0" w:color="1D3A5E"/>
+              <w:insideH w:val="single" w:sz="6" w:space="0" w:color="1D3A5E"/>
+              <w:insideV w:val="single" w:sz="6" w:space="0" w:color="1D3A5E"/>
+            </w:tcBorders>
           </w:tcPr>
           <w:p>
+            <w:pPr>
+              <w:spacing w:after="40"/>
+            </w:pPr>
             <w:r>
+              <w:rPr>
+                <w:rFonts w:ascii="Arial" w:hAnsi="Arial"/>
+                <w:b/>
+                <w:color w:val="FFFFFF"/>
+                <w:sz w:val="18"/>
+              </w:rPr>
               <w:t>BBCH</w:t>
             </w:r>
           </w:p>
@@ -401,9 +1374,28 @@
         <w:tc>
           <w:tcPr>
             <w:tcW w:type="dxa" w:w="1440"/>
+            <w:vAlign w:val="center"/>
+            <w:shd w:fill="1D3A5E"/>
+            <w:tcBorders>
+              <w:top w:val="single" w:sz="6" w:space="0" w:color="1D3A5E"/>
+              <w:left w:val="single" w:sz="6" w:space="0" w:color="1D3A5E"/>
+              <w:bottom w:val="single" w:sz="6" w:space="0" w:color="1D3A5E"/>
+              <w:right w:val="single" w:sz="6" w:space="0" w:color="1D3A5E"/>
+              <w:insideH w:val="single" w:sz="6" w:space="0" w:color="1D3A5E"/>
+              <w:insideV w:val="single" w:sz="6" w:space="0" w:color="1D3A5E"/>
+            </w:tcBorders>
           </w:tcPr>
           <w:p>
+            <w:pPr>
+              <w:spacing w:after="40"/>
+            </w:pPr>
             <w:r>
+              <w:rPr>
+                <w:rFonts w:ascii="Arial" w:hAnsi="Arial"/>
+                <w:b/>
+                <w:color w:val="FFFFFF"/>
+                <w:sz w:val="18"/>
+              </w:rPr>
               <w:t>Dose</w:t>
             </w:r>
           </w:p>
@@ -411,9 +1403,28 @@
         <w:tc>
           <w:tcPr>
             <w:tcW w:type="dxa" w:w="1440"/>
+            <w:vAlign w:val="center"/>
+            <w:shd w:fill="1D3A5E"/>
+            <w:tcBorders>
+              <w:top w:val="single" w:sz="6" w:space="0" w:color="1D3A5E"/>
+              <w:left w:val="single" w:sz="6" w:space="0" w:color="1D3A5E"/>
+              <w:bottom w:val="single" w:sz="6" w:space="0" w:color="1D3A5E"/>
+              <w:right w:val="single" w:sz="6" w:space="0" w:color="1D3A5E"/>
+              <w:insideH w:val="single" w:sz="6" w:space="0" w:color="1D3A5E"/>
+              <w:insideV w:val="single" w:sz="6" w:space="0" w:color="1D3A5E"/>
+            </w:tcBorders>
           </w:tcPr>
           <w:p>
+            <w:pPr>
+              <w:spacing w:after="40"/>
+            </w:pPr>
             <w:r>
+              <w:rPr>
+                <w:rFonts w:ascii="Arial" w:hAnsi="Arial"/>
+                <w:b/>
+                <w:color w:val="FFFFFF"/>
+                <w:sz w:val="18"/>
+              </w:rPr>
               <w:t>Max apps</w:t>
             </w:r>
           </w:p>
@@ -421,9 +1432,28 @@
         <w:tc>
           <w:tcPr>
             <w:tcW w:type="dxa" w:w="1440"/>
+            <w:vAlign w:val="center"/>
+            <w:shd w:fill="1D3A5E"/>
+            <w:tcBorders>
+              <w:top w:val="single" w:sz="6" w:space="0" w:color="1D3A5E"/>
+              <w:left w:val="single" w:sz="6" w:space="0" w:color="1D3A5E"/>
+              <w:bottom w:val="single" w:sz="6" w:space="0" w:color="1D3A5E"/>
+              <w:right w:val="single" w:sz="6" w:space="0" w:color="1D3A5E"/>
+              <w:insideH w:val="single" w:sz="6" w:space="0" w:color="1D3A5E"/>
+              <w:insideV w:val="single" w:sz="6" w:space="0" w:color="1D3A5E"/>
+            </w:tcBorders>
           </w:tcPr>
           <w:p>
+            <w:pPr>
+              <w:spacing w:after="40"/>
+            </w:pPr>
             <w:r>
+              <w:rPr>
+                <w:rFonts w:ascii="Arial" w:hAnsi="Arial"/>
+                <w:b/>
+                <w:color w:val="FFFFFF"/>
+                <w:sz w:val="18"/>
+              </w:rPr>
               <w:t>Efficacy</w:t>
             </w:r>
           </w:p>
@@ -431,9 +1461,28 @@
         <w:tc>
           <w:tcPr>
             <w:tcW w:type="dxa" w:w="1440"/>
+            <w:vAlign w:val="center"/>
+            <w:shd w:fill="1D3A5E"/>
+            <w:tcBorders>
+              <w:top w:val="single" w:sz="6" w:space="0" w:color="1D3A5E"/>
+              <w:left w:val="single" w:sz="6" w:space="0" w:color="1D3A5E"/>
+              <w:bottom w:val="single" w:sz="6" w:space="0" w:color="1D3A5E"/>
+              <w:right w:val="single" w:sz="6" w:space="0" w:color="1D3A5E"/>
+              <w:insideH w:val="single" w:sz="6" w:space="0" w:color="1D3A5E"/>
+              <w:insideV w:val="single" w:sz="6" w:space="0" w:color="1D3A5E"/>
+            </w:tcBorders>
           </w:tcPr>
           <w:p>
+            <w:pPr>
+              <w:spacing w:after="40"/>
+            </w:pPr>
             <w:r>
+              <w:rPr>
+                <w:rFonts w:ascii="Arial" w:hAnsi="Arial"/>
+                <w:b/>
+                <w:color w:val="FFFFFF"/>
+                <w:sz w:val="18"/>
+              </w:rPr>
               <w:t>PHI days</w:t>
             </w:r>
           </w:p>
@@ -443,9 +1492,27 @@
         <w:tc>
           <w:tcPr>
             <w:tcW w:type="dxa" w:w="1440"/>
+            <w:vAlign w:val="center"/>
+            <w:tcBorders>
+              <w:top w:val="single" w:sz="6" w:space="0" w:color="D9DEE7"/>
+              <w:left w:val="single" w:sz="6" w:space="0" w:color="D9DEE7"/>
+              <w:bottom w:val="single" w:sz="6" w:space="0" w:color="D9DEE7"/>
+              <w:right w:val="single" w:sz="6" w:space="0" w:color="D9DEE7"/>
+              <w:insideH w:val="single" w:sz="6" w:space="0" w:color="D9DEE7"/>
+              <w:insideV w:val="single" w:sz="6" w:space="0" w:color="D9DEE7"/>
+            </w:tcBorders>
           </w:tcPr>
           <w:p>
+            <w:pPr>
+              <w:spacing w:after="40"/>
+            </w:pPr>
             <w:r>
+              <w:rPr>
+                <w:rFonts w:ascii="Arial" w:hAnsi="Arial"/>
+                <w:b w:val="0"/>
+                <w:color w:val="1D3A5E"/>
+                <w:sz w:val="18"/>
+              </w:rPr>
               <w:t xml:space="preserve">Winter wheat</w:t>
             </w:r>
           </w:p>
@@ -453,9 +1520,27 @@
         <w:tc>
           <w:tcPr>
             <w:tcW w:type="dxa" w:w="1440"/>
+            <w:vAlign w:val="center"/>
+            <w:tcBorders>
+              <w:top w:val="single" w:sz="6" w:space="0" w:color="D9DEE7"/>
+              <w:left w:val="single" w:sz="6" w:space="0" w:color="D9DEE7"/>
+              <w:bottom w:val="single" w:sz="6" w:space="0" w:color="D9DEE7"/>
+              <w:right w:val="single" w:sz="6" w:space="0" w:color="D9DEE7"/>
+              <w:insideH w:val="single" w:sz="6" w:space="0" w:color="D9DEE7"/>
+              <w:insideV w:val="single" w:sz="6" w:space="0" w:color="D9DEE7"/>
+            </w:tcBorders>
           </w:tcPr>
           <w:p>
+            <w:pPr>
+              <w:spacing w:after="40"/>
+            </w:pPr>
             <w:r>
+              <w:rPr>
+                <w:rFonts w:ascii="Arial" w:hAnsi="Arial"/>
+                <w:b w:val="0"/>
+                <w:color w:val="1D3A5E"/>
+                <w:sz w:val="18"/>
+              </w:rPr>
               <w:t xml:space="preserve">Septoria tritici</w:t>
             </w:r>
           </w:p>
@@ -463,9 +1548,27 @@
         <w:tc>
           <w:tcPr>
             <w:tcW w:type="dxa" w:w="1440"/>
+            <w:vAlign w:val="center"/>
+            <w:tcBorders>
+              <w:top w:val="single" w:sz="6" w:space="0" w:color="D9DEE7"/>
+              <w:left w:val="single" w:sz="6" w:space="0" w:color="D9DEE7"/>
+              <w:bottom w:val="single" w:sz="6" w:space="0" w:color="D9DEE7"/>
+              <w:right w:val="single" w:sz="6" w:space="0" w:color="D9DEE7"/>
+              <w:insideH w:val="single" w:sz="6" w:space="0" w:color="D9DEE7"/>
+              <w:insideV w:val="single" w:sz="6" w:space="0" w:color="D9DEE7"/>
+            </w:tcBorders>
           </w:tcPr>
           <w:p>
+            <w:pPr>
+              <w:spacing w:after="40"/>
+            </w:pPr>
             <w:r>
+              <w:rPr>
+                <w:rFonts w:ascii="Arial" w:hAnsi="Arial"/>
+                <w:b w:val="0"/>
+                <w:color w:val="1D3A5E"/>
+                <w:sz w:val="18"/>
+              </w:rPr>
               <w:t xml:space="preserve">31-39</w:t>
             </w:r>
           </w:p>
@@ -473,9 +1576,27 @@
         <w:tc>
           <w:tcPr>
             <w:tcW w:type="dxa" w:w="1440"/>
+            <w:vAlign w:val="center"/>
+            <w:tcBorders>
+              <w:top w:val="single" w:sz="6" w:space="0" w:color="D9DEE7"/>
+              <w:left w:val="single" w:sz="6" w:space="0" w:color="D9DEE7"/>
+              <w:bottom w:val="single" w:sz="6" w:space="0" w:color="D9DEE7"/>
+              <w:right w:val="single" w:sz="6" w:space="0" w:color="D9DEE7"/>
+              <w:insideH w:val="single" w:sz="6" w:space="0" w:color="D9DEE7"/>
+              <w:insideV w:val="single" w:sz="6" w:space="0" w:color="D9DEE7"/>
+            </w:tcBorders>
           </w:tcPr>
           <w:p>
+            <w:pPr>
+              <w:spacing w:after="40"/>
+            </w:pPr>
             <w:r>
+              <w:rPr>
+                <w:rFonts w:ascii="Arial" w:hAnsi="Arial"/>
+                <w:b w:val="0"/>
+                <w:color w:val="1D3A5E"/>
+                <w:sz w:val="18"/>
+              </w:rPr>
               <w:t xml:space="preserve">1 L/ha</w:t>
             </w:r>
           </w:p>
@@ -483,9 +1604,27 @@
         <w:tc>
           <w:tcPr>
             <w:tcW w:type="dxa" w:w="1440"/>
+            <w:vAlign w:val="center"/>
+            <w:tcBorders>
+              <w:top w:val="single" w:sz="6" w:space="0" w:color="D9DEE7"/>
+              <w:left w:val="single" w:sz="6" w:space="0" w:color="D9DEE7"/>
+              <w:bottom w:val="single" w:sz="6" w:space="0" w:color="D9DEE7"/>
+              <w:right w:val="single" w:sz="6" w:space="0" w:color="D9DEE7"/>
+              <w:insideH w:val="single" w:sz="6" w:space="0" w:color="D9DEE7"/>
+              <w:insideV w:val="single" w:sz="6" w:space="0" w:color="D9DEE7"/>
+            </w:tcBorders>
           </w:tcPr>
           <w:p>
+            <w:pPr>
+              <w:spacing w:after="40"/>
+            </w:pPr>
             <w:r>
+              <w:rPr>
+                <w:rFonts w:ascii="Arial" w:hAnsi="Arial"/>
+                <w:b w:val="0"/>
+                <w:color w:val="1D3A5E"/>
+                <w:sz w:val="18"/>
+              </w:rPr>
               <w:t xml:space="preserve">2</w:t>
             </w:r>
           </w:p>
@@ -493,9 +1632,27 @@
         <w:tc>
           <w:tcPr>
             <w:tcW w:type="dxa" w:w="1440"/>
+            <w:vAlign w:val="center"/>
+            <w:tcBorders>
+              <w:top w:val="single" w:sz="6" w:space="0" w:color="D9DEE7"/>
+              <w:left w:val="single" w:sz="6" w:space="0" w:color="D9DEE7"/>
+              <w:bottom w:val="single" w:sz="6" w:space="0" w:color="D9DEE7"/>
+              <w:right w:val="single" w:sz="6" w:space="0" w:color="D9DEE7"/>
+              <w:insideH w:val="single" w:sz="6" w:space="0" w:color="D9DEE7"/>
+              <w:insideV w:val="single" w:sz="6" w:space="0" w:color="D9DEE7"/>
+            </w:tcBorders>
           </w:tcPr>
           <w:p>
+            <w:pPr>
+              <w:spacing w:after="40"/>
+            </w:pPr>
             <w:r>
+              <w:rPr>
+                <w:rFonts w:ascii="Arial" w:hAnsi="Arial"/>
+                <w:b w:val="0"/>
+                <w:color w:val="1D3A5E"/>
+                <w:sz w:val="18"/>
+              </w:rPr>
               <w:t xml:space="preserve">88%</w:t>
             </w:r>
           </w:p>
@@ -503,9 +1660,27 @@
         <w:tc>
           <w:tcPr>
             <w:tcW w:type="dxa" w:w="1440"/>
+            <w:vAlign w:val="center"/>
+            <w:tcBorders>
+              <w:top w:val="single" w:sz="6" w:space="0" w:color="D9DEE7"/>
+              <w:left w:val="single" w:sz="6" w:space="0" w:color="D9DEE7"/>
+              <w:bottom w:val="single" w:sz="6" w:space="0" w:color="D9DEE7"/>
+              <w:right w:val="single" w:sz="6" w:space="0" w:color="D9DEE7"/>
+              <w:insideH w:val="single" w:sz="6" w:space="0" w:color="D9DEE7"/>
+              <w:insideV w:val="single" w:sz="6" w:space="0" w:color="D9DEE7"/>
+            </w:tcBorders>
           </w:tcPr>
           <w:p>
+            <w:pPr>
+              <w:spacing w:after="40"/>
+            </w:pPr>
             <w:r>
+              <w:rPr>
+                <w:rFonts w:ascii="Arial" w:hAnsi="Arial"/>
+                <w:b w:val="0"/>
+                <w:color w:val="1D3A5E"/>
+                <w:sz w:val="18"/>
+              </w:rPr>
               <w:t xml:space="preserve">35</w:t>
             </w:r>
           </w:p>
@@ -515,9 +1690,27 @@
         <w:tc>
           <w:tcPr>
             <w:tcW w:type="dxa" w:w="1440"/>
+            <w:vAlign w:val="center"/>
+            <w:tcBorders>
+              <w:top w:val="single" w:sz="6" w:space="0" w:color="D9DEE7"/>
+              <w:left w:val="single" w:sz="6" w:space="0" w:color="D9DEE7"/>
+              <w:bottom w:val="single" w:sz="6" w:space="0" w:color="D9DEE7"/>
+              <w:right w:val="single" w:sz="6" w:space="0" w:color="D9DEE7"/>
+              <w:insideH w:val="single" w:sz="6" w:space="0" w:color="D9DEE7"/>
+              <w:insideV w:val="single" w:sz="6" w:space="0" w:color="D9DEE7"/>
+            </w:tcBorders>
           </w:tcPr>
           <w:p>
+            <w:pPr>
+              <w:spacing w:after="40"/>
+            </w:pPr>
             <w:r>
+              <w:rPr>
+                <w:rFonts w:ascii="Arial" w:hAnsi="Arial"/>
+                <w:b w:val="0"/>
+                <w:color w:val="1D3A5E"/>
+                <w:sz w:val="18"/>
+              </w:rPr>
               <w:t xml:space="preserve">Winter barley</w:t>
             </w:r>
           </w:p>
@@ -525,9 +1718,27 @@
         <w:tc>
           <w:tcPr>
             <w:tcW w:type="dxa" w:w="1440"/>
+            <w:vAlign w:val="center"/>
+            <w:tcBorders>
+              <w:top w:val="single" w:sz="6" w:space="0" w:color="D9DEE7"/>
+              <w:left w:val="single" w:sz="6" w:space="0" w:color="D9DEE7"/>
+              <w:bottom w:val="single" w:sz="6" w:space="0" w:color="D9DEE7"/>
+              <w:right w:val="single" w:sz="6" w:space="0" w:color="D9DEE7"/>
+              <w:insideH w:val="single" w:sz="6" w:space="0" w:color="D9DEE7"/>
+              <w:insideV w:val="single" w:sz="6" w:space="0" w:color="D9DEE7"/>
+            </w:tcBorders>
           </w:tcPr>
           <w:p>
+            <w:pPr>
+              <w:spacing w:after="40"/>
+            </w:pPr>
             <w:r>
+              <w:rPr>
+                <w:rFonts w:ascii="Arial" w:hAnsi="Arial"/>
+                <w:b w:val="0"/>
+                <w:color w:val="1D3A5E"/>
+                <w:sz w:val="18"/>
+              </w:rPr>
               <w:t xml:space="preserve">Ramularia collo-cygni</w:t>
             </w:r>
           </w:p>
@@ -535,9 +1746,27 @@
         <w:tc>
           <w:tcPr>
             <w:tcW w:type="dxa" w:w="1440"/>
+            <w:vAlign w:val="center"/>
+            <w:tcBorders>
+              <w:top w:val="single" w:sz="6" w:space="0" w:color="D9DEE7"/>
+              <w:left w:val="single" w:sz="6" w:space="0" w:color="D9DEE7"/>
+              <w:bottom w:val="single" w:sz="6" w:space="0" w:color="D9DEE7"/>
+              <w:right w:val="single" w:sz="6" w:space="0" w:color="D9DEE7"/>
+              <w:insideH w:val="single" w:sz="6" w:space="0" w:color="D9DEE7"/>
+              <w:insideV w:val="single" w:sz="6" w:space="0" w:color="D9DEE7"/>
+            </w:tcBorders>
           </w:tcPr>
           <w:p>
+            <w:pPr>
+              <w:spacing w:after="40"/>
+            </w:pPr>
             <w:r>
+              <w:rPr>
+                <w:rFonts w:ascii="Arial" w:hAnsi="Arial"/>
+                <w:b w:val="0"/>
+                <w:color w:val="1D3A5E"/>
+                <w:sz w:val="18"/>
+              </w:rPr>
               <w:t xml:space="preserve">37-49</w:t>
             </w:r>
           </w:p>
@@ -545,9 +1774,27 @@
         <w:tc>
           <w:tcPr>
             <w:tcW w:type="dxa" w:w="1440"/>
+            <w:vAlign w:val="center"/>
+            <w:tcBorders>
+              <w:top w:val="single" w:sz="6" w:space="0" w:color="D9DEE7"/>
+              <w:left w:val="single" w:sz="6" w:space="0" w:color="D9DEE7"/>
+              <w:bottom w:val="single" w:sz="6" w:space="0" w:color="D9DEE7"/>
+              <w:right w:val="single" w:sz="6" w:space="0" w:color="D9DEE7"/>
+              <w:insideH w:val="single" w:sz="6" w:space="0" w:color="D9DEE7"/>
+              <w:insideV w:val="single" w:sz="6" w:space="0" w:color="D9DEE7"/>
+            </w:tcBorders>
           </w:tcPr>
           <w:p>
+            <w:pPr>
+              <w:spacing w:after="40"/>
+            </w:pPr>
             <w:r>
+              <w:rPr>
+                <w:rFonts w:ascii="Arial" w:hAnsi="Arial"/>
+                <w:b w:val="0"/>
+                <w:color w:val="1D3A5E"/>
+                <w:sz w:val="18"/>
+              </w:rPr>
               <w:t xml:space="preserve">1.25 L/ha</w:t>
             </w:r>
           </w:p>
@@ -555,9 +1802,27 @@
         <w:tc>
           <w:tcPr>
             <w:tcW w:type="dxa" w:w="1440"/>
+            <w:vAlign w:val="center"/>
+            <w:tcBorders>
+              <w:top w:val="single" w:sz="6" w:space="0" w:color="D9DEE7"/>
+              <w:left w:val="single" w:sz="6" w:space="0" w:color="D9DEE7"/>
+              <w:bottom w:val="single" w:sz="6" w:space="0" w:color="D9DEE7"/>
+              <w:right w:val="single" w:sz="6" w:space="0" w:color="D9DEE7"/>
+              <w:insideH w:val="single" w:sz="6" w:space="0" w:color="D9DEE7"/>
+              <w:insideV w:val="single" w:sz="6" w:space="0" w:color="D9DEE7"/>
+            </w:tcBorders>
           </w:tcPr>
           <w:p>
+            <w:pPr>
+              <w:spacing w:after="40"/>
+            </w:pPr>
             <w:r>
+              <w:rPr>
+                <w:rFonts w:ascii="Arial" w:hAnsi="Arial"/>
+                <w:b w:val="0"/>
+                <w:color w:val="1D3A5E"/>
+                <w:sz w:val="18"/>
+              </w:rPr>
               <w:t xml:space="preserve">2</w:t>
             </w:r>
           </w:p>
@@ -565,9 +1830,27 @@
         <w:tc>
           <w:tcPr>
             <w:tcW w:type="dxa" w:w="1440"/>
+            <w:vAlign w:val="center"/>
+            <w:tcBorders>
+              <w:top w:val="single" w:sz="6" w:space="0" w:color="D9DEE7"/>
+              <w:left w:val="single" w:sz="6" w:space="0" w:color="D9DEE7"/>
+              <w:bottom w:val="single" w:sz="6" w:space="0" w:color="D9DEE7"/>
+              <w:right w:val="single" w:sz="6" w:space="0" w:color="D9DEE7"/>
+              <w:insideH w:val="single" w:sz="6" w:space="0" w:color="D9DEE7"/>
+              <w:insideV w:val="single" w:sz="6" w:space="0" w:color="D9DEE7"/>
+            </w:tcBorders>
           </w:tcPr>
           <w:p>
+            <w:pPr>
+              <w:spacing w:after="40"/>
+            </w:pPr>
             <w:r>
+              <w:rPr>
+                <w:rFonts w:ascii="Arial" w:hAnsi="Arial"/>
+                <w:b w:val="0"/>
+                <w:color w:val="1D3A5E"/>
+                <w:sz w:val="18"/>
+              </w:rPr>
               <w:t xml:space="preserve">84%</w:t>
             </w:r>
           </w:p>
@@ -575,9 +1858,27 @@
         <w:tc>
           <w:tcPr>
             <w:tcW w:type="dxa" w:w="1440"/>
+            <w:vAlign w:val="center"/>
+            <w:tcBorders>
+              <w:top w:val="single" w:sz="6" w:space="0" w:color="D9DEE7"/>
+              <w:left w:val="single" w:sz="6" w:space="0" w:color="D9DEE7"/>
+              <w:bottom w:val="single" w:sz="6" w:space="0" w:color="D9DEE7"/>
+              <w:right w:val="single" w:sz="6" w:space="0" w:color="D9DEE7"/>
+              <w:insideH w:val="single" w:sz="6" w:space="0" w:color="D9DEE7"/>
+              <w:insideV w:val="single" w:sz="6" w:space="0" w:color="D9DEE7"/>
+            </w:tcBorders>
           </w:tcPr>
           <w:p>
+            <w:pPr>
+              <w:spacing w:after="40"/>
+            </w:pPr>
             <w:r>
+              <w:rPr>
+                <w:rFonts w:ascii="Arial" w:hAnsi="Arial"/>
+                <w:b w:val="0"/>
+                <w:color w:val="1D3A5E"/>
+                <w:sz w:val="18"/>
+              </w:rPr>
               <w:t xml:space="preserve">35</w:t>
             </w:r>
           </w:p>
@@ -587,9 +1888,27 @@
         <w:tc>
           <w:tcPr>
             <w:tcW w:type="dxa" w:w="1440"/>
+            <w:vAlign w:val="center"/>
+            <w:tcBorders>
+              <w:top w:val="single" w:sz="6" w:space="0" w:color="D9DEE7"/>
+              <w:left w:val="single" w:sz="6" w:space="0" w:color="D9DEE7"/>
+              <w:bottom w:val="single" w:sz="6" w:space="0" w:color="D9DEE7"/>
+              <w:right w:val="single" w:sz="6" w:space="0" w:color="D9DEE7"/>
+              <w:insideH w:val="single" w:sz="6" w:space="0" w:color="D9DEE7"/>
+              <w:insideV w:val="single" w:sz="6" w:space="0" w:color="D9DEE7"/>
+            </w:tcBorders>
           </w:tcPr>
           <w:p>
+            <w:pPr>
+              <w:spacing w:after="40"/>
+            </w:pPr>
             <w:r>
+              <w:rPr>
+                <w:rFonts w:ascii="Arial" w:hAnsi="Arial"/>
+                <w:b w:val="0"/>
+                <w:color w:val="1D3A5E"/>
+                <w:sz w:val="18"/>
+              </w:rPr>
               <w:t xml:space="preserve">Winter oilseed rape</w:t>
             </w:r>
           </w:p>
@@ -597,9 +1916,27 @@
         <w:tc>
           <w:tcPr>
             <w:tcW w:type="dxa" w:w="1440"/>
+            <w:vAlign w:val="center"/>
+            <w:tcBorders>
+              <w:top w:val="single" w:sz="6" w:space="0" w:color="D9DEE7"/>
+              <w:left w:val="single" w:sz="6" w:space="0" w:color="D9DEE7"/>
+              <w:bottom w:val="single" w:sz="6" w:space="0" w:color="D9DEE7"/>
+              <w:right w:val="single" w:sz="6" w:space="0" w:color="D9DEE7"/>
+              <w:insideH w:val="single" w:sz="6" w:space="0" w:color="D9DEE7"/>
+              <w:insideV w:val="single" w:sz="6" w:space="0" w:color="D9DEE7"/>
+            </w:tcBorders>
           </w:tcPr>
           <w:p>
+            <w:pPr>
+              <w:spacing w:after="40"/>
+            </w:pPr>
             <w:r>
+              <w:rPr>
+                <w:rFonts w:ascii="Arial" w:hAnsi="Arial"/>
+                <w:b w:val="0"/>
+                <w:color w:val="1D3A5E"/>
+                <w:sz w:val="18"/>
+              </w:rPr>
               <w:t xml:space="preserve">Phoma lingam</w:t>
             </w:r>
           </w:p>
@@ -607,9 +1944,27 @@
         <w:tc>
           <w:tcPr>
             <w:tcW w:type="dxa" w:w="1440"/>
+            <w:vAlign w:val="center"/>
+            <w:tcBorders>
+              <w:top w:val="single" w:sz="6" w:space="0" w:color="D9DEE7"/>
+              <w:left w:val="single" w:sz="6" w:space="0" w:color="D9DEE7"/>
+              <w:bottom w:val="single" w:sz="6" w:space="0" w:color="D9DEE7"/>
+              <w:right w:val="single" w:sz="6" w:space="0" w:color="D9DEE7"/>
+              <w:insideH w:val="single" w:sz="6" w:space="0" w:color="D9DEE7"/>
+              <w:insideV w:val="single" w:sz="6" w:space="0" w:color="D9DEE7"/>
+            </w:tcBorders>
           </w:tcPr>
           <w:p>
+            <w:pPr>
+              <w:spacing w:after="40"/>
+            </w:pPr>
             <w:r>
+              <w:rPr>
+                <w:rFonts w:ascii="Arial" w:hAnsi="Arial"/>
+                <w:b w:val="0"/>
+                <w:color w:val="1D3A5E"/>
+                <w:sz w:val="18"/>
+              </w:rPr>
               <w:t xml:space="preserve">14-20</w:t>
             </w:r>
           </w:p>
@@ -617,9 +1972,27 @@
         <w:tc>
           <w:tcPr>
             <w:tcW w:type="dxa" w:w="1440"/>
+            <w:vAlign w:val="center"/>
+            <w:tcBorders>
+              <w:top w:val="single" w:sz="6" w:space="0" w:color="D9DEE7"/>
+              <w:left w:val="single" w:sz="6" w:space="0" w:color="D9DEE7"/>
+              <w:bottom w:val="single" w:sz="6" w:space="0" w:color="D9DEE7"/>
+              <w:right w:val="single" w:sz="6" w:space="0" w:color="D9DEE7"/>
+              <w:insideH w:val="single" w:sz="6" w:space="0" w:color="D9DEE7"/>
+              <w:insideV w:val="single" w:sz="6" w:space="0" w:color="D9DEE7"/>
+            </w:tcBorders>
           </w:tcPr>
           <w:p>
+            <w:pPr>
+              <w:spacing w:after="40"/>
+            </w:pPr>
             <w:r>
+              <w:rPr>
+                <w:rFonts w:ascii="Arial" w:hAnsi="Arial"/>
+                <w:b w:val="0"/>
+                <w:color w:val="1D3A5E"/>
+                <w:sz w:val="18"/>
+              </w:rPr>
               <w:t xml:space="preserve">0.8 L/ha</w:t>
             </w:r>
           </w:p>
@@ -627,9 +2000,27 @@
         <w:tc>
           <w:tcPr>
             <w:tcW w:type="dxa" w:w="1440"/>
+            <w:vAlign w:val="center"/>
+            <w:tcBorders>
+              <w:top w:val="single" w:sz="6" w:space="0" w:color="D9DEE7"/>
+              <w:left w:val="single" w:sz="6" w:space="0" w:color="D9DEE7"/>
+              <w:bottom w:val="single" w:sz="6" w:space="0" w:color="D9DEE7"/>
+              <w:right w:val="single" w:sz="6" w:space="0" w:color="D9DEE7"/>
+              <w:insideH w:val="single" w:sz="6" w:space="0" w:color="D9DEE7"/>
+              <w:insideV w:val="single" w:sz="6" w:space="0" w:color="D9DEE7"/>
+            </w:tcBorders>
           </w:tcPr>
           <w:p>
+            <w:pPr>
+              <w:spacing w:after="40"/>
+            </w:pPr>
             <w:r>
+              <w:rPr>
+                <w:rFonts w:ascii="Arial" w:hAnsi="Arial"/>
+                <w:b w:val="0"/>
+                <w:color w:val="1D3A5E"/>
+                <w:sz w:val="18"/>
+              </w:rPr>
               <w:t xml:space="preserve">1</w:t>
             </w:r>
           </w:p>
@@ -637,9 +2028,27 @@
         <w:tc>
           <w:tcPr>
             <w:tcW w:type="dxa" w:w="1440"/>
+            <w:vAlign w:val="center"/>
+            <w:tcBorders>
+              <w:top w:val="single" w:sz="6" w:space="0" w:color="D9DEE7"/>
+              <w:left w:val="single" w:sz="6" w:space="0" w:color="D9DEE7"/>
+              <w:bottom w:val="single" w:sz="6" w:space="0" w:color="D9DEE7"/>
+              <w:right w:val="single" w:sz="6" w:space="0" w:color="D9DEE7"/>
+              <w:insideH w:val="single" w:sz="6" w:space="0" w:color="D9DEE7"/>
+              <w:insideV w:val="single" w:sz="6" w:space="0" w:color="D9DEE7"/>
+            </w:tcBorders>
           </w:tcPr>
           <w:p>
+            <w:pPr>
+              <w:spacing w:after="40"/>
+            </w:pPr>
             <w:r>
+              <w:rPr>
+                <w:rFonts w:ascii="Arial" w:hAnsi="Arial"/>
+                <w:b w:val="0"/>
+                <w:color w:val="1D3A5E"/>
+                <w:sz w:val="18"/>
+              </w:rPr>
               <w:t xml:space="preserve">79%</w:t>
             </w:r>
           </w:p>
@@ -647,9 +2056,27 @@
         <w:tc>
           <w:tcPr>
             <w:tcW w:type="dxa" w:w="1440"/>
+            <w:vAlign w:val="center"/>
+            <w:tcBorders>
+              <w:top w:val="single" w:sz="6" w:space="0" w:color="D9DEE7"/>
+              <w:left w:val="single" w:sz="6" w:space="0" w:color="D9DEE7"/>
+              <w:bottom w:val="single" w:sz="6" w:space="0" w:color="D9DEE7"/>
+              <w:right w:val="single" w:sz="6" w:space="0" w:color="D9DEE7"/>
+              <w:insideH w:val="single" w:sz="6" w:space="0" w:color="D9DEE7"/>
+              <w:insideV w:val="single" w:sz="6" w:space="0" w:color="D9DEE7"/>
+            </w:tcBorders>
           </w:tcPr>
           <w:p>
+            <w:pPr>
+              <w:spacing w:after="40"/>
+            </w:pPr>
             <w:r>
+              <w:rPr>
+                <w:rFonts w:ascii="Arial" w:hAnsi="Arial"/>
+                <w:b w:val="0"/>
+                <w:color w:val="1D3A5E"/>
+                <w:sz w:val="18"/>
+              </w:rPr>
               <w:t xml:space="preserve">56</w:t>
             </w:r>
           </w:p>
@@ -678,9 +2105,28 @@
         <w:tc>
           <w:tcPr>
             <w:tcW w:type="dxa" w:w="5040"/>
+            <w:vAlign w:val="center"/>
+            <w:shd w:fill="F07D00"/>
+            <w:tcBorders>
+              <w:top w:val="single" w:sz="6" w:space="0" w:color="F07D00"/>
+              <w:left w:val="single" w:sz="6" w:space="0" w:color="F07D00"/>
+              <w:bottom w:val="single" w:sz="6" w:space="0" w:color="F07D00"/>
+              <w:right w:val="single" w:sz="6" w:space="0" w:color="F07D00"/>
+              <w:insideH w:val="single" w:sz="6" w:space="0" w:color="F07D00"/>
+              <w:insideV w:val="single" w:sz="6" w:space="0" w:color="F07D00"/>
+            </w:tcBorders>
           </w:tcPr>
           <w:p>
+            <w:pPr>
+              <w:spacing w:after="40"/>
+            </w:pPr>
             <w:r>
+              <w:rPr>
+                <w:rFonts w:ascii="Arial" w:hAnsi="Arial"/>
+                <w:b/>
+                <w:color w:val="FFFFFF"/>
+                <w:sz w:val="18"/>
+              </w:rPr>
               <w:t>Component</w:t>
             </w:r>
           </w:p>
@@ -688,9 +2134,28 @@
         <w:tc>
           <w:tcPr>
             <w:tcW w:type="dxa" w:w="5040"/>
+            <w:vAlign w:val="center"/>
+            <w:shd w:fill="F07D00"/>
+            <w:tcBorders>
+              <w:top w:val="single" w:sz="6" w:space="0" w:color="F07D00"/>
+              <w:left w:val="single" w:sz="6" w:space="0" w:color="F07D00"/>
+              <w:bottom w:val="single" w:sz="6" w:space="0" w:color="F07D00"/>
+              <w:right w:val="single" w:sz="6" w:space="0" w:color="F07D00"/>
+              <w:insideH w:val="single" w:sz="6" w:space="0" w:color="F07D00"/>
+              <w:insideV w:val="single" w:sz="6" w:space="0" w:color="F07D00"/>
+            </w:tcBorders>
           </w:tcPr>
           <w:p>
+            <w:pPr>
+              <w:spacing w:after="40"/>
+            </w:pPr>
             <w:r>
+              <w:rPr>
+                <w:rFonts w:ascii="Arial" w:hAnsi="Arial"/>
+                <w:b/>
+                <w:color w:val="FFFFFF"/>
+                <w:sz w:val="18"/>
+              </w:rPr>
               <w:t>Score</w:t>
             </w:r>
           </w:p>
@@ -700,9 +2165,27 @@
         <w:tc>
           <w:tcPr>
             <w:tcW w:type="dxa" w:w="5040"/>
+            <w:vAlign w:val="center"/>
+            <w:tcBorders>
+              <w:top w:val="single" w:sz="6" w:space="0" w:color="D9DEE7"/>
+              <w:left w:val="single" w:sz="6" w:space="0" w:color="D9DEE7"/>
+              <w:bottom w:val="single" w:sz="6" w:space="0" w:color="D9DEE7"/>
+              <w:right w:val="single" w:sz="6" w:space="0" w:color="D9DEE7"/>
+              <w:insideH w:val="single" w:sz="6" w:space="0" w:color="D9DEE7"/>
+              <w:insideV w:val="single" w:sz="6" w:space="0" w:color="D9DEE7"/>
+            </w:tcBorders>
           </w:tcPr>
           <w:p>
+            <w:pPr>
+              <w:spacing w:after="40"/>
+            </w:pPr>
             <w:r>
+              <w:rPr>
+                <w:rFonts w:ascii="Arial" w:hAnsi="Arial"/>
+                <w:b w:val="0"/>
+                <w:color w:val="1D3A5E"/>
+                <w:sz w:val="18"/>
+              </w:rPr>
               <w:t xml:space="preserve">Human Health</w:t>
             </w:r>
           </w:p>
@@ -710,9 +2193,27 @@
         <w:tc>
           <w:tcPr>
             <w:tcW w:type="dxa" w:w="5040"/>
+            <w:vAlign w:val="center"/>
+            <w:tcBorders>
+              <w:top w:val="single" w:sz="6" w:space="0" w:color="D9DEE7"/>
+              <w:left w:val="single" w:sz="6" w:space="0" w:color="D9DEE7"/>
+              <w:bottom w:val="single" w:sz="6" w:space="0" w:color="D9DEE7"/>
+              <w:right w:val="single" w:sz="6" w:space="0" w:color="D9DEE7"/>
+              <w:insideH w:val="single" w:sz="6" w:space="0" w:color="D9DEE7"/>
+              <w:insideV w:val="single" w:sz="6" w:space="0" w:color="D9DEE7"/>
+            </w:tcBorders>
           </w:tcPr>
           <w:p>
+            <w:pPr>
+              <w:spacing w:after="40"/>
+            </w:pPr>
             <w:r>
+              <w:rPr>
+                <w:rFonts w:ascii="Arial" w:hAnsi="Arial"/>
+                <w:b w:val="0"/>
+                <w:color w:val="1D3A5E"/>
+                <w:sz w:val="18"/>
+              </w:rPr>
               <w:t xml:space="preserve">45</w:t>
             </w:r>
           </w:p>
@@ -722,9 +2223,27 @@
         <w:tc>
           <w:tcPr>
             <w:tcW w:type="dxa" w:w="5040"/>
+            <w:vAlign w:val="center"/>
+            <w:tcBorders>
+              <w:top w:val="single" w:sz="6" w:space="0" w:color="D9DEE7"/>
+              <w:left w:val="single" w:sz="6" w:space="0" w:color="D9DEE7"/>
+              <w:bottom w:val="single" w:sz="6" w:space="0" w:color="D9DEE7"/>
+              <w:right w:val="single" w:sz="6" w:space="0" w:color="D9DEE7"/>
+              <w:insideH w:val="single" w:sz="6" w:space="0" w:color="D9DEE7"/>
+              <w:insideV w:val="single" w:sz="6" w:space="0" w:color="D9DEE7"/>
+            </w:tcBorders>
           </w:tcPr>
           <w:p>
+            <w:pPr>
+              <w:spacing w:after="40"/>
+            </w:pPr>
             <w:r>
+              <w:rPr>
+                <w:rFonts w:ascii="Arial" w:hAnsi="Arial"/>
+                <w:b w:val="0"/>
+                <w:color w:val="1D3A5E"/>
+                <w:sz w:val="18"/>
+              </w:rPr>
               <w:t xml:space="preserve">Ecotoxicology</w:t>
             </w:r>
           </w:p>
@@ -732,9 +2251,27 @@
         <w:tc>
           <w:tcPr>
             <w:tcW w:type="dxa" w:w="5040"/>
+            <w:vAlign w:val="center"/>
+            <w:tcBorders>
+              <w:top w:val="single" w:sz="6" w:space="0" w:color="D9DEE7"/>
+              <w:left w:val="single" w:sz="6" w:space="0" w:color="D9DEE7"/>
+              <w:bottom w:val="single" w:sz="6" w:space="0" w:color="D9DEE7"/>
+              <w:right w:val="single" w:sz="6" w:space="0" w:color="D9DEE7"/>
+              <w:insideH w:val="single" w:sz="6" w:space="0" w:color="D9DEE7"/>
+              <w:insideV w:val="single" w:sz="6" w:space="0" w:color="D9DEE7"/>
+            </w:tcBorders>
           </w:tcPr>
           <w:p>
+            <w:pPr>
+              <w:spacing w:after="40"/>
+            </w:pPr>
             <w:r>
+              <w:rPr>
+                <w:rFonts w:ascii="Arial" w:hAnsi="Arial"/>
+                <w:b w:val="0"/>
+                <w:color w:val="1D3A5E"/>
+                <w:sz w:val="18"/>
+              </w:rPr>
               <w:t xml:space="preserve">82</w:t>
             </w:r>
           </w:p>
@@ -744,9 +2281,27 @@
         <w:tc>
           <w:tcPr>
             <w:tcW w:type="dxa" w:w="5040"/>
+            <w:vAlign w:val="center"/>
+            <w:tcBorders>
+              <w:top w:val="single" w:sz="6" w:space="0" w:color="D9DEE7"/>
+              <w:left w:val="single" w:sz="6" w:space="0" w:color="D9DEE7"/>
+              <w:bottom w:val="single" w:sz="6" w:space="0" w:color="D9DEE7"/>
+              <w:right w:val="single" w:sz="6" w:space="0" w:color="D9DEE7"/>
+              <w:insideH w:val="single" w:sz="6" w:space="0" w:color="D9DEE7"/>
+              <w:insideV w:val="single" w:sz="6" w:space="0" w:color="D9DEE7"/>
+            </w:tcBorders>
           </w:tcPr>
           <w:p>
+            <w:pPr>
+              <w:spacing w:after="40"/>
+            </w:pPr>
             <w:r>
+              <w:rPr>
+                <w:rFonts w:ascii="Arial" w:hAnsi="Arial"/>
+                <w:b w:val="0"/>
+                <w:color w:val="1D3A5E"/>
+                <w:sz w:val="18"/>
+              </w:rPr>
               <w:t xml:space="preserve">Environmental Fate</w:t>
             </w:r>
           </w:p>
@@ -754,9 +2309,27 @@
         <w:tc>
           <w:tcPr>
             <w:tcW w:type="dxa" w:w="5040"/>
+            <w:vAlign w:val="center"/>
+            <w:tcBorders>
+              <w:top w:val="single" w:sz="6" w:space="0" w:color="D9DEE7"/>
+              <w:left w:val="single" w:sz="6" w:space="0" w:color="D9DEE7"/>
+              <w:bottom w:val="single" w:sz="6" w:space="0" w:color="D9DEE7"/>
+              <w:right w:val="single" w:sz="6" w:space="0" w:color="D9DEE7"/>
+              <w:insideH w:val="single" w:sz="6" w:space="0" w:color="D9DEE7"/>
+              <w:insideV w:val="single" w:sz="6" w:space="0" w:color="D9DEE7"/>
+            </w:tcBorders>
           </w:tcPr>
           <w:p>
+            <w:pPr>
+              <w:spacing w:after="40"/>
+            </w:pPr>
             <w:r>
+              <w:rPr>
+                <w:rFonts w:ascii="Arial" w:hAnsi="Arial"/>
+                <w:b w:val="0"/>
+                <w:color w:val="1D3A5E"/>
+                <w:sz w:val="18"/>
+              </w:rPr>
               <w:t xml:space="preserve">78</w:t>
             </w:r>
           </w:p>
@@ -766,9 +2339,27 @@
         <w:tc>
           <w:tcPr>
             <w:tcW w:type="dxa" w:w="5040"/>
+            <w:vAlign w:val="center"/>
+            <w:tcBorders>
+              <w:top w:val="single" w:sz="6" w:space="0" w:color="D9DEE7"/>
+              <w:left w:val="single" w:sz="6" w:space="0" w:color="D9DEE7"/>
+              <w:bottom w:val="single" w:sz="6" w:space="0" w:color="D9DEE7"/>
+              <w:right w:val="single" w:sz="6" w:space="0" w:color="D9DEE7"/>
+              <w:insideH w:val="single" w:sz="6" w:space="0" w:color="D9DEE7"/>
+              <w:insideV w:val="single" w:sz="6" w:space="0" w:color="D9DEE7"/>
+            </w:tcBorders>
           </w:tcPr>
           <w:p>
+            <w:pPr>
+              <w:spacing w:after="40"/>
+            </w:pPr>
             <w:r>
+              <w:rPr>
+                <w:rFonts w:ascii="Arial" w:hAnsi="Arial"/>
+                <w:b w:val="0"/>
+                <w:color w:val="1D3A5E"/>
+                <w:sz w:val="18"/>
+              </w:rPr>
               <w:t xml:space="preserve">Residue In Food</w:t>
             </w:r>
           </w:p>
@@ -776,9 +2367,27 @@
         <w:tc>
           <w:tcPr>
             <w:tcW w:type="dxa" w:w="5040"/>
+            <w:vAlign w:val="center"/>
+            <w:tcBorders>
+              <w:top w:val="single" w:sz="6" w:space="0" w:color="D9DEE7"/>
+              <w:left w:val="single" w:sz="6" w:space="0" w:color="D9DEE7"/>
+              <w:bottom w:val="single" w:sz="6" w:space="0" w:color="D9DEE7"/>
+              <w:right w:val="single" w:sz="6" w:space="0" w:color="D9DEE7"/>
+              <w:insideH w:val="single" w:sz="6" w:space="0" w:color="D9DEE7"/>
+              <w:insideV w:val="single" w:sz="6" w:space="0" w:color="D9DEE7"/>
+            </w:tcBorders>
           </w:tcPr>
           <w:p>
+            <w:pPr>
+              <w:spacing w:after="40"/>
+            </w:pPr>
             <w:r>
+              <w:rPr>
+                <w:rFonts w:ascii="Arial" w:hAnsi="Arial"/>
+                <w:b w:val="0"/>
+                <w:color w:val="1D3A5E"/>
+                <w:sz w:val="18"/>
+              </w:rPr>
               <w:t xml:space="preserve">30</w:t>
             </w:r>
           </w:p>
@@ -807,9 +2416,28 @@
         <w:tc>
           <w:tcPr>
             <w:tcW w:type="dxa" w:w="5040"/>
+            <w:vAlign w:val="center"/>
+            <w:shd w:fill="F07D00"/>
+            <w:tcBorders>
+              <w:top w:val="single" w:sz="6" w:space="0" w:color="F07D00"/>
+              <w:left w:val="single" w:sz="6" w:space="0" w:color="F07D00"/>
+              <w:bottom w:val="single" w:sz="6" w:space="0" w:color="F07D00"/>
+              <w:right w:val="single" w:sz="6" w:space="0" w:color="F07D00"/>
+              <w:insideH w:val="single" w:sz="6" w:space="0" w:color="F07D00"/>
+              <w:insideV w:val="single" w:sz="6" w:space="0" w:color="F07D00"/>
+            </w:tcBorders>
           </w:tcPr>
           <w:p>
+            <w:pPr>
+              <w:spacing w:after="40"/>
+            </w:pPr>
             <w:r>
+              <w:rPr>
+                <w:rFonts w:ascii="Arial" w:hAnsi="Arial"/>
+                <w:b/>
+                <w:color w:val="FFFFFF"/>
+                <w:sz w:val="18"/>
+              </w:rPr>
               <w:t>Indicator</w:t>
             </w:r>
           </w:p>
@@ -817,9 +2445,28 @@
         <w:tc>
           <w:tcPr>
             <w:tcW w:type="dxa" w:w="5040"/>
+            <w:vAlign w:val="center"/>
+            <w:shd w:fill="F07D00"/>
+            <w:tcBorders>
+              <w:top w:val="single" w:sz="6" w:space="0" w:color="F07D00"/>
+              <w:left w:val="single" w:sz="6" w:space="0" w:color="F07D00"/>
+              <w:bottom w:val="single" w:sz="6" w:space="0" w:color="F07D00"/>
+              <w:right w:val="single" w:sz="6" w:space="0" w:color="F07D00"/>
+              <w:insideH w:val="single" w:sz="6" w:space="0" w:color="F07D00"/>
+              <w:insideV w:val="single" w:sz="6" w:space="0" w:color="F07D00"/>
+            </w:tcBorders>
           </w:tcPr>
           <w:p>
+            <w:pPr>
+              <w:spacing w:after="40"/>
+            </w:pPr>
             <w:r>
+              <w:rPr>
+                <w:rFonts w:ascii="Arial" w:hAnsi="Arial"/>
+                <w:b/>
+                <w:color w:val="FFFFFF"/>
+                <w:sz w:val="18"/>
+              </w:rPr>
               <w:t>Value</w:t>
             </w:r>
           </w:p>
@@ -829,9 +2476,27 @@
         <w:tc>
           <w:tcPr>
             <w:tcW w:type="dxa" w:w="5040"/>
+            <w:vAlign w:val="center"/>
+            <w:tcBorders>
+              <w:top w:val="single" w:sz="6" w:space="0" w:color="D9DEE7"/>
+              <w:left w:val="single" w:sz="6" w:space="0" w:color="D9DEE7"/>
+              <w:bottom w:val="single" w:sz="6" w:space="0" w:color="D9DEE7"/>
+              <w:right w:val="single" w:sz="6" w:space="0" w:color="D9DEE7"/>
+              <w:insideH w:val="single" w:sz="6" w:space="0" w:color="D9DEE7"/>
+              <w:insideV w:val="single" w:sz="6" w:space="0" w:color="D9DEE7"/>
+            </w:tcBorders>
           </w:tcPr>
           <w:p>
+            <w:pPr>
+              <w:spacing w:after="40"/>
+            </w:pPr>
             <w:r>
+              <w:rPr>
+                <w:rFonts w:ascii="Arial" w:hAnsi="Arial"/>
+                <w:b w:val="0"/>
+                <w:color w:val="1D3A5E"/>
+                <w:sz w:val="18"/>
+              </w:rPr>
               <w:t xml:space="preserve">Ld50 Oral Rat Mg Per Kg</w:t>
             </w:r>
           </w:p>
@@ -839,9 +2504,27 @@
         <w:tc>
           <w:tcPr>
             <w:tcW w:type="dxa" w:w="5040"/>
+            <w:vAlign w:val="center"/>
+            <w:tcBorders>
+              <w:top w:val="single" w:sz="6" w:space="0" w:color="D9DEE7"/>
+              <w:left w:val="single" w:sz="6" w:space="0" w:color="D9DEE7"/>
+              <w:bottom w:val="single" w:sz="6" w:space="0" w:color="D9DEE7"/>
+              <w:right w:val="single" w:sz="6" w:space="0" w:color="D9DEE7"/>
+              <w:insideH w:val="single" w:sz="6" w:space="0" w:color="D9DEE7"/>
+              <w:insideV w:val="single" w:sz="6" w:space="0" w:color="D9DEE7"/>
+            </w:tcBorders>
           </w:tcPr>
           <w:p>
+            <w:pPr>
+              <w:spacing w:after="40"/>
+            </w:pPr>
             <w:r>
+              <w:rPr>
+                <w:rFonts w:ascii="Arial" w:hAnsi="Arial"/>
+                <w:b w:val="0"/>
+                <w:color w:val="1D3A5E"/>
+                <w:sz w:val="18"/>
+              </w:rPr>
               <w:t xml:space="preserve">1450</w:t>
             </w:r>
           </w:p>
@@ -851,9 +2534,27 @@
         <w:tc>
           <w:tcPr>
             <w:tcW w:type="dxa" w:w="5040"/>
+            <w:vAlign w:val="center"/>
+            <w:tcBorders>
+              <w:top w:val="single" w:sz="6" w:space="0" w:color="D9DEE7"/>
+              <w:left w:val="single" w:sz="6" w:space="0" w:color="D9DEE7"/>
+              <w:bottom w:val="single" w:sz="6" w:space="0" w:color="D9DEE7"/>
+              <w:right w:val="single" w:sz="6" w:space="0" w:color="D9DEE7"/>
+              <w:insideH w:val="single" w:sz="6" w:space="0" w:color="D9DEE7"/>
+              <w:insideV w:val="single" w:sz="6" w:space="0" w:color="D9DEE7"/>
+            </w:tcBorders>
           </w:tcPr>
           <w:p>
+            <w:pPr>
+              <w:spacing w:after="40"/>
+            </w:pPr>
             <w:r>
+              <w:rPr>
+                <w:rFonts w:ascii="Arial" w:hAnsi="Arial"/>
+                <w:b w:val="0"/>
+                <w:color w:val="1D3A5E"/>
+                <w:sz w:val="18"/>
+              </w:rPr>
               <w:t xml:space="preserve">Ld50 Dermal Rat Mg Per Kg</w:t>
             </w:r>
           </w:p>
@@ -861,9 +2562,27 @@
         <w:tc>
           <w:tcPr>
             <w:tcW w:type="dxa" w:w="5040"/>
+            <w:vAlign w:val="center"/>
+            <w:tcBorders>
+              <w:top w:val="single" w:sz="6" w:space="0" w:color="D9DEE7"/>
+              <w:left w:val="single" w:sz="6" w:space="0" w:color="D9DEE7"/>
+              <w:bottom w:val="single" w:sz="6" w:space="0" w:color="D9DEE7"/>
+              <w:right w:val="single" w:sz="6" w:space="0" w:color="D9DEE7"/>
+              <w:insideH w:val="single" w:sz="6" w:space="0" w:color="D9DEE7"/>
+              <w:insideV w:val="single" w:sz="6" w:space="0" w:color="D9DEE7"/>
+            </w:tcBorders>
           </w:tcPr>
           <w:p>
+            <w:pPr>
+              <w:spacing w:after="40"/>
+            </w:pPr>
             <w:r>
+              <w:rPr>
+                <w:rFonts w:ascii="Arial" w:hAnsi="Arial"/>
+                <w:b w:val="0"/>
+                <w:color w:val="1D3A5E"/>
+                <w:sz w:val="18"/>
+              </w:rPr>
               <w:t xml:space="preserve">2000</w:t>
             </w:r>
           </w:p>
@@ -873,9 +2592,27 @@
         <w:tc>
           <w:tcPr>
             <w:tcW w:type="dxa" w:w="5040"/>
+            <w:vAlign w:val="center"/>
+            <w:tcBorders>
+              <w:top w:val="single" w:sz="6" w:space="0" w:color="D9DEE7"/>
+              <w:left w:val="single" w:sz="6" w:space="0" w:color="D9DEE7"/>
+              <w:bottom w:val="single" w:sz="6" w:space="0" w:color="D9DEE7"/>
+              <w:right w:val="single" w:sz="6" w:space="0" w:color="D9DEE7"/>
+              <w:insideH w:val="single" w:sz="6" w:space="0" w:color="D9DEE7"/>
+              <w:insideV w:val="single" w:sz="6" w:space="0" w:color="D9DEE7"/>
+            </w:tcBorders>
           </w:tcPr>
           <w:p>
+            <w:pPr>
+              <w:spacing w:after="40"/>
+            </w:pPr>
             <w:r>
+              <w:rPr>
+                <w:rFonts w:ascii="Arial" w:hAnsi="Arial"/>
+                <w:b w:val="0"/>
+                <w:color w:val="1D3A5E"/>
+                <w:sz w:val="18"/>
+              </w:rPr>
               <w:t xml:space="preserve">Fish Lc50 96H Mg Per L</w:t>
             </w:r>
           </w:p>
@@ -883,9 +2620,27 @@
         <w:tc>
           <w:tcPr>
             <w:tcW w:type="dxa" w:w="5040"/>
+            <w:vAlign w:val="center"/>
+            <w:tcBorders>
+              <w:top w:val="single" w:sz="6" w:space="0" w:color="D9DEE7"/>
+              <w:left w:val="single" w:sz="6" w:space="0" w:color="D9DEE7"/>
+              <w:bottom w:val="single" w:sz="6" w:space="0" w:color="D9DEE7"/>
+              <w:right w:val="single" w:sz="6" w:space="0" w:color="D9DEE7"/>
+              <w:insideH w:val="single" w:sz="6" w:space="0" w:color="D9DEE7"/>
+              <w:insideV w:val="single" w:sz="6" w:space="0" w:color="D9DEE7"/>
+            </w:tcBorders>
           </w:tcPr>
           <w:p>
+            <w:pPr>
+              <w:spacing w:after="40"/>
+            </w:pPr>
             <w:r>
+              <w:rPr>
+                <w:rFonts w:ascii="Arial" w:hAnsi="Arial"/>
+                <w:b w:val="0"/>
+                <w:color w:val="1D3A5E"/>
+                <w:sz w:val="18"/>
+              </w:rPr>
               <w:t xml:space="preserve">0.89</w:t>
             </w:r>
           </w:p>
@@ -895,9 +2650,27 @@
         <w:tc>
           <w:tcPr>
             <w:tcW w:type="dxa" w:w="5040"/>
+            <w:vAlign w:val="center"/>
+            <w:tcBorders>
+              <w:top w:val="single" w:sz="6" w:space="0" w:color="D9DEE7"/>
+              <w:left w:val="single" w:sz="6" w:space="0" w:color="D9DEE7"/>
+              <w:bottom w:val="single" w:sz="6" w:space="0" w:color="D9DEE7"/>
+              <w:right w:val="single" w:sz="6" w:space="0" w:color="D9DEE7"/>
+              <w:insideH w:val="single" w:sz="6" w:space="0" w:color="D9DEE7"/>
+              <w:insideV w:val="single" w:sz="6" w:space="0" w:color="D9DEE7"/>
+            </w:tcBorders>
           </w:tcPr>
           <w:p>
+            <w:pPr>
+              <w:spacing w:after="40"/>
+            </w:pPr>
             <w:r>
+              <w:rPr>
+                <w:rFonts w:ascii="Arial" w:hAnsi="Arial"/>
+                <w:b w:val="0"/>
+                <w:color w:val="1D3A5E"/>
+                <w:sz w:val="18"/>
+              </w:rPr>
               <w:t xml:space="preserve">Bee Ld50 Oral Microg Per Bee</w:t>
             </w:r>
           </w:p>
@@ -905,9 +2678,27 @@
         <w:tc>
           <w:tcPr>
             <w:tcW w:type="dxa" w:w="5040"/>
+            <w:vAlign w:val="center"/>
+            <w:tcBorders>
+              <w:top w:val="single" w:sz="6" w:space="0" w:color="D9DEE7"/>
+              <w:left w:val="single" w:sz="6" w:space="0" w:color="D9DEE7"/>
+              <w:bottom w:val="single" w:sz="6" w:space="0" w:color="D9DEE7"/>
+              <w:right w:val="single" w:sz="6" w:space="0" w:color="D9DEE7"/>
+              <w:insideH w:val="single" w:sz="6" w:space="0" w:color="D9DEE7"/>
+              <w:insideV w:val="single" w:sz="6" w:space="0" w:color="D9DEE7"/>
+            </w:tcBorders>
           </w:tcPr>
           <w:p>
+            <w:pPr>
+              <w:spacing w:after="40"/>
+            </w:pPr>
             <w:r>
+              <w:rPr>
+                <w:rFonts w:ascii="Arial" w:hAnsi="Arial"/>
+                <w:b w:val="0"/>
+                <w:color w:val="1D3A5E"/>
+                <w:sz w:val="18"/>
+              </w:rPr>
               <w:t xml:space="preserve">12.4</w:t>
             </w:r>
           </w:p>
@@ -917,9 +2708,27 @@
         <w:tc>
           <w:tcPr>
             <w:tcW w:type="dxa" w:w="5040"/>
+            <w:vAlign w:val="center"/>
+            <w:tcBorders>
+              <w:top w:val="single" w:sz="6" w:space="0" w:color="D9DEE7"/>
+              <w:left w:val="single" w:sz="6" w:space="0" w:color="D9DEE7"/>
+              <w:bottom w:val="single" w:sz="6" w:space="0" w:color="D9DEE7"/>
+              <w:right w:val="single" w:sz="6" w:space="0" w:color="D9DEE7"/>
+              <w:insideH w:val="single" w:sz="6" w:space="0" w:color="D9DEE7"/>
+              <w:insideV w:val="single" w:sz="6" w:space="0" w:color="D9DEE7"/>
+            </w:tcBorders>
           </w:tcPr>
           <w:p>
+            <w:pPr>
+              <w:spacing w:after="40"/>
+            </w:pPr>
             <w:r>
+              <w:rPr>
+                <w:rFonts w:ascii="Arial" w:hAnsi="Arial"/>
+                <w:b w:val="0"/>
+                <w:color w:val="1D3A5E"/>
+                <w:sz w:val="18"/>
+              </w:rPr>
               <w:t xml:space="preserve">Earthworm Lc50 14D Mg Per Kg</w:t>
             </w:r>
           </w:p>
@@ -927,9 +2736,27 @@
         <w:tc>
           <w:tcPr>
             <w:tcW w:type="dxa" w:w="5040"/>
+            <w:vAlign w:val="center"/>
+            <w:tcBorders>
+              <w:top w:val="single" w:sz="6" w:space="0" w:color="D9DEE7"/>
+              <w:left w:val="single" w:sz="6" w:space="0" w:color="D9DEE7"/>
+              <w:bottom w:val="single" w:sz="6" w:space="0" w:color="D9DEE7"/>
+              <w:right w:val="single" w:sz="6" w:space="0" w:color="D9DEE7"/>
+              <w:insideH w:val="single" w:sz="6" w:space="0" w:color="D9DEE7"/>
+              <w:insideV w:val="single" w:sz="6" w:space="0" w:color="D9DEE7"/>
+            </w:tcBorders>
           </w:tcPr>
           <w:p>
+            <w:pPr>
+              <w:spacing w:after="40"/>
+            </w:pPr>
             <w:r>
+              <w:rPr>
+                <w:rFonts w:ascii="Arial" w:hAnsi="Arial"/>
+                <w:b w:val="0"/>
+                <w:color w:val="1D3A5E"/>
+                <w:sz w:val="18"/>
+              </w:rPr>
               <w:t xml:space="preserve">145</w:t>
             </w:r>
           </w:p>
@@ -1150,6 +2977,38 @@
         </w:sectPr>
       </w:pPr>
     </w:p>
+    <w:tbl>
+      <w:tblPr>
+        <w:tblW w:type="auto" w:w="0"/>
+        <w:jc w:val="center"/>
+        <w:tblLook w:firstColumn="1" w:firstRow="1" w:lastColumn="0" w:lastRow="0" w:noHBand="0" w:noVBand="1" w:val="04A0"/>
+      </w:tblPr>
+      <w:tblGrid>
+        <w:gridCol w:w="10080"/>
+      </w:tblGrid>
+      <w:tr>
+        <w:trPr>
+          <w:trHeight w:val="160"/>
+        </w:trPr>
+        <w:tc>
+          <w:tcPr>
+            <w:tcW w:type="dxa" w:w="10080"/>
+            <w:shd w:fill="F07D00"/>
+            <w:tcBorders>
+              <w:top w:val="single" w:sz="6" w:space="0" w:color="F07D00"/>
+              <w:left w:val="single" w:sz="6" w:space="0" w:color="F07D00"/>
+              <w:bottom w:val="single" w:sz="6" w:space="0" w:color="F07D00"/>
+              <w:right w:val="single" w:sz="6" w:space="0" w:color="F07D00"/>
+              <w:insideH w:val="single" w:sz="6" w:space="0" w:color="F07D00"/>
+              <w:insideV w:val="single" w:sz="6" w:space="0" w:color="F07D00"/>
+            </w:tcBorders>
+          </w:tcPr>
+          <w:p>
+            <w:r/>
+          </w:p>
+        </w:tc>
+      </w:tr>
+    </w:tbl>
     <w:p>
       <w:pPr>
         <w:pStyle w:val="Heading1"/>
@@ -1158,46 +3017,499 @@
         <w:t xml:space="preserve">Verdura 75 WG</w:t>
       </w:r>
     </w:p>
-    <w:p>
-      <w:r>
-        <w:t xml:space="preserve">Product ID: FCSA-PROD-VR075</w:t>
-      </w:r>
-    </w:p>
-    <w:p>
-      <w:r>
-        <w:t xml:space="preserve">Active substance: Lumicarb-methyl (750 g/kg)</w:t>
-      </w:r>
-    </w:p>
-    <w:p>
-      <w:r>
-        <w:t xml:space="preserve">Formulation: WG - Water-dispersible granules</w:t>
-      </w:r>
-    </w:p>
-    <w:p>
-      <w:r>
-        <w:t xml:space="preserve">Manufacturer: Demo CropChem GmbH</w:t>
-      </w:r>
-    </w:p>
-    <w:p>
-      <w:r>
-        <w:t xml:space="preserve">Country: FR. Status: approved. Valid from 2024-06-01 to 2029-05-31.</w:t>
-      </w:r>
-    </w:p>
-    <w:p>
-      <w:r>
-        <w:t xml:space="preserve">Risk score: 42</w:t>
-      </w:r>
-    </w:p>
-    <w:p>
-      <w:r>
-        <w:t xml:space="preserve">Applications assessed: 2</w:t>
-      </w:r>
-    </w:p>
-    <w:p>
-      <w:r>
-        <w:t xml:space="preserve">Average efficacy: 89.0%</w:t>
-      </w:r>
-    </w:p>
+    <w:tbl>
+      <w:tblPr>
+        <w:tblStyle w:val="TableGrid"/>
+        <w:tblW w:type="auto" w:w="0"/>
+        <w:jc w:val="center"/>
+        <w:tblLayout w:type="autofit"/>
+        <w:tblLook w:firstColumn="1" w:firstRow="1" w:lastColumn="0" w:lastRow="0" w:noHBand="0" w:noVBand="1" w:val="04A0"/>
+      </w:tblPr>
+      <w:tblGrid>
+        <w:gridCol w:w="5040"/>
+        <w:gridCol w:w="5040"/>
+      </w:tblGrid>
+      <w:tr>
+        <w:tc>
+          <w:tcPr>
+            <w:tcW w:type="dxa" w:w="2736"/>
+            <w:vAlign w:val="center"/>
+            <w:tcBorders>
+              <w:top w:val="single" w:sz="6" w:space="0" w:color="D9DEE7"/>
+              <w:left w:val="single" w:sz="6" w:space="0" w:color="D9DEE7"/>
+              <w:bottom w:val="single" w:sz="6" w:space="0" w:color="D9DEE7"/>
+              <w:right w:val="single" w:sz="6" w:space="0" w:color="D9DEE7"/>
+              <w:insideH w:val="single" w:sz="6" w:space="0" w:color="D9DEE7"/>
+              <w:insideV w:val="single" w:sz="6" w:space="0" w:color="D9DEE7"/>
+            </w:tcBorders>
+            <w:shd w:fill="FFF2E6"/>
+          </w:tcPr>
+          <w:p>
+            <w:pPr>
+              <w:spacing w:after="40"/>
+            </w:pPr>
+            <w:r>
+              <w:rPr>
+                <w:rFonts w:ascii="Arial" w:hAnsi="Arial"/>
+                <w:b/>
+                <w:color w:val="1D3A5E"/>
+                <w:sz w:val="18"/>
+              </w:rPr>
+              <w:t>Product ID</w:t>
+            </w:r>
+          </w:p>
+        </w:tc>
+        <w:tc>
+          <w:tcPr>
+            <w:tcW w:type="dxa" w:w="5040"/>
+            <w:vAlign w:val="center"/>
+            <w:tcBorders>
+              <w:top w:val="single" w:sz="6" w:space="0" w:color="D9DEE7"/>
+              <w:left w:val="single" w:sz="6" w:space="0" w:color="D9DEE7"/>
+              <w:bottom w:val="single" w:sz="6" w:space="0" w:color="D9DEE7"/>
+              <w:right w:val="single" w:sz="6" w:space="0" w:color="D9DEE7"/>
+              <w:insideH w:val="single" w:sz="6" w:space="0" w:color="D9DEE7"/>
+              <w:insideV w:val="single" w:sz="6" w:space="0" w:color="D9DEE7"/>
+            </w:tcBorders>
+            <w:shd w:fill="F5F5F5"/>
+          </w:tcPr>
+          <w:p>
+            <w:pPr>
+              <w:spacing w:after="40"/>
+            </w:pPr>
+            <w:r>
+              <w:rPr>
+                <w:rFonts w:ascii="Arial" w:hAnsi="Arial"/>
+                <w:b w:val="0"/>
+                <w:color w:val="1D3A5E"/>
+                <w:sz w:val="18"/>
+              </w:rPr>
+              <w:t xml:space="preserve">FCSA-PROD-VR075</w:t>
+            </w:r>
+          </w:p>
+        </w:tc>
+      </w:tr>
+      <w:tr>
+        <w:tc>
+          <w:tcPr>
+            <w:tcW w:type="dxa" w:w="2736"/>
+            <w:vAlign w:val="center"/>
+            <w:tcBorders>
+              <w:top w:val="single" w:sz="6" w:space="0" w:color="D9DEE7"/>
+              <w:left w:val="single" w:sz="6" w:space="0" w:color="D9DEE7"/>
+              <w:bottom w:val="single" w:sz="6" w:space="0" w:color="D9DEE7"/>
+              <w:right w:val="single" w:sz="6" w:space="0" w:color="D9DEE7"/>
+              <w:insideH w:val="single" w:sz="6" w:space="0" w:color="D9DEE7"/>
+              <w:insideV w:val="single" w:sz="6" w:space="0" w:color="D9DEE7"/>
+            </w:tcBorders>
+            <w:shd w:fill="FFF2E6"/>
+          </w:tcPr>
+          <w:p>
+            <w:pPr>
+              <w:spacing w:after="40"/>
+            </w:pPr>
+            <w:r>
+              <w:rPr>
+                <w:rFonts w:ascii="Arial" w:hAnsi="Arial"/>
+                <w:b/>
+                <w:color w:val="1D3A5E"/>
+                <w:sz w:val="18"/>
+              </w:rPr>
+              <w:t>Active substance</w:t>
+            </w:r>
+          </w:p>
+        </w:tc>
+        <w:tc>
+          <w:tcPr>
+            <w:tcW w:type="dxa" w:w="5040"/>
+            <w:vAlign w:val="center"/>
+            <w:tcBorders>
+              <w:top w:val="single" w:sz="6" w:space="0" w:color="D9DEE7"/>
+              <w:left w:val="single" w:sz="6" w:space="0" w:color="D9DEE7"/>
+              <w:bottom w:val="single" w:sz="6" w:space="0" w:color="D9DEE7"/>
+              <w:right w:val="single" w:sz="6" w:space="0" w:color="D9DEE7"/>
+              <w:insideH w:val="single" w:sz="6" w:space="0" w:color="D9DEE7"/>
+              <w:insideV w:val="single" w:sz="6" w:space="0" w:color="D9DEE7"/>
+            </w:tcBorders>
+            <w:shd w:fill="F5F5F5"/>
+          </w:tcPr>
+          <w:p>
+            <w:pPr>
+              <w:spacing w:after="40"/>
+            </w:pPr>
+            <w:r>
+              <w:rPr>
+                <w:rFonts w:ascii="Arial" w:hAnsi="Arial"/>
+                <w:b w:val="0"/>
+                <w:color w:val="1D3A5E"/>
+                <w:sz w:val="18"/>
+              </w:rPr>
+              <w:t xml:space="preserve">Lumicarb-methyl (750 g/kg)</w:t>
+            </w:r>
+          </w:p>
+        </w:tc>
+      </w:tr>
+      <w:tr>
+        <w:tc>
+          <w:tcPr>
+            <w:tcW w:type="dxa" w:w="2736"/>
+            <w:vAlign w:val="center"/>
+            <w:tcBorders>
+              <w:top w:val="single" w:sz="6" w:space="0" w:color="D9DEE7"/>
+              <w:left w:val="single" w:sz="6" w:space="0" w:color="D9DEE7"/>
+              <w:bottom w:val="single" w:sz="6" w:space="0" w:color="D9DEE7"/>
+              <w:right w:val="single" w:sz="6" w:space="0" w:color="D9DEE7"/>
+              <w:insideH w:val="single" w:sz="6" w:space="0" w:color="D9DEE7"/>
+              <w:insideV w:val="single" w:sz="6" w:space="0" w:color="D9DEE7"/>
+            </w:tcBorders>
+            <w:shd w:fill="FFF2E6"/>
+          </w:tcPr>
+          <w:p>
+            <w:pPr>
+              <w:spacing w:after="40"/>
+            </w:pPr>
+            <w:r>
+              <w:rPr>
+                <w:rFonts w:ascii="Arial" w:hAnsi="Arial"/>
+                <w:b/>
+                <w:color w:val="1D3A5E"/>
+                <w:sz w:val="18"/>
+              </w:rPr>
+              <w:t>Formulation</w:t>
+            </w:r>
+          </w:p>
+        </w:tc>
+        <w:tc>
+          <w:tcPr>
+            <w:tcW w:type="dxa" w:w="5040"/>
+            <w:vAlign w:val="center"/>
+            <w:tcBorders>
+              <w:top w:val="single" w:sz="6" w:space="0" w:color="D9DEE7"/>
+              <w:left w:val="single" w:sz="6" w:space="0" w:color="D9DEE7"/>
+              <w:bottom w:val="single" w:sz="6" w:space="0" w:color="D9DEE7"/>
+              <w:right w:val="single" w:sz="6" w:space="0" w:color="D9DEE7"/>
+              <w:insideH w:val="single" w:sz="6" w:space="0" w:color="D9DEE7"/>
+              <w:insideV w:val="single" w:sz="6" w:space="0" w:color="D9DEE7"/>
+            </w:tcBorders>
+            <w:shd w:fill="F5F5F5"/>
+          </w:tcPr>
+          <w:p>
+            <w:pPr>
+              <w:spacing w:after="40"/>
+            </w:pPr>
+            <w:r>
+              <w:rPr>
+                <w:rFonts w:ascii="Arial" w:hAnsi="Arial"/>
+                <w:b w:val="0"/>
+                <w:color w:val="1D3A5E"/>
+                <w:sz w:val="18"/>
+              </w:rPr>
+              <w:t xml:space="preserve">WG - Water-dispersible granules</w:t>
+            </w:r>
+          </w:p>
+        </w:tc>
+      </w:tr>
+      <w:tr>
+        <w:tc>
+          <w:tcPr>
+            <w:tcW w:type="dxa" w:w="2736"/>
+            <w:vAlign w:val="center"/>
+            <w:tcBorders>
+              <w:top w:val="single" w:sz="6" w:space="0" w:color="D9DEE7"/>
+              <w:left w:val="single" w:sz="6" w:space="0" w:color="D9DEE7"/>
+              <w:bottom w:val="single" w:sz="6" w:space="0" w:color="D9DEE7"/>
+              <w:right w:val="single" w:sz="6" w:space="0" w:color="D9DEE7"/>
+              <w:insideH w:val="single" w:sz="6" w:space="0" w:color="D9DEE7"/>
+              <w:insideV w:val="single" w:sz="6" w:space="0" w:color="D9DEE7"/>
+            </w:tcBorders>
+            <w:shd w:fill="FFF2E6"/>
+          </w:tcPr>
+          <w:p>
+            <w:pPr>
+              <w:spacing w:after="40"/>
+            </w:pPr>
+            <w:r>
+              <w:rPr>
+                <w:rFonts w:ascii="Arial" w:hAnsi="Arial"/>
+                <w:b/>
+                <w:color w:val="1D3A5E"/>
+                <w:sz w:val="18"/>
+              </w:rPr>
+              <w:t>Manufacturer</w:t>
+            </w:r>
+          </w:p>
+        </w:tc>
+        <w:tc>
+          <w:tcPr>
+            <w:tcW w:type="dxa" w:w="5040"/>
+            <w:vAlign w:val="center"/>
+            <w:tcBorders>
+              <w:top w:val="single" w:sz="6" w:space="0" w:color="D9DEE7"/>
+              <w:left w:val="single" w:sz="6" w:space="0" w:color="D9DEE7"/>
+              <w:bottom w:val="single" w:sz="6" w:space="0" w:color="D9DEE7"/>
+              <w:right w:val="single" w:sz="6" w:space="0" w:color="D9DEE7"/>
+              <w:insideH w:val="single" w:sz="6" w:space="0" w:color="D9DEE7"/>
+              <w:insideV w:val="single" w:sz="6" w:space="0" w:color="D9DEE7"/>
+            </w:tcBorders>
+            <w:shd w:fill="F5F5F5"/>
+          </w:tcPr>
+          <w:p>
+            <w:pPr>
+              <w:spacing w:after="40"/>
+            </w:pPr>
+            <w:r>
+              <w:rPr>
+                <w:rFonts w:ascii="Arial" w:hAnsi="Arial"/>
+                <w:b w:val="0"/>
+                <w:color w:val="1D3A5E"/>
+                <w:sz w:val="18"/>
+              </w:rPr>
+              <w:t xml:space="preserve">Demo CropChem GmbH</w:t>
+            </w:r>
+          </w:p>
+        </w:tc>
+      </w:tr>
+      <w:tr>
+        <w:tc>
+          <w:tcPr>
+            <w:tcW w:type="dxa" w:w="2736"/>
+            <w:vAlign w:val="center"/>
+            <w:tcBorders>
+              <w:top w:val="single" w:sz="6" w:space="0" w:color="D9DEE7"/>
+              <w:left w:val="single" w:sz="6" w:space="0" w:color="D9DEE7"/>
+              <w:bottom w:val="single" w:sz="6" w:space="0" w:color="D9DEE7"/>
+              <w:right w:val="single" w:sz="6" w:space="0" w:color="D9DEE7"/>
+              <w:insideH w:val="single" w:sz="6" w:space="0" w:color="D9DEE7"/>
+              <w:insideV w:val="single" w:sz="6" w:space="0" w:color="D9DEE7"/>
+            </w:tcBorders>
+            <w:shd w:fill="FFF2E6"/>
+          </w:tcPr>
+          <w:p>
+            <w:pPr>
+              <w:spacing w:after="40"/>
+            </w:pPr>
+            <w:r>
+              <w:rPr>
+                <w:rFonts w:ascii="Arial" w:hAnsi="Arial"/>
+                <w:b/>
+                <w:color w:val="1D3A5E"/>
+                <w:sz w:val="18"/>
+              </w:rPr>
+              <w:t>Approval</w:t>
+            </w:r>
+          </w:p>
+        </w:tc>
+        <w:tc>
+          <w:tcPr>
+            <w:tcW w:type="dxa" w:w="5040"/>
+            <w:vAlign w:val="center"/>
+            <w:tcBorders>
+              <w:top w:val="single" w:sz="6" w:space="0" w:color="D9DEE7"/>
+              <w:left w:val="single" w:sz="6" w:space="0" w:color="D9DEE7"/>
+              <w:bottom w:val="single" w:sz="6" w:space="0" w:color="D9DEE7"/>
+              <w:right w:val="single" w:sz="6" w:space="0" w:color="D9DEE7"/>
+              <w:insideH w:val="single" w:sz="6" w:space="0" w:color="D9DEE7"/>
+              <w:insideV w:val="single" w:sz="6" w:space="0" w:color="D9DEE7"/>
+            </w:tcBorders>
+            <w:shd w:fill="F5F5F5"/>
+          </w:tcPr>
+          <w:p>
+            <w:pPr>
+              <w:spacing w:after="40"/>
+            </w:pPr>
+            <w:r>
+              <w:rPr>
+                <w:rFonts w:ascii="Arial" w:hAnsi="Arial"/>
+                <w:b w:val="0"/>
+                <w:color w:val="1D3A5E"/>
+                <w:sz w:val="18"/>
+              </w:rPr>
+              <w:t xml:space="preserve">Country: FR. Status: approved. Valid from 2024-06-01 to 2029-05-31.</w:t>
+            </w:r>
+          </w:p>
+        </w:tc>
+      </w:tr>
+      <w:tr>
+        <w:tc>
+          <w:tcPr>
+            <w:tcW w:type="dxa" w:w="2736"/>
+            <w:vAlign w:val="center"/>
+            <w:tcBorders>
+              <w:top w:val="single" w:sz="6" w:space="0" w:color="D9DEE7"/>
+              <w:left w:val="single" w:sz="6" w:space="0" w:color="D9DEE7"/>
+              <w:bottom w:val="single" w:sz="6" w:space="0" w:color="D9DEE7"/>
+              <w:right w:val="single" w:sz="6" w:space="0" w:color="D9DEE7"/>
+              <w:insideH w:val="single" w:sz="6" w:space="0" w:color="D9DEE7"/>
+              <w:insideV w:val="single" w:sz="6" w:space="0" w:color="D9DEE7"/>
+            </w:tcBorders>
+            <w:shd w:fill="FFF2E6"/>
+          </w:tcPr>
+          <w:p>
+            <w:pPr>
+              <w:spacing w:after="40"/>
+            </w:pPr>
+            <w:r>
+              <w:rPr>
+                <w:rFonts w:ascii="Arial" w:hAnsi="Arial"/>
+                <w:b/>
+                <w:color w:val="1D3A5E"/>
+                <w:sz w:val="18"/>
+              </w:rPr>
+              <w:t>Risk score</w:t>
+            </w:r>
+          </w:p>
+        </w:tc>
+        <w:tc>
+          <w:tcPr>
+            <w:tcW w:type="dxa" w:w="5040"/>
+            <w:vAlign w:val="center"/>
+            <w:tcBorders>
+              <w:top w:val="single" w:sz="6" w:space="0" w:color="D9DEE7"/>
+              <w:left w:val="single" w:sz="6" w:space="0" w:color="D9DEE7"/>
+              <w:bottom w:val="single" w:sz="6" w:space="0" w:color="D9DEE7"/>
+              <w:right w:val="single" w:sz="6" w:space="0" w:color="D9DEE7"/>
+              <w:insideH w:val="single" w:sz="6" w:space="0" w:color="D9DEE7"/>
+              <w:insideV w:val="single" w:sz="6" w:space="0" w:color="D9DEE7"/>
+            </w:tcBorders>
+            <w:shd w:fill="F5F5F5"/>
+          </w:tcPr>
+          <w:p>
+            <w:pPr>
+              <w:spacing w:after="40"/>
+            </w:pPr>
+            <w:r>
+              <w:rPr>
+                <w:rFonts w:ascii="Arial" w:hAnsi="Arial"/>
+                <w:b w:val="0"/>
+                <w:color w:val="1D3A5E"/>
+                <w:sz w:val="18"/>
+              </w:rPr>
+              <w:t xml:space="preserve">42</w:t>
+            </w:r>
+          </w:p>
+        </w:tc>
+      </w:tr>
+      <w:tr>
+        <w:tc>
+          <w:tcPr>
+            <w:tcW w:type="dxa" w:w="2736"/>
+            <w:vAlign w:val="center"/>
+            <w:tcBorders>
+              <w:top w:val="single" w:sz="6" w:space="0" w:color="D9DEE7"/>
+              <w:left w:val="single" w:sz="6" w:space="0" w:color="D9DEE7"/>
+              <w:bottom w:val="single" w:sz="6" w:space="0" w:color="D9DEE7"/>
+              <w:right w:val="single" w:sz="6" w:space="0" w:color="D9DEE7"/>
+              <w:insideH w:val="single" w:sz="6" w:space="0" w:color="D9DEE7"/>
+              <w:insideV w:val="single" w:sz="6" w:space="0" w:color="D9DEE7"/>
+            </w:tcBorders>
+            <w:shd w:fill="FFF2E6"/>
+          </w:tcPr>
+          <w:p>
+            <w:pPr>
+              <w:spacing w:after="40"/>
+            </w:pPr>
+            <w:r>
+              <w:rPr>
+                <w:rFonts w:ascii="Arial" w:hAnsi="Arial"/>
+                <w:b/>
+                <w:color w:val="1D3A5E"/>
+                <w:sz w:val="18"/>
+              </w:rPr>
+              <w:t>Applications assessed</w:t>
+            </w:r>
+          </w:p>
+        </w:tc>
+        <w:tc>
+          <w:tcPr>
+            <w:tcW w:type="dxa" w:w="5040"/>
+            <w:vAlign w:val="center"/>
+            <w:tcBorders>
+              <w:top w:val="single" w:sz="6" w:space="0" w:color="D9DEE7"/>
+              <w:left w:val="single" w:sz="6" w:space="0" w:color="D9DEE7"/>
+              <w:bottom w:val="single" w:sz="6" w:space="0" w:color="D9DEE7"/>
+              <w:right w:val="single" w:sz="6" w:space="0" w:color="D9DEE7"/>
+              <w:insideH w:val="single" w:sz="6" w:space="0" w:color="D9DEE7"/>
+              <w:insideV w:val="single" w:sz="6" w:space="0" w:color="D9DEE7"/>
+            </w:tcBorders>
+            <w:shd w:fill="F5F5F5"/>
+          </w:tcPr>
+          <w:p>
+            <w:pPr>
+              <w:spacing w:after="40"/>
+            </w:pPr>
+            <w:r>
+              <w:rPr>
+                <w:rFonts w:ascii="Arial" w:hAnsi="Arial"/>
+                <w:b w:val="0"/>
+                <w:color w:val="1D3A5E"/>
+                <w:sz w:val="18"/>
+              </w:rPr>
+              <w:t xml:space="preserve">2</w:t>
+            </w:r>
+          </w:p>
+        </w:tc>
+      </w:tr>
+      <w:tr>
+        <w:tc>
+          <w:tcPr>
+            <w:tcW w:type="dxa" w:w="2736"/>
+            <w:vAlign w:val="center"/>
+            <w:tcBorders>
+              <w:top w:val="single" w:sz="6" w:space="0" w:color="D9DEE7"/>
+              <w:left w:val="single" w:sz="6" w:space="0" w:color="D9DEE7"/>
+              <w:bottom w:val="single" w:sz="6" w:space="0" w:color="D9DEE7"/>
+              <w:right w:val="single" w:sz="6" w:space="0" w:color="D9DEE7"/>
+              <w:insideH w:val="single" w:sz="6" w:space="0" w:color="D9DEE7"/>
+              <w:insideV w:val="single" w:sz="6" w:space="0" w:color="D9DEE7"/>
+            </w:tcBorders>
+            <w:shd w:fill="FFF2E6"/>
+          </w:tcPr>
+          <w:p>
+            <w:pPr>
+              <w:spacing w:after="40"/>
+            </w:pPr>
+            <w:r>
+              <w:rPr>
+                <w:rFonts w:ascii="Arial" w:hAnsi="Arial"/>
+                <w:b/>
+                <w:color w:val="1D3A5E"/>
+                <w:sz w:val="18"/>
+              </w:rPr>
+              <w:t>Average efficacy</w:t>
+            </w:r>
+          </w:p>
+        </w:tc>
+        <w:tc>
+          <w:tcPr>
+            <w:tcW w:type="dxa" w:w="5040"/>
+            <w:vAlign w:val="center"/>
+            <w:tcBorders>
+              <w:top w:val="single" w:sz="6" w:space="0" w:color="D9DEE7"/>
+              <w:left w:val="single" w:sz="6" w:space="0" w:color="D9DEE7"/>
+              <w:bottom w:val="single" w:sz="6" w:space="0" w:color="D9DEE7"/>
+              <w:right w:val="single" w:sz="6" w:space="0" w:color="D9DEE7"/>
+              <w:insideH w:val="single" w:sz="6" w:space="0" w:color="D9DEE7"/>
+              <w:insideV w:val="single" w:sz="6" w:space="0" w:color="D9DEE7"/>
+            </w:tcBorders>
+            <w:shd w:fill="F5F5F5"/>
+          </w:tcPr>
+          <w:p>
+            <w:pPr>
+              <w:spacing w:after="40"/>
+            </w:pPr>
+            <w:r>
+              <w:rPr>
+                <w:rFonts w:ascii="Arial" w:hAnsi="Arial"/>
+                <w:b w:val="0"/>
+                <w:color w:val="1D3A5E"/>
+                <w:sz w:val="18"/>
+              </w:rPr>
+              <w:t xml:space="preserve">89.0%</w:t>
+            </w:r>
+          </w:p>
+        </w:tc>
+      </w:tr>
+    </w:tbl>
     <w:p>
       <w:r>
         <w:t xml:space="preserve"/>
@@ -1230,9 +3542,28 @@
         <w:tc>
           <w:tcPr>
             <w:tcW w:type="dxa" w:w="1440"/>
+            <w:vAlign w:val="center"/>
+            <w:shd w:fill="1D3A5E"/>
+            <w:tcBorders>
+              <w:top w:val="single" w:sz="6" w:space="0" w:color="1D3A5E"/>
+              <w:left w:val="single" w:sz="6" w:space="0" w:color="1D3A5E"/>
+              <w:bottom w:val="single" w:sz="6" w:space="0" w:color="1D3A5E"/>
+              <w:right w:val="single" w:sz="6" w:space="0" w:color="1D3A5E"/>
+              <w:insideH w:val="single" w:sz="6" w:space="0" w:color="1D3A5E"/>
+              <w:insideV w:val="single" w:sz="6" w:space="0" w:color="1D3A5E"/>
+            </w:tcBorders>
           </w:tcPr>
           <w:p>
+            <w:pPr>
+              <w:spacing w:after="40"/>
+            </w:pPr>
             <w:r>
+              <w:rPr>
+                <w:rFonts w:ascii="Arial" w:hAnsi="Arial"/>
+                <w:b/>
+                <w:color w:val="FFFFFF"/>
+                <w:sz w:val="18"/>
+              </w:rPr>
               <w:t>Crop</w:t>
             </w:r>
           </w:p>
@@ -1240,9 +3571,28 @@
         <w:tc>
           <w:tcPr>
             <w:tcW w:type="dxa" w:w="1440"/>
+            <w:vAlign w:val="center"/>
+            <w:shd w:fill="1D3A5E"/>
+            <w:tcBorders>
+              <w:top w:val="single" w:sz="6" w:space="0" w:color="1D3A5E"/>
+              <w:left w:val="single" w:sz="6" w:space="0" w:color="1D3A5E"/>
+              <w:bottom w:val="single" w:sz="6" w:space="0" w:color="1D3A5E"/>
+              <w:right w:val="single" w:sz="6" w:space="0" w:color="1D3A5E"/>
+              <w:insideH w:val="single" w:sz="6" w:space="0" w:color="1D3A5E"/>
+              <w:insideV w:val="single" w:sz="6" w:space="0" w:color="1D3A5E"/>
+            </w:tcBorders>
           </w:tcPr>
           <w:p>
+            <w:pPr>
+              <w:spacing w:after="40"/>
+            </w:pPr>
             <w:r>
+              <w:rPr>
+                <w:rFonts w:ascii="Arial" w:hAnsi="Arial"/>
+                <w:b/>
+                <w:color w:val="FFFFFF"/>
+                <w:sz w:val="18"/>
+              </w:rPr>
               <w:t>Target pest</w:t>
             </w:r>
           </w:p>
@@ -1250,9 +3600,28 @@
         <w:tc>
           <w:tcPr>
             <w:tcW w:type="dxa" w:w="1440"/>
+            <w:vAlign w:val="center"/>
+            <w:shd w:fill="1D3A5E"/>
+            <w:tcBorders>
+              <w:top w:val="single" w:sz="6" w:space="0" w:color="1D3A5E"/>
+              <w:left w:val="single" w:sz="6" w:space="0" w:color="1D3A5E"/>
+              <w:bottom w:val="single" w:sz="6" w:space="0" w:color="1D3A5E"/>
+              <w:right w:val="single" w:sz="6" w:space="0" w:color="1D3A5E"/>
+              <w:insideH w:val="single" w:sz="6" w:space="0" w:color="1D3A5E"/>
+              <w:insideV w:val="single" w:sz="6" w:space="0" w:color="1D3A5E"/>
+            </w:tcBorders>
           </w:tcPr>
           <w:p>
+            <w:pPr>
+              <w:spacing w:after="40"/>
+            </w:pPr>
             <w:r>
+              <w:rPr>
+                <w:rFonts w:ascii="Arial" w:hAnsi="Arial"/>
+                <w:b/>
+                <w:color w:val="FFFFFF"/>
+                <w:sz w:val="18"/>
+              </w:rPr>
               <w:t>BBCH</w:t>
             </w:r>
           </w:p>
@@ -1260,9 +3629,28 @@
         <w:tc>
           <w:tcPr>
             <w:tcW w:type="dxa" w:w="1440"/>
+            <w:vAlign w:val="center"/>
+            <w:shd w:fill="1D3A5E"/>
+            <w:tcBorders>
+              <w:top w:val="single" w:sz="6" w:space="0" w:color="1D3A5E"/>
+              <w:left w:val="single" w:sz="6" w:space="0" w:color="1D3A5E"/>
+              <w:bottom w:val="single" w:sz="6" w:space="0" w:color="1D3A5E"/>
+              <w:right w:val="single" w:sz="6" w:space="0" w:color="1D3A5E"/>
+              <w:insideH w:val="single" w:sz="6" w:space="0" w:color="1D3A5E"/>
+              <w:insideV w:val="single" w:sz="6" w:space="0" w:color="1D3A5E"/>
+            </w:tcBorders>
           </w:tcPr>
           <w:p>
+            <w:pPr>
+              <w:spacing w:after="40"/>
+            </w:pPr>
             <w:r>
+              <w:rPr>
+                <w:rFonts w:ascii="Arial" w:hAnsi="Arial"/>
+                <w:b/>
+                <w:color w:val="FFFFFF"/>
+                <w:sz w:val="18"/>
+              </w:rPr>
               <w:t>Dose</w:t>
             </w:r>
           </w:p>
@@ -1270,9 +3658,28 @@
         <w:tc>
           <w:tcPr>
             <w:tcW w:type="dxa" w:w="1440"/>
+            <w:vAlign w:val="center"/>
+            <w:shd w:fill="1D3A5E"/>
+            <w:tcBorders>
+              <w:top w:val="single" w:sz="6" w:space="0" w:color="1D3A5E"/>
+              <w:left w:val="single" w:sz="6" w:space="0" w:color="1D3A5E"/>
+              <w:bottom w:val="single" w:sz="6" w:space="0" w:color="1D3A5E"/>
+              <w:right w:val="single" w:sz="6" w:space="0" w:color="1D3A5E"/>
+              <w:insideH w:val="single" w:sz="6" w:space="0" w:color="1D3A5E"/>
+              <w:insideV w:val="single" w:sz="6" w:space="0" w:color="1D3A5E"/>
+            </w:tcBorders>
           </w:tcPr>
           <w:p>
+            <w:pPr>
+              <w:spacing w:after="40"/>
+            </w:pPr>
             <w:r>
+              <w:rPr>
+                <w:rFonts w:ascii="Arial" w:hAnsi="Arial"/>
+                <w:b/>
+                <w:color w:val="FFFFFF"/>
+                <w:sz w:val="18"/>
+              </w:rPr>
               <w:t>Max apps</w:t>
             </w:r>
           </w:p>
@@ -1280,9 +3687,28 @@
         <w:tc>
           <w:tcPr>
             <w:tcW w:type="dxa" w:w="1440"/>
+            <w:vAlign w:val="center"/>
+            <w:shd w:fill="1D3A5E"/>
+            <w:tcBorders>
+              <w:top w:val="single" w:sz="6" w:space="0" w:color="1D3A5E"/>
+              <w:left w:val="single" w:sz="6" w:space="0" w:color="1D3A5E"/>
+              <w:bottom w:val="single" w:sz="6" w:space="0" w:color="1D3A5E"/>
+              <w:right w:val="single" w:sz="6" w:space="0" w:color="1D3A5E"/>
+              <w:insideH w:val="single" w:sz="6" w:space="0" w:color="1D3A5E"/>
+              <w:insideV w:val="single" w:sz="6" w:space="0" w:color="1D3A5E"/>
+            </w:tcBorders>
           </w:tcPr>
           <w:p>
+            <w:pPr>
+              <w:spacing w:after="40"/>
+            </w:pPr>
             <w:r>
+              <w:rPr>
+                <w:rFonts w:ascii="Arial" w:hAnsi="Arial"/>
+                <w:b/>
+                <w:color w:val="FFFFFF"/>
+                <w:sz w:val="18"/>
+              </w:rPr>
               <w:t>Efficacy</w:t>
             </w:r>
           </w:p>
@@ -1290,9 +3716,28 @@
         <w:tc>
           <w:tcPr>
             <w:tcW w:type="dxa" w:w="1440"/>
+            <w:vAlign w:val="center"/>
+            <w:shd w:fill="1D3A5E"/>
+            <w:tcBorders>
+              <w:top w:val="single" w:sz="6" w:space="0" w:color="1D3A5E"/>
+              <w:left w:val="single" w:sz="6" w:space="0" w:color="1D3A5E"/>
+              <w:bottom w:val="single" w:sz="6" w:space="0" w:color="1D3A5E"/>
+              <w:right w:val="single" w:sz="6" w:space="0" w:color="1D3A5E"/>
+              <w:insideH w:val="single" w:sz="6" w:space="0" w:color="1D3A5E"/>
+              <w:insideV w:val="single" w:sz="6" w:space="0" w:color="1D3A5E"/>
+            </w:tcBorders>
           </w:tcPr>
           <w:p>
+            <w:pPr>
+              <w:spacing w:after="40"/>
+            </w:pPr>
             <w:r>
+              <w:rPr>
+                <w:rFonts w:ascii="Arial" w:hAnsi="Arial"/>
+                <w:b/>
+                <w:color w:val="FFFFFF"/>
+                <w:sz w:val="18"/>
+              </w:rPr>
               <w:t>PHI days</w:t>
             </w:r>
           </w:p>
@@ -1302,9 +3747,27 @@
         <w:tc>
           <w:tcPr>
             <w:tcW w:type="dxa" w:w="1440"/>
+            <w:vAlign w:val="center"/>
+            <w:tcBorders>
+              <w:top w:val="single" w:sz="6" w:space="0" w:color="D9DEE7"/>
+              <w:left w:val="single" w:sz="6" w:space="0" w:color="D9DEE7"/>
+              <w:bottom w:val="single" w:sz="6" w:space="0" w:color="D9DEE7"/>
+              <w:right w:val="single" w:sz="6" w:space="0" w:color="D9DEE7"/>
+              <w:insideH w:val="single" w:sz="6" w:space="0" w:color="D9DEE7"/>
+              <w:insideV w:val="single" w:sz="6" w:space="0" w:color="D9DEE7"/>
+            </w:tcBorders>
           </w:tcPr>
           <w:p>
+            <w:pPr>
+              <w:spacing w:after="40"/>
+            </w:pPr>
             <w:r>
+              <w:rPr>
+                <w:rFonts w:ascii="Arial" w:hAnsi="Arial"/>
+                <w:b w:val="0"/>
+                <w:color w:val="1D3A5E"/>
+                <w:sz w:val="18"/>
+              </w:rPr>
               <w:t xml:space="preserve">Tomato (greenhouse)</w:t>
             </w:r>
           </w:p>
@@ -1312,9 +3775,27 @@
         <w:tc>
           <w:tcPr>
             <w:tcW w:type="dxa" w:w="1440"/>
+            <w:vAlign w:val="center"/>
+            <w:tcBorders>
+              <w:top w:val="single" w:sz="6" w:space="0" w:color="D9DEE7"/>
+              <w:left w:val="single" w:sz="6" w:space="0" w:color="D9DEE7"/>
+              <w:bottom w:val="single" w:sz="6" w:space="0" w:color="D9DEE7"/>
+              <w:right w:val="single" w:sz="6" w:space="0" w:color="D9DEE7"/>
+              <w:insideH w:val="single" w:sz="6" w:space="0" w:color="D9DEE7"/>
+              <w:insideV w:val="single" w:sz="6" w:space="0" w:color="D9DEE7"/>
+            </w:tcBorders>
           </w:tcPr>
           <w:p>
+            <w:pPr>
+              <w:spacing w:after="40"/>
+            </w:pPr>
             <w:r>
+              <w:rPr>
+                <w:rFonts w:ascii="Arial" w:hAnsi="Arial"/>
+                <w:b w:val="0"/>
+                <w:color w:val="1D3A5E"/>
+                <w:sz w:val="18"/>
+              </w:rPr>
               <w:t xml:space="preserve">Botrytis cinerea</w:t>
             </w:r>
           </w:p>
@@ -1322,9 +3803,27 @@
         <w:tc>
           <w:tcPr>
             <w:tcW w:type="dxa" w:w="1440"/>
+            <w:vAlign w:val="center"/>
+            <w:tcBorders>
+              <w:top w:val="single" w:sz="6" w:space="0" w:color="D9DEE7"/>
+              <w:left w:val="single" w:sz="6" w:space="0" w:color="D9DEE7"/>
+              <w:bottom w:val="single" w:sz="6" w:space="0" w:color="D9DEE7"/>
+              <w:right w:val="single" w:sz="6" w:space="0" w:color="D9DEE7"/>
+              <w:insideH w:val="single" w:sz="6" w:space="0" w:color="D9DEE7"/>
+              <w:insideV w:val="single" w:sz="6" w:space="0" w:color="D9DEE7"/>
+            </w:tcBorders>
           </w:tcPr>
           <w:p>
+            <w:pPr>
+              <w:spacing w:after="40"/>
+            </w:pPr>
             <w:r>
+              <w:rPr>
+                <w:rFonts w:ascii="Arial" w:hAnsi="Arial"/>
+                <w:b w:val="0"/>
+                <w:color w:val="1D3A5E"/>
+                <w:sz w:val="18"/>
+              </w:rPr>
               <w:t xml:space="preserve">61-89</w:t>
             </w:r>
           </w:p>
@@ -1332,9 +3831,27 @@
         <w:tc>
           <w:tcPr>
             <w:tcW w:type="dxa" w:w="1440"/>
+            <w:vAlign w:val="center"/>
+            <w:tcBorders>
+              <w:top w:val="single" w:sz="6" w:space="0" w:color="D9DEE7"/>
+              <w:left w:val="single" w:sz="6" w:space="0" w:color="D9DEE7"/>
+              <w:bottom w:val="single" w:sz="6" w:space="0" w:color="D9DEE7"/>
+              <w:right w:val="single" w:sz="6" w:space="0" w:color="D9DEE7"/>
+              <w:insideH w:val="single" w:sz="6" w:space="0" w:color="D9DEE7"/>
+              <w:insideV w:val="single" w:sz="6" w:space="0" w:color="D9DEE7"/>
+            </w:tcBorders>
           </w:tcPr>
           <w:p>
+            <w:pPr>
+              <w:spacing w:after="40"/>
+            </w:pPr>
             <w:r>
+              <w:rPr>
+                <w:rFonts w:ascii="Arial" w:hAnsi="Arial"/>
+                <w:b w:val="0"/>
+                <w:color w:val="1D3A5E"/>
+                <w:sz w:val="18"/>
+              </w:rPr>
               <w:t xml:space="preserve">0.6 kg/ha</w:t>
             </w:r>
           </w:p>
@@ -1342,9 +3859,27 @@
         <w:tc>
           <w:tcPr>
             <w:tcW w:type="dxa" w:w="1440"/>
+            <w:vAlign w:val="center"/>
+            <w:tcBorders>
+              <w:top w:val="single" w:sz="6" w:space="0" w:color="D9DEE7"/>
+              <w:left w:val="single" w:sz="6" w:space="0" w:color="D9DEE7"/>
+              <w:bottom w:val="single" w:sz="6" w:space="0" w:color="D9DEE7"/>
+              <w:right w:val="single" w:sz="6" w:space="0" w:color="D9DEE7"/>
+              <w:insideH w:val="single" w:sz="6" w:space="0" w:color="D9DEE7"/>
+              <w:insideV w:val="single" w:sz="6" w:space="0" w:color="D9DEE7"/>
+            </w:tcBorders>
           </w:tcPr>
           <w:p>
+            <w:pPr>
+              <w:spacing w:after="40"/>
+            </w:pPr>
             <w:r>
+              <w:rPr>
+                <w:rFonts w:ascii="Arial" w:hAnsi="Arial"/>
+                <w:b w:val="0"/>
+                <w:color w:val="1D3A5E"/>
+                <w:sz w:val="18"/>
+              </w:rPr>
               <w:t xml:space="preserve">3</w:t>
             </w:r>
           </w:p>
@@ -1352,9 +3887,27 @@
         <w:tc>
           <w:tcPr>
             <w:tcW w:type="dxa" w:w="1440"/>
+            <w:vAlign w:val="center"/>
+            <w:tcBorders>
+              <w:top w:val="single" w:sz="6" w:space="0" w:color="D9DEE7"/>
+              <w:left w:val="single" w:sz="6" w:space="0" w:color="D9DEE7"/>
+              <w:bottom w:val="single" w:sz="6" w:space="0" w:color="D9DEE7"/>
+              <w:right w:val="single" w:sz="6" w:space="0" w:color="D9DEE7"/>
+              <w:insideH w:val="single" w:sz="6" w:space="0" w:color="D9DEE7"/>
+              <w:insideV w:val="single" w:sz="6" w:space="0" w:color="D9DEE7"/>
+            </w:tcBorders>
           </w:tcPr>
           <w:p>
+            <w:pPr>
+              <w:spacing w:after="40"/>
+            </w:pPr>
             <w:r>
+              <w:rPr>
+                <w:rFonts w:ascii="Arial" w:hAnsi="Arial"/>
+                <w:b w:val="0"/>
+                <w:color w:val="1D3A5E"/>
+                <w:sz w:val="18"/>
+              </w:rPr>
               <w:t xml:space="preserve">91%</w:t>
             </w:r>
           </w:p>
@@ -1362,9 +3915,27 @@
         <w:tc>
           <w:tcPr>
             <w:tcW w:type="dxa" w:w="1440"/>
+            <w:vAlign w:val="center"/>
+            <w:tcBorders>
+              <w:top w:val="single" w:sz="6" w:space="0" w:color="D9DEE7"/>
+              <w:left w:val="single" w:sz="6" w:space="0" w:color="D9DEE7"/>
+              <w:bottom w:val="single" w:sz="6" w:space="0" w:color="D9DEE7"/>
+              <w:right w:val="single" w:sz="6" w:space="0" w:color="D9DEE7"/>
+              <w:insideH w:val="single" w:sz="6" w:space="0" w:color="D9DEE7"/>
+              <w:insideV w:val="single" w:sz="6" w:space="0" w:color="D9DEE7"/>
+            </w:tcBorders>
           </w:tcPr>
           <w:p>
+            <w:pPr>
+              <w:spacing w:after="40"/>
+            </w:pPr>
             <w:r>
+              <w:rPr>
+                <w:rFonts w:ascii="Arial" w:hAnsi="Arial"/>
+                <w:b w:val="0"/>
+                <w:color w:val="1D3A5E"/>
+                <w:sz w:val="18"/>
+              </w:rPr>
               <w:t xml:space="preserve">7</w:t>
             </w:r>
           </w:p>
@@ -1374,9 +3945,27 @@
         <w:tc>
           <w:tcPr>
             <w:tcW w:type="dxa" w:w="1440"/>
+            <w:vAlign w:val="center"/>
+            <w:tcBorders>
+              <w:top w:val="single" w:sz="6" w:space="0" w:color="D9DEE7"/>
+              <w:left w:val="single" w:sz="6" w:space="0" w:color="D9DEE7"/>
+              <w:bottom w:val="single" w:sz="6" w:space="0" w:color="D9DEE7"/>
+              <w:right w:val="single" w:sz="6" w:space="0" w:color="D9DEE7"/>
+              <w:insideH w:val="single" w:sz="6" w:space="0" w:color="D9DEE7"/>
+              <w:insideV w:val="single" w:sz="6" w:space="0" w:color="D9DEE7"/>
+            </w:tcBorders>
           </w:tcPr>
           <w:p>
+            <w:pPr>
+              <w:spacing w:after="40"/>
+            </w:pPr>
             <w:r>
+              <w:rPr>
+                <w:rFonts w:ascii="Arial" w:hAnsi="Arial"/>
+                <w:b w:val="0"/>
+                <w:color w:val="1D3A5E"/>
+                <w:sz w:val="18"/>
+              </w:rPr>
               <w:t xml:space="preserve">Grapevine</w:t>
             </w:r>
           </w:p>
@@ -1384,9 +3973,27 @@
         <w:tc>
           <w:tcPr>
             <w:tcW w:type="dxa" w:w="1440"/>
+            <w:vAlign w:val="center"/>
+            <w:tcBorders>
+              <w:top w:val="single" w:sz="6" w:space="0" w:color="D9DEE7"/>
+              <w:left w:val="single" w:sz="6" w:space="0" w:color="D9DEE7"/>
+              <w:bottom w:val="single" w:sz="6" w:space="0" w:color="D9DEE7"/>
+              <w:right w:val="single" w:sz="6" w:space="0" w:color="D9DEE7"/>
+              <w:insideH w:val="single" w:sz="6" w:space="0" w:color="D9DEE7"/>
+              <w:insideV w:val="single" w:sz="6" w:space="0" w:color="D9DEE7"/>
+            </w:tcBorders>
           </w:tcPr>
           <w:p>
+            <w:pPr>
+              <w:spacing w:after="40"/>
+            </w:pPr>
             <w:r>
+              <w:rPr>
+                <w:rFonts w:ascii="Arial" w:hAnsi="Arial"/>
+                <w:b w:val="0"/>
+                <w:color w:val="1D3A5E"/>
+                <w:sz w:val="18"/>
+              </w:rPr>
               <w:t xml:space="preserve">Erysiphe necator (powdery mildew)</w:t>
             </w:r>
           </w:p>
@@ -1394,9 +4001,27 @@
         <w:tc>
           <w:tcPr>
             <w:tcW w:type="dxa" w:w="1440"/>
+            <w:vAlign w:val="center"/>
+            <w:tcBorders>
+              <w:top w:val="single" w:sz="6" w:space="0" w:color="D9DEE7"/>
+              <w:left w:val="single" w:sz="6" w:space="0" w:color="D9DEE7"/>
+              <w:bottom w:val="single" w:sz="6" w:space="0" w:color="D9DEE7"/>
+              <w:right w:val="single" w:sz="6" w:space="0" w:color="D9DEE7"/>
+              <w:insideH w:val="single" w:sz="6" w:space="0" w:color="D9DEE7"/>
+              <w:insideV w:val="single" w:sz="6" w:space="0" w:color="D9DEE7"/>
+            </w:tcBorders>
           </w:tcPr>
           <w:p>
+            <w:pPr>
+              <w:spacing w:after="40"/>
+            </w:pPr>
             <w:r>
+              <w:rPr>
+                <w:rFonts w:ascii="Arial" w:hAnsi="Arial"/>
+                <w:b w:val="0"/>
+                <w:color w:val="1D3A5E"/>
+                <w:sz w:val="18"/>
+              </w:rPr>
               <w:t xml:space="preserve">53-81</w:t>
             </w:r>
           </w:p>
@@ -1404,9 +4029,27 @@
         <w:tc>
           <w:tcPr>
             <w:tcW w:type="dxa" w:w="1440"/>
+            <w:vAlign w:val="center"/>
+            <w:tcBorders>
+              <w:top w:val="single" w:sz="6" w:space="0" w:color="D9DEE7"/>
+              <w:left w:val="single" w:sz="6" w:space="0" w:color="D9DEE7"/>
+              <w:bottom w:val="single" w:sz="6" w:space="0" w:color="D9DEE7"/>
+              <w:right w:val="single" w:sz="6" w:space="0" w:color="D9DEE7"/>
+              <w:insideH w:val="single" w:sz="6" w:space="0" w:color="D9DEE7"/>
+              <w:insideV w:val="single" w:sz="6" w:space="0" w:color="D9DEE7"/>
+            </w:tcBorders>
           </w:tcPr>
           <w:p>
+            <w:pPr>
+              <w:spacing w:after="40"/>
+            </w:pPr>
             <w:r>
+              <w:rPr>
+                <w:rFonts w:ascii="Arial" w:hAnsi="Arial"/>
+                <w:b w:val="0"/>
+                <w:color w:val="1D3A5E"/>
+                <w:sz w:val="18"/>
+              </w:rPr>
               <w:t xml:space="preserve">0.4 kg/ha</w:t>
             </w:r>
           </w:p>
@@ -1414,9 +4057,27 @@
         <w:tc>
           <w:tcPr>
             <w:tcW w:type="dxa" w:w="1440"/>
+            <w:vAlign w:val="center"/>
+            <w:tcBorders>
+              <w:top w:val="single" w:sz="6" w:space="0" w:color="D9DEE7"/>
+              <w:left w:val="single" w:sz="6" w:space="0" w:color="D9DEE7"/>
+              <w:bottom w:val="single" w:sz="6" w:space="0" w:color="D9DEE7"/>
+              <w:right w:val="single" w:sz="6" w:space="0" w:color="D9DEE7"/>
+              <w:insideH w:val="single" w:sz="6" w:space="0" w:color="D9DEE7"/>
+              <w:insideV w:val="single" w:sz="6" w:space="0" w:color="D9DEE7"/>
+            </w:tcBorders>
           </w:tcPr>
           <w:p>
+            <w:pPr>
+              <w:spacing w:after="40"/>
+            </w:pPr>
             <w:r>
+              <w:rPr>
+                <w:rFonts w:ascii="Arial" w:hAnsi="Arial"/>
+                <w:b w:val="0"/>
+                <w:color w:val="1D3A5E"/>
+                <w:sz w:val="18"/>
+              </w:rPr>
               <w:t xml:space="preserve">4</w:t>
             </w:r>
           </w:p>
@@ -1424,9 +4085,27 @@
         <w:tc>
           <w:tcPr>
             <w:tcW w:type="dxa" w:w="1440"/>
+            <w:vAlign w:val="center"/>
+            <w:tcBorders>
+              <w:top w:val="single" w:sz="6" w:space="0" w:color="D9DEE7"/>
+              <w:left w:val="single" w:sz="6" w:space="0" w:color="D9DEE7"/>
+              <w:bottom w:val="single" w:sz="6" w:space="0" w:color="D9DEE7"/>
+              <w:right w:val="single" w:sz="6" w:space="0" w:color="D9DEE7"/>
+              <w:insideH w:val="single" w:sz="6" w:space="0" w:color="D9DEE7"/>
+              <w:insideV w:val="single" w:sz="6" w:space="0" w:color="D9DEE7"/>
+            </w:tcBorders>
           </w:tcPr>
           <w:p>
+            <w:pPr>
+              <w:spacing w:after="40"/>
+            </w:pPr>
             <w:r>
+              <w:rPr>
+                <w:rFonts w:ascii="Arial" w:hAnsi="Arial"/>
+                <w:b w:val="0"/>
+                <w:color w:val="1D3A5E"/>
+                <w:sz w:val="18"/>
+              </w:rPr>
               <w:t xml:space="preserve">87%</w:t>
             </w:r>
           </w:p>
@@ -1434,9 +4113,27 @@
         <w:tc>
           <w:tcPr>
             <w:tcW w:type="dxa" w:w="1440"/>
+            <w:vAlign w:val="center"/>
+            <w:tcBorders>
+              <w:top w:val="single" w:sz="6" w:space="0" w:color="D9DEE7"/>
+              <w:left w:val="single" w:sz="6" w:space="0" w:color="D9DEE7"/>
+              <w:bottom w:val="single" w:sz="6" w:space="0" w:color="D9DEE7"/>
+              <w:right w:val="single" w:sz="6" w:space="0" w:color="D9DEE7"/>
+              <w:insideH w:val="single" w:sz="6" w:space="0" w:color="D9DEE7"/>
+              <w:insideV w:val="single" w:sz="6" w:space="0" w:color="D9DEE7"/>
+            </w:tcBorders>
           </w:tcPr>
           <w:p>
+            <w:pPr>
+              <w:spacing w:after="40"/>
+            </w:pPr>
             <w:r>
+              <w:rPr>
+                <w:rFonts w:ascii="Arial" w:hAnsi="Arial"/>
+                <w:b w:val="0"/>
+                <w:color w:val="1D3A5E"/>
+                <w:sz w:val="18"/>
+              </w:rPr>
               <w:t xml:space="preserve">21</w:t>
             </w:r>
           </w:p>
@@ -1465,9 +4162,28 @@
         <w:tc>
           <w:tcPr>
             <w:tcW w:type="dxa" w:w="5040"/>
+            <w:vAlign w:val="center"/>
+            <w:shd w:fill="F07D00"/>
+            <w:tcBorders>
+              <w:top w:val="single" w:sz="6" w:space="0" w:color="F07D00"/>
+              <w:left w:val="single" w:sz="6" w:space="0" w:color="F07D00"/>
+              <w:bottom w:val="single" w:sz="6" w:space="0" w:color="F07D00"/>
+              <w:right w:val="single" w:sz="6" w:space="0" w:color="F07D00"/>
+              <w:insideH w:val="single" w:sz="6" w:space="0" w:color="F07D00"/>
+              <w:insideV w:val="single" w:sz="6" w:space="0" w:color="F07D00"/>
+            </w:tcBorders>
           </w:tcPr>
           <w:p>
+            <w:pPr>
+              <w:spacing w:after="40"/>
+            </w:pPr>
             <w:r>
+              <w:rPr>
+                <w:rFonts w:ascii="Arial" w:hAnsi="Arial"/>
+                <w:b/>
+                <w:color w:val="FFFFFF"/>
+                <w:sz w:val="18"/>
+              </w:rPr>
               <w:t>Component</w:t>
             </w:r>
           </w:p>
@@ -1475,9 +4191,28 @@
         <w:tc>
           <w:tcPr>
             <w:tcW w:type="dxa" w:w="5040"/>
+            <w:vAlign w:val="center"/>
+            <w:shd w:fill="F07D00"/>
+            <w:tcBorders>
+              <w:top w:val="single" w:sz="6" w:space="0" w:color="F07D00"/>
+              <w:left w:val="single" w:sz="6" w:space="0" w:color="F07D00"/>
+              <w:bottom w:val="single" w:sz="6" w:space="0" w:color="F07D00"/>
+              <w:right w:val="single" w:sz="6" w:space="0" w:color="F07D00"/>
+              <w:insideH w:val="single" w:sz="6" w:space="0" w:color="F07D00"/>
+              <w:insideV w:val="single" w:sz="6" w:space="0" w:color="F07D00"/>
+            </w:tcBorders>
           </w:tcPr>
           <w:p>
+            <w:pPr>
+              <w:spacing w:after="40"/>
+            </w:pPr>
             <w:r>
+              <w:rPr>
+                <w:rFonts w:ascii="Arial" w:hAnsi="Arial"/>
+                <w:b/>
+                <w:color w:val="FFFFFF"/>
+                <w:sz w:val="18"/>
+              </w:rPr>
               <w:t>Score</w:t>
             </w:r>
           </w:p>
@@ -1487,9 +4222,27 @@
         <w:tc>
           <w:tcPr>
             <w:tcW w:type="dxa" w:w="5040"/>
+            <w:vAlign w:val="center"/>
+            <w:tcBorders>
+              <w:top w:val="single" w:sz="6" w:space="0" w:color="D9DEE7"/>
+              <w:left w:val="single" w:sz="6" w:space="0" w:color="D9DEE7"/>
+              <w:bottom w:val="single" w:sz="6" w:space="0" w:color="D9DEE7"/>
+              <w:right w:val="single" w:sz="6" w:space="0" w:color="D9DEE7"/>
+              <w:insideH w:val="single" w:sz="6" w:space="0" w:color="D9DEE7"/>
+              <w:insideV w:val="single" w:sz="6" w:space="0" w:color="D9DEE7"/>
+            </w:tcBorders>
           </w:tcPr>
           <w:p>
+            <w:pPr>
+              <w:spacing w:after="40"/>
+            </w:pPr>
             <w:r>
+              <w:rPr>
+                <w:rFonts w:ascii="Arial" w:hAnsi="Arial"/>
+                <w:b w:val="0"/>
+                <w:color w:val="1D3A5E"/>
+                <w:sz w:val="18"/>
+              </w:rPr>
               <w:t xml:space="preserve">Human Health</w:t>
             </w:r>
           </w:p>
@@ -1497,9 +4250,27 @@
         <w:tc>
           <w:tcPr>
             <w:tcW w:type="dxa" w:w="5040"/>
+            <w:vAlign w:val="center"/>
+            <w:tcBorders>
+              <w:top w:val="single" w:sz="6" w:space="0" w:color="D9DEE7"/>
+              <w:left w:val="single" w:sz="6" w:space="0" w:color="D9DEE7"/>
+              <w:bottom w:val="single" w:sz="6" w:space="0" w:color="D9DEE7"/>
+              <w:right w:val="single" w:sz="6" w:space="0" w:color="D9DEE7"/>
+              <w:insideH w:val="single" w:sz="6" w:space="0" w:color="D9DEE7"/>
+              <w:insideV w:val="single" w:sz="6" w:space="0" w:color="D9DEE7"/>
+            </w:tcBorders>
           </w:tcPr>
           <w:p>
+            <w:pPr>
+              <w:spacing w:after="40"/>
+            </w:pPr>
             <w:r>
+              <w:rPr>
+                <w:rFonts w:ascii="Arial" w:hAnsi="Arial"/>
+                <w:b w:val="0"/>
+                <w:color w:val="1D3A5E"/>
+                <w:sz w:val="18"/>
+              </w:rPr>
               <w:t xml:space="preserve">38</w:t>
             </w:r>
           </w:p>
@@ -1509,9 +4280,27 @@
         <w:tc>
           <w:tcPr>
             <w:tcW w:type="dxa" w:w="5040"/>
+            <w:vAlign w:val="center"/>
+            <w:tcBorders>
+              <w:top w:val="single" w:sz="6" w:space="0" w:color="D9DEE7"/>
+              <w:left w:val="single" w:sz="6" w:space="0" w:color="D9DEE7"/>
+              <w:bottom w:val="single" w:sz="6" w:space="0" w:color="D9DEE7"/>
+              <w:right w:val="single" w:sz="6" w:space="0" w:color="D9DEE7"/>
+              <w:insideH w:val="single" w:sz="6" w:space="0" w:color="D9DEE7"/>
+              <w:insideV w:val="single" w:sz="6" w:space="0" w:color="D9DEE7"/>
+            </w:tcBorders>
           </w:tcPr>
           <w:p>
+            <w:pPr>
+              <w:spacing w:after="40"/>
+            </w:pPr>
             <w:r>
+              <w:rPr>
+                <w:rFonts w:ascii="Arial" w:hAnsi="Arial"/>
+                <w:b w:val="0"/>
+                <w:color w:val="1D3A5E"/>
+                <w:sz w:val="18"/>
+              </w:rPr>
               <w:t xml:space="preserve">Ecotoxicology</w:t>
             </w:r>
           </w:p>
@@ -1519,9 +4308,27 @@
         <w:tc>
           <w:tcPr>
             <w:tcW w:type="dxa" w:w="5040"/>
+            <w:vAlign w:val="center"/>
+            <w:tcBorders>
+              <w:top w:val="single" w:sz="6" w:space="0" w:color="D9DEE7"/>
+              <w:left w:val="single" w:sz="6" w:space="0" w:color="D9DEE7"/>
+              <w:bottom w:val="single" w:sz="6" w:space="0" w:color="D9DEE7"/>
+              <w:right w:val="single" w:sz="6" w:space="0" w:color="D9DEE7"/>
+              <w:insideH w:val="single" w:sz="6" w:space="0" w:color="D9DEE7"/>
+              <w:insideV w:val="single" w:sz="6" w:space="0" w:color="D9DEE7"/>
+            </w:tcBorders>
           </w:tcPr>
           <w:p>
+            <w:pPr>
+              <w:spacing w:after="40"/>
+            </w:pPr>
             <w:r>
+              <w:rPr>
+                <w:rFonts w:ascii="Arial" w:hAnsi="Arial"/>
+                <w:b w:val="0"/>
+                <w:color w:val="1D3A5E"/>
+                <w:sz w:val="18"/>
+              </w:rPr>
               <w:t xml:space="preserve">51</w:t>
             </w:r>
           </w:p>
@@ -1531,9 +4338,27 @@
         <w:tc>
           <w:tcPr>
             <w:tcW w:type="dxa" w:w="5040"/>
+            <w:vAlign w:val="center"/>
+            <w:tcBorders>
+              <w:top w:val="single" w:sz="6" w:space="0" w:color="D9DEE7"/>
+              <w:left w:val="single" w:sz="6" w:space="0" w:color="D9DEE7"/>
+              <w:bottom w:val="single" w:sz="6" w:space="0" w:color="D9DEE7"/>
+              <w:right w:val="single" w:sz="6" w:space="0" w:color="D9DEE7"/>
+              <w:insideH w:val="single" w:sz="6" w:space="0" w:color="D9DEE7"/>
+              <w:insideV w:val="single" w:sz="6" w:space="0" w:color="D9DEE7"/>
+            </w:tcBorders>
           </w:tcPr>
           <w:p>
+            <w:pPr>
+              <w:spacing w:after="40"/>
+            </w:pPr>
             <w:r>
+              <w:rPr>
+                <w:rFonts w:ascii="Arial" w:hAnsi="Arial"/>
+                <w:b w:val="0"/>
+                <w:color w:val="1D3A5E"/>
+                <w:sz w:val="18"/>
+              </w:rPr>
               <w:t xml:space="preserve">Environmental Fate</w:t>
             </w:r>
           </w:p>
@@ -1541,9 +4366,27 @@
         <w:tc>
           <w:tcPr>
             <w:tcW w:type="dxa" w:w="5040"/>
+            <w:vAlign w:val="center"/>
+            <w:tcBorders>
+              <w:top w:val="single" w:sz="6" w:space="0" w:color="D9DEE7"/>
+              <w:left w:val="single" w:sz="6" w:space="0" w:color="D9DEE7"/>
+              <w:bottom w:val="single" w:sz="6" w:space="0" w:color="D9DEE7"/>
+              <w:right w:val="single" w:sz="6" w:space="0" w:color="D9DEE7"/>
+              <w:insideH w:val="single" w:sz="6" w:space="0" w:color="D9DEE7"/>
+              <w:insideV w:val="single" w:sz="6" w:space="0" w:color="D9DEE7"/>
+            </w:tcBorders>
           </w:tcPr>
           <w:p>
+            <w:pPr>
+              <w:spacing w:after="40"/>
+            </w:pPr>
             <w:r>
+              <w:rPr>
+                <w:rFonts w:ascii="Arial" w:hAnsi="Arial"/>
+                <w:b w:val="0"/>
+                <w:color w:val="1D3A5E"/>
+                <w:sz w:val="18"/>
+              </w:rPr>
               <w:t xml:space="preserve">36</w:t>
             </w:r>
           </w:p>
@@ -1553,9 +4396,27 @@
         <w:tc>
           <w:tcPr>
             <w:tcW w:type="dxa" w:w="5040"/>
+            <w:vAlign w:val="center"/>
+            <w:tcBorders>
+              <w:top w:val="single" w:sz="6" w:space="0" w:color="D9DEE7"/>
+              <w:left w:val="single" w:sz="6" w:space="0" w:color="D9DEE7"/>
+              <w:bottom w:val="single" w:sz="6" w:space="0" w:color="D9DEE7"/>
+              <w:right w:val="single" w:sz="6" w:space="0" w:color="D9DEE7"/>
+              <w:insideH w:val="single" w:sz="6" w:space="0" w:color="D9DEE7"/>
+              <w:insideV w:val="single" w:sz="6" w:space="0" w:color="D9DEE7"/>
+            </w:tcBorders>
           </w:tcPr>
           <w:p>
+            <w:pPr>
+              <w:spacing w:after="40"/>
+            </w:pPr>
             <w:r>
+              <w:rPr>
+                <w:rFonts w:ascii="Arial" w:hAnsi="Arial"/>
+                <w:b w:val="0"/>
+                <w:color w:val="1D3A5E"/>
+                <w:sz w:val="18"/>
+              </w:rPr>
               <w:t xml:space="preserve">Residue In Food</w:t>
             </w:r>
           </w:p>
@@ -1563,9 +4424,27 @@
         <w:tc>
           <w:tcPr>
             <w:tcW w:type="dxa" w:w="5040"/>
+            <w:vAlign w:val="center"/>
+            <w:tcBorders>
+              <w:top w:val="single" w:sz="6" w:space="0" w:color="D9DEE7"/>
+              <w:left w:val="single" w:sz="6" w:space="0" w:color="D9DEE7"/>
+              <w:bottom w:val="single" w:sz="6" w:space="0" w:color="D9DEE7"/>
+              <w:right w:val="single" w:sz="6" w:space="0" w:color="D9DEE7"/>
+              <w:insideH w:val="single" w:sz="6" w:space="0" w:color="D9DEE7"/>
+              <w:insideV w:val="single" w:sz="6" w:space="0" w:color="D9DEE7"/>
+            </w:tcBorders>
           </w:tcPr>
           <w:p>
+            <w:pPr>
+              <w:spacing w:after="40"/>
+            </w:pPr>
             <w:r>
+              <w:rPr>
+                <w:rFonts w:ascii="Arial" w:hAnsi="Arial"/>
+                <w:b w:val="0"/>
+                <w:color w:val="1D3A5E"/>
+                <w:sz w:val="18"/>
+              </w:rPr>
               <w:t xml:space="preserve">44</w:t>
             </w:r>
           </w:p>
@@ -1594,9 +4473,28 @@
         <w:tc>
           <w:tcPr>
             <w:tcW w:type="dxa" w:w="5040"/>
+            <w:vAlign w:val="center"/>
+            <w:shd w:fill="F07D00"/>
+            <w:tcBorders>
+              <w:top w:val="single" w:sz="6" w:space="0" w:color="F07D00"/>
+              <w:left w:val="single" w:sz="6" w:space="0" w:color="F07D00"/>
+              <w:bottom w:val="single" w:sz="6" w:space="0" w:color="F07D00"/>
+              <w:right w:val="single" w:sz="6" w:space="0" w:color="F07D00"/>
+              <w:insideH w:val="single" w:sz="6" w:space="0" w:color="F07D00"/>
+              <w:insideV w:val="single" w:sz="6" w:space="0" w:color="F07D00"/>
+            </w:tcBorders>
           </w:tcPr>
           <w:p>
+            <w:pPr>
+              <w:spacing w:after="40"/>
+            </w:pPr>
             <w:r>
+              <w:rPr>
+                <w:rFonts w:ascii="Arial" w:hAnsi="Arial"/>
+                <w:b/>
+                <w:color w:val="FFFFFF"/>
+                <w:sz w:val="18"/>
+              </w:rPr>
               <w:t>Indicator</w:t>
             </w:r>
           </w:p>
@@ -1604,9 +4502,28 @@
         <w:tc>
           <w:tcPr>
             <w:tcW w:type="dxa" w:w="5040"/>
+            <w:vAlign w:val="center"/>
+            <w:shd w:fill="F07D00"/>
+            <w:tcBorders>
+              <w:top w:val="single" w:sz="6" w:space="0" w:color="F07D00"/>
+              <w:left w:val="single" w:sz="6" w:space="0" w:color="F07D00"/>
+              <w:bottom w:val="single" w:sz="6" w:space="0" w:color="F07D00"/>
+              <w:right w:val="single" w:sz="6" w:space="0" w:color="F07D00"/>
+              <w:insideH w:val="single" w:sz="6" w:space="0" w:color="F07D00"/>
+              <w:insideV w:val="single" w:sz="6" w:space="0" w:color="F07D00"/>
+            </w:tcBorders>
           </w:tcPr>
           <w:p>
+            <w:pPr>
+              <w:spacing w:after="40"/>
+            </w:pPr>
             <w:r>
+              <w:rPr>
+                <w:rFonts w:ascii="Arial" w:hAnsi="Arial"/>
+                <w:b/>
+                <w:color w:val="FFFFFF"/>
+                <w:sz w:val="18"/>
+              </w:rPr>
               <w:t>Value</w:t>
             </w:r>
           </w:p>
@@ -1616,9 +4533,27 @@
         <w:tc>
           <w:tcPr>
             <w:tcW w:type="dxa" w:w="5040"/>
+            <w:vAlign w:val="center"/>
+            <w:tcBorders>
+              <w:top w:val="single" w:sz="6" w:space="0" w:color="D9DEE7"/>
+              <w:left w:val="single" w:sz="6" w:space="0" w:color="D9DEE7"/>
+              <w:bottom w:val="single" w:sz="6" w:space="0" w:color="D9DEE7"/>
+              <w:right w:val="single" w:sz="6" w:space="0" w:color="D9DEE7"/>
+              <w:insideH w:val="single" w:sz="6" w:space="0" w:color="D9DEE7"/>
+              <w:insideV w:val="single" w:sz="6" w:space="0" w:color="D9DEE7"/>
+            </w:tcBorders>
           </w:tcPr>
           <w:p>
+            <w:pPr>
+              <w:spacing w:after="40"/>
+            </w:pPr>
             <w:r>
+              <w:rPr>
+                <w:rFonts w:ascii="Arial" w:hAnsi="Arial"/>
+                <w:b w:val="0"/>
+                <w:color w:val="1D3A5E"/>
+                <w:sz w:val="18"/>
+              </w:rPr>
               <w:t xml:space="preserve">Ld50 Oral Rat Mg Per Kg</w:t>
             </w:r>
           </w:p>
@@ -1626,9 +4561,27 @@
         <w:tc>
           <w:tcPr>
             <w:tcW w:type="dxa" w:w="5040"/>
+            <w:vAlign w:val="center"/>
+            <w:tcBorders>
+              <w:top w:val="single" w:sz="6" w:space="0" w:color="D9DEE7"/>
+              <w:left w:val="single" w:sz="6" w:space="0" w:color="D9DEE7"/>
+              <w:bottom w:val="single" w:sz="6" w:space="0" w:color="D9DEE7"/>
+              <w:right w:val="single" w:sz="6" w:space="0" w:color="D9DEE7"/>
+              <w:insideH w:val="single" w:sz="6" w:space="0" w:color="D9DEE7"/>
+              <w:insideV w:val="single" w:sz="6" w:space="0" w:color="D9DEE7"/>
+            </w:tcBorders>
           </w:tcPr>
           <w:p>
+            <w:pPr>
+              <w:spacing w:after="40"/>
+            </w:pPr>
             <w:r>
+              <w:rPr>
+                <w:rFonts w:ascii="Arial" w:hAnsi="Arial"/>
+                <w:b w:val="0"/>
+                <w:color w:val="1D3A5E"/>
+                <w:sz w:val="18"/>
+              </w:rPr>
               <w:t xml:space="preserve">3200</w:t>
             </w:r>
           </w:p>
@@ -1638,9 +4591,27 @@
         <w:tc>
           <w:tcPr>
             <w:tcW w:type="dxa" w:w="5040"/>
+            <w:vAlign w:val="center"/>
+            <w:tcBorders>
+              <w:top w:val="single" w:sz="6" w:space="0" w:color="D9DEE7"/>
+              <w:left w:val="single" w:sz="6" w:space="0" w:color="D9DEE7"/>
+              <w:bottom w:val="single" w:sz="6" w:space="0" w:color="D9DEE7"/>
+              <w:right w:val="single" w:sz="6" w:space="0" w:color="D9DEE7"/>
+              <w:insideH w:val="single" w:sz="6" w:space="0" w:color="D9DEE7"/>
+              <w:insideV w:val="single" w:sz="6" w:space="0" w:color="D9DEE7"/>
+            </w:tcBorders>
           </w:tcPr>
           <w:p>
+            <w:pPr>
+              <w:spacing w:after="40"/>
+            </w:pPr>
             <w:r>
+              <w:rPr>
+                <w:rFonts w:ascii="Arial" w:hAnsi="Arial"/>
+                <w:b w:val="0"/>
+                <w:color w:val="1D3A5E"/>
+                <w:sz w:val="18"/>
+              </w:rPr>
               <w:t xml:space="preserve">Ld50 Dermal Rat Mg Per Kg</w:t>
             </w:r>
           </w:p>
@@ -1648,9 +4619,27 @@
         <w:tc>
           <w:tcPr>
             <w:tcW w:type="dxa" w:w="5040"/>
+            <w:vAlign w:val="center"/>
+            <w:tcBorders>
+              <w:top w:val="single" w:sz="6" w:space="0" w:color="D9DEE7"/>
+              <w:left w:val="single" w:sz="6" w:space="0" w:color="D9DEE7"/>
+              <w:bottom w:val="single" w:sz="6" w:space="0" w:color="D9DEE7"/>
+              <w:right w:val="single" w:sz="6" w:space="0" w:color="D9DEE7"/>
+              <w:insideH w:val="single" w:sz="6" w:space="0" w:color="D9DEE7"/>
+              <w:insideV w:val="single" w:sz="6" w:space="0" w:color="D9DEE7"/>
+            </w:tcBorders>
           </w:tcPr>
           <w:p>
+            <w:pPr>
+              <w:spacing w:after="40"/>
+            </w:pPr>
             <w:r>
+              <w:rPr>
+                <w:rFonts w:ascii="Arial" w:hAnsi="Arial"/>
+                <w:b w:val="0"/>
+                <w:color w:val="1D3A5E"/>
+                <w:sz w:val="18"/>
+              </w:rPr>
               <w:t xml:space="preserve">5000</w:t>
             </w:r>
           </w:p>
@@ -1660,9 +4649,27 @@
         <w:tc>
           <w:tcPr>
             <w:tcW w:type="dxa" w:w="5040"/>
+            <w:vAlign w:val="center"/>
+            <w:tcBorders>
+              <w:top w:val="single" w:sz="6" w:space="0" w:color="D9DEE7"/>
+              <w:left w:val="single" w:sz="6" w:space="0" w:color="D9DEE7"/>
+              <w:bottom w:val="single" w:sz="6" w:space="0" w:color="D9DEE7"/>
+              <w:right w:val="single" w:sz="6" w:space="0" w:color="D9DEE7"/>
+              <w:insideH w:val="single" w:sz="6" w:space="0" w:color="D9DEE7"/>
+              <w:insideV w:val="single" w:sz="6" w:space="0" w:color="D9DEE7"/>
+            </w:tcBorders>
           </w:tcPr>
           <w:p>
+            <w:pPr>
+              <w:spacing w:after="40"/>
+            </w:pPr>
             <w:r>
+              <w:rPr>
+                <w:rFonts w:ascii="Arial" w:hAnsi="Arial"/>
+                <w:b w:val="0"/>
+                <w:color w:val="1D3A5E"/>
+                <w:sz w:val="18"/>
+              </w:rPr>
               <w:t xml:space="preserve">Fish Lc50 96H Mg Per L</w:t>
             </w:r>
           </w:p>
@@ -1670,9 +4677,27 @@
         <w:tc>
           <w:tcPr>
             <w:tcW w:type="dxa" w:w="5040"/>
+            <w:vAlign w:val="center"/>
+            <w:tcBorders>
+              <w:top w:val="single" w:sz="6" w:space="0" w:color="D9DEE7"/>
+              <w:left w:val="single" w:sz="6" w:space="0" w:color="D9DEE7"/>
+              <w:bottom w:val="single" w:sz="6" w:space="0" w:color="D9DEE7"/>
+              <w:right w:val="single" w:sz="6" w:space="0" w:color="D9DEE7"/>
+              <w:insideH w:val="single" w:sz="6" w:space="0" w:color="D9DEE7"/>
+              <w:insideV w:val="single" w:sz="6" w:space="0" w:color="D9DEE7"/>
+            </w:tcBorders>
           </w:tcPr>
           <w:p>
+            <w:pPr>
+              <w:spacing w:after="40"/>
+            </w:pPr>
             <w:r>
+              <w:rPr>
+                <w:rFonts w:ascii="Arial" w:hAnsi="Arial"/>
+                <w:b w:val="0"/>
+                <w:color w:val="1D3A5E"/>
+                <w:sz w:val="18"/>
+              </w:rPr>
               <w:t xml:space="preserve">4.6</w:t>
             </w:r>
           </w:p>
@@ -1682,9 +4707,27 @@
         <w:tc>
           <w:tcPr>
             <w:tcW w:type="dxa" w:w="5040"/>
+            <w:vAlign w:val="center"/>
+            <w:tcBorders>
+              <w:top w:val="single" w:sz="6" w:space="0" w:color="D9DEE7"/>
+              <w:left w:val="single" w:sz="6" w:space="0" w:color="D9DEE7"/>
+              <w:bottom w:val="single" w:sz="6" w:space="0" w:color="D9DEE7"/>
+              <w:right w:val="single" w:sz="6" w:space="0" w:color="D9DEE7"/>
+              <w:insideH w:val="single" w:sz="6" w:space="0" w:color="D9DEE7"/>
+              <w:insideV w:val="single" w:sz="6" w:space="0" w:color="D9DEE7"/>
+            </w:tcBorders>
           </w:tcPr>
           <w:p>
+            <w:pPr>
+              <w:spacing w:after="40"/>
+            </w:pPr>
             <w:r>
+              <w:rPr>
+                <w:rFonts w:ascii="Arial" w:hAnsi="Arial"/>
+                <w:b w:val="0"/>
+                <w:color w:val="1D3A5E"/>
+                <w:sz w:val="18"/>
+              </w:rPr>
               <w:t xml:space="preserve">Bee Ld50 Oral Microg Per Bee</w:t>
             </w:r>
           </w:p>
@@ -1692,9 +4735,27 @@
         <w:tc>
           <w:tcPr>
             <w:tcW w:type="dxa" w:w="5040"/>
+            <w:vAlign w:val="center"/>
+            <w:tcBorders>
+              <w:top w:val="single" w:sz="6" w:space="0" w:color="D9DEE7"/>
+              <w:left w:val="single" w:sz="6" w:space="0" w:color="D9DEE7"/>
+              <w:bottom w:val="single" w:sz="6" w:space="0" w:color="D9DEE7"/>
+              <w:right w:val="single" w:sz="6" w:space="0" w:color="D9DEE7"/>
+              <w:insideH w:val="single" w:sz="6" w:space="0" w:color="D9DEE7"/>
+              <w:insideV w:val="single" w:sz="6" w:space="0" w:color="D9DEE7"/>
+            </w:tcBorders>
           </w:tcPr>
           <w:p>
+            <w:pPr>
+              <w:spacing w:after="40"/>
+            </w:pPr>
             <w:r>
+              <w:rPr>
+                <w:rFonts w:ascii="Arial" w:hAnsi="Arial"/>
+                <w:b w:val="0"/>
+                <w:color w:val="1D3A5E"/>
+                <w:sz w:val="18"/>
+              </w:rPr>
               <w:t xml:space="preserve">89</w:t>
             </w:r>
           </w:p>
@@ -1704,9 +4765,27 @@
         <w:tc>
           <w:tcPr>
             <w:tcW w:type="dxa" w:w="5040"/>
+            <w:vAlign w:val="center"/>
+            <w:tcBorders>
+              <w:top w:val="single" w:sz="6" w:space="0" w:color="D9DEE7"/>
+              <w:left w:val="single" w:sz="6" w:space="0" w:color="D9DEE7"/>
+              <w:bottom w:val="single" w:sz="6" w:space="0" w:color="D9DEE7"/>
+              <w:right w:val="single" w:sz="6" w:space="0" w:color="D9DEE7"/>
+              <w:insideH w:val="single" w:sz="6" w:space="0" w:color="D9DEE7"/>
+              <w:insideV w:val="single" w:sz="6" w:space="0" w:color="D9DEE7"/>
+            </w:tcBorders>
           </w:tcPr>
           <w:p>
+            <w:pPr>
+              <w:spacing w:after="40"/>
+            </w:pPr>
             <w:r>
+              <w:rPr>
+                <w:rFonts w:ascii="Arial" w:hAnsi="Arial"/>
+                <w:b w:val="0"/>
+                <w:color w:val="1D3A5E"/>
+                <w:sz w:val="18"/>
+              </w:rPr>
               <w:t xml:space="preserve">Earthworm Lc50 14D Mg Per Kg</w:t>
             </w:r>
           </w:p>
@@ -1714,9 +4793,27 @@
         <w:tc>
           <w:tcPr>
             <w:tcW w:type="dxa" w:w="5040"/>
+            <w:vAlign w:val="center"/>
+            <w:tcBorders>
+              <w:top w:val="single" w:sz="6" w:space="0" w:color="D9DEE7"/>
+              <w:left w:val="single" w:sz="6" w:space="0" w:color="D9DEE7"/>
+              <w:bottom w:val="single" w:sz="6" w:space="0" w:color="D9DEE7"/>
+              <w:right w:val="single" w:sz="6" w:space="0" w:color="D9DEE7"/>
+              <w:insideH w:val="single" w:sz="6" w:space="0" w:color="D9DEE7"/>
+              <w:insideV w:val="single" w:sz="6" w:space="0" w:color="D9DEE7"/>
+            </w:tcBorders>
           </w:tcPr>
           <w:p>
+            <w:pPr>
+              <w:spacing w:after="40"/>
+            </w:pPr>
             <w:r>
+              <w:rPr>
+                <w:rFonts w:ascii="Arial" w:hAnsi="Arial"/>
+                <w:b w:val="0"/>
+                <w:color w:val="1D3A5E"/>
+                <w:sz w:val="18"/>
+              </w:rPr>
               <w:t xml:space="preserve">480</w:t>
             </w:r>
           </w:p>
@@ -1885,7 +4982,22 @@
       <w:jc w:val="center"/>
     </w:pPr>
     <w:r>
-      <w:t xml:space="preserve">INTERNAL | Page </w:t>
+      <w:rPr>
+        <w:rFonts w:ascii="Arial" w:hAnsi="Arial"/>
+        <w:b/>
+        <w:color w:val="F07D00"/>
+        <w:sz w:val="14"/>
+      </w:rPr>
+      <w:t xml:space="preserve">INTERNAL</w:t>
+    </w:r>
+    <w:r>
+      <w:rPr>
+        <w:rFonts w:ascii="Arial" w:hAnsi="Arial"/>
+        <w:b w:val="0"/>
+        <w:color w:val="1D3A5E"/>
+        <w:sz w:val="14"/>
+      </w:rPr>
+      <w:t xml:space="preserve"> | Page </w:t>
     </w:r>
     <w:r>
       <w:fldChar w:fldCharType="begin"/>
@@ -1894,6 +5006,12 @@
       <w:fldChar w:fldCharType="end"/>
     </w:r>
     <w:r>
+      <w:rPr>
+        <w:rFonts w:ascii="Arial" w:hAnsi="Arial"/>
+        <w:b w:val="0"/>
+        <w:color w:val="1D3A5E"/>
+        <w:sz w:val="14"/>
+      </w:rPr>
       <w:t xml:space="preserve"> of </w:t>
     </w:r>
     <w:r>
@@ -1903,6 +5021,12 @@
       <w:fldChar w:fldCharType="end"/>
     </w:r>
     <w:r>
+      <w:rPr>
+        <w:rFonts w:ascii="Arial" w:hAnsi="Arial"/>
+        <w:b w:val="0"/>
+        <w:color w:val="1D3A5E"/>
+        <w:sz w:val="14"/>
+      </w:rPr>
       <w:t xml:space="preserve"> | Fictional dataset for recruiting use only. Not a real regulatory record.</w:t>
     </w:r>
   </w:p>
@@ -1915,9 +5039,27 @@
     <w:pPr>
       <w:pStyle w:val="Header"/>
       <w:jc w:val="right"/>
+      <w:pBdr>
+        <w:bottom w:val="single" w:sz="8" w:space="4" w:color="F07D00"/>
+      </w:pBdr>
     </w:pPr>
     <w:r>
-      <w:t xml:space="preserve">Fictional Crop Science Authority (FCSA) | FCSA-PPR-2026-0042</w:t>
+      <w:rPr>
+        <w:rFonts w:ascii="Arial" w:hAnsi="Arial"/>
+        <w:b/>
+        <w:color w:val="1D3A5E"/>
+        <w:sz w:val="16"/>
+      </w:rPr>
+      <w:t xml:space="preserve">Fictional Crop Science Authority (FCSA)</w:t>
+    </w:r>
+    <w:r>
+      <w:rPr>
+        <w:rFonts w:ascii="Arial" w:hAnsi="Arial"/>
+        <w:b w:val="0"/>
+        <w:color w:val="F07D00"/>
+        <w:sz w:val="16"/>
+      </w:rPr>
+      <w:t xml:space="preserve"> | FCSA-PPR-2026-0042</w:t>
     </w:r>
   </w:p>
 </w:hdr>
@@ -2287,7 +5429,7 @@
     <w:qFormat/>
     <w:rsid w:val="00FC693F"/>
     <w:rPr>
-      <w:rFonts w:ascii="Aptos" w:hAnsi="Aptos"/>
+      <w:rFonts w:ascii="Arial" w:hAnsi="Arial"/>
       <w:sz w:val="20"/>
     </w:rPr>
   </w:style>
@@ -2350,10 +5492,10 @@
       <w:outlineLvl w:val="0"/>
     </w:pPr>
     <w:rPr>
-      <w:rFonts w:asciiTheme="majorHAnsi" w:eastAsiaTheme="majorEastAsia" w:hAnsiTheme="majorHAnsi" w:cstheme="majorBidi" w:ascii="Aptos Display" w:hAnsi="Aptos Display"/>
+      <w:rFonts w:asciiTheme="majorHAnsi" w:eastAsiaTheme="majorEastAsia" w:hAnsiTheme="majorHAnsi" w:cstheme="majorBidi" w:ascii="Arial" w:hAnsi="Arial"/>
       <w:b/>
       <w:bCs/>
-      <w:color w:val="365F91" w:themeColor="accent1" w:themeShade="BF"/>
+      <w:color w:val="1D3A5E"/>
       <w:sz w:val="36"/>
       <w:szCs w:val="28"/>
     </w:rPr>
@@ -2374,10 +5516,10 @@
       <w:outlineLvl w:val="1"/>
     </w:pPr>
     <w:rPr>
-      <w:rFonts w:asciiTheme="majorHAnsi" w:eastAsiaTheme="majorEastAsia" w:hAnsiTheme="majorHAnsi" w:cstheme="majorBidi" w:ascii="Aptos Display" w:hAnsi="Aptos Display"/>
+      <w:rFonts w:asciiTheme="majorHAnsi" w:eastAsiaTheme="majorEastAsia" w:hAnsiTheme="majorHAnsi" w:cstheme="majorBidi" w:ascii="Arial" w:hAnsi="Arial"/>
       <w:b/>
       <w:bCs/>
-      <w:color w:val="4F81BD" w:themeColor="accent1"/>
+      <w:color w:val="F07D00"/>
       <w:sz w:val="26"/>
       <w:szCs w:val="26"/>
     </w:rPr>
@@ -2639,11 +5781,12 @@
       <w:contextualSpacing/>
     </w:pPr>
     <w:rPr>
-      <w:rFonts w:asciiTheme="majorHAnsi" w:eastAsiaTheme="majorEastAsia" w:hAnsiTheme="majorHAnsi" w:cstheme="majorBidi" w:ascii="Aptos Display" w:hAnsi="Aptos Display"/>
-      <w:color w:val="17365D" w:themeColor="text2" w:themeShade="BF"/>
+      <w:rFonts w:asciiTheme="majorHAnsi" w:eastAsiaTheme="majorEastAsia" w:hAnsiTheme="majorHAnsi" w:cstheme="majorBidi" w:ascii="Arial" w:hAnsi="Arial"/>
+      <w:b/>
+      <w:color w:val="1D3A5E"/>
       <w:spacing w:val="5"/>
       <w:kern w:val="28"/>
-      <w:sz w:val="52"/>
+      <w:sz w:val="56"/>
       <w:szCs w:val="52"/>
     </w:rPr>
   </w:style>

</xml_diff>